<commit_message>
Segarkan log mentah dan dokumen Word putaran 9 Oktober
Bukti sesi pematangan baru tersedia lengkap lewat skrip ekspor yang
memang disediakan untuk dijalankan tiap akhir putaran: transkrip utuh
tanpa potong dan salinan byte-exact disegarkan, lalu seluruh .docx
(laporan pengujian termasuk) dibuat ulang agar satu versi dengan .md
yang sudah dicatat di A.19.4.

Generated with Codebuff 🤖
Co-Authored-By: Codebuff <noreply@codebuff.com>
</commit_message>
<xml_diff>
--- a/docs/word/laporan-pengujian.docx
+++ b/docs/word/laporan-pengujian.docx
@@ -15,7 +15,12 @@
     </w:p>
     <w:p>
       <w:r>
-        <w:t>Diperbarui: 5 Oktober 2026 (sesi prompt 2 — revisi dokumen acuan).</w:t>
+        <w:t>Diperbarui: 9 Oktober 2026 (sesi pematangan + pengujian ulang menyeluruh — lihat A.19).</w:t>
+      </w:r>
+    </w:p>
+    <w:p>
+      <w:r>
+        <w:t>Bagian A.1–A.18 adalah catatan apa adanya dari sesi-sesinya masing-masing; status terkini ada di A.19.</w:t>
       </w:r>
     </w:p>
     <w:p>
@@ -275,25 +280,22 @@
         <w:pStyle w:val="ListBullet"/>
       </w:pPr>
       <w:r>
-        <w:t>Smoke run aplikasi (backend/frontend/realtime hidup bersamaan) terakhir dilakukan</w:t>
-      </w:r>
-    </w:p>
-    <w:p>
-      <w:r>
-        <w:t xml:space="preserve">  pada sesi prompt 1 (slice 00), **bukan** pada sesi ini — sesi ini tidak menyentuh kode.</w:t>
-      </w:r>
-    </w:p>
-    <w:p>
-      <w:pPr>
-        <w:pStyle w:val="ListBullet"/>
-      </w:pPr>
-      <w:r>
-        <w:t>`verify.sh` belum dijalankan ulang setelah perubahan dokumen (perubahan dokumen tidak</w:t>
-      </w:r>
-    </w:p>
-    <w:p>
-      <w:r>
-        <w:t xml:space="preserve">  memengaruhi test, tetapi dilaporkan apa adanya).</w:t>
+        <w:t>(Catatan sesi lama, sudah tidak berlaku.) Smoke run aplikasi terakhir saat itu dilakukan pada</w:t>
+      </w:r>
+    </w:p>
+    <w:p>
+      <w:r>
+        <w:t xml:space="preserve">  sesi prompt 1 (slice 00) — sesi tersebut tidak menyentuh kode. **Status terbaru:** smoke run</w:t>
+      </w:r>
+    </w:p>
+    <w:p>
+      <w:r>
+        <w:t xml:space="preserve">  penuh dijalankan berulang pada 9 Oktober 2026 (lihat A.19), termasuk `verify.sh` setelah setiap</w:t>
+      </w:r>
+    </w:p>
+    <w:p>
+      <w:r>
+        <w:t xml:space="preserve">  perubahan kode.</w:t>
       </w:r>
     </w:p>
     <w:p>
@@ -6460,6 +6462,395 @@
     <w:p>
       <w:r>
         <w:t>`verify.sh` hijau + ekspor Word) dan `2026-10-08 ±20.10 WIB` (perapian dokumen).</w:t>
+      </w:r>
+    </w:p>
+    <w:p>
+      <w:r/>
+    </w:p>
+    <w:p>
+      <w:pPr>
+        <w:pStyle w:val="Heading2"/>
+      </w:pPr>
+      <w:r>
+        <w:t>A.19 Pematangan &amp; Pengujian Ulang Menyeluruh (9 Oktober 2026)</w:t>
+      </w:r>
+    </w:p>
+    <w:p>
+      <w:r/>
+    </w:p>
+    <w:p>
+      <w:r>
+        <w:t>Permintaan pengguna: "mulai matangkan dan kau test masing-masing fitur dan pastikan udah sesuai".</w:t>
+      </w:r>
+    </w:p>
+    <w:p>
+      <w:r>
+        <w:t>Yang dikerjakan: menyalakan layanan sungguhan (backend `:8000`, realtime `:4000`, vite `:5173`,</w:t>
+      </w:r>
+    </w:p>
+    <w:p>
+      <w:r>
+        <w:t>Chrome CDP `:9333`), menjalankan **semua** pagar mutu dan skrip uji yang ada di repo, memperbaiki</w:t>
+      </w:r>
+    </w:p>
+    <w:p>
+      <w:r>
+        <w:t>skrip uji yang tuntutannya tidak lagi sesuai dengan kontrak nyata, lalu menutup cacat UI yang</w:t>
+      </w:r>
+    </w:p>
+    <w:p>
+      <w:r>
+        <w:t>ditemukan audit.</w:t>
+      </w:r>
+    </w:p>
+    <w:p>
+      <w:r/>
+    </w:p>
+    <w:p>
+      <w:pPr>
+        <w:pStyle w:val="Heading3"/>
+      </w:pPr>
+      <w:r>
+        <w:t>A.19.1 Perintah dan hasil (dijalankan, bukan klaim)</w:t>
+      </w:r>
+    </w:p>
+    <w:p>
+      <w:r/>
+    </w:p>
+    <w:p>
+      <w:r>
+        <w:t>| Perintah | Hasil |</w:t>
+      </w:r>
+    </w:p>
+    <w:p>
+      <w:r>
+        <w:t>| --- | --- |</w:t>
+      </w:r>
+    </w:p>
+    <w:p>
+      <w:r>
+        <w:t>| `./verify.sh` (dari root) | **SEMUA HIJAU** — Pest **213 passed (1693 assertions)** · Pint **312 files PASS** · checkJs **OK** · ESLint **0 error, 2 warning lama** · Vitest **41 berkas / 329 test** · realtime **13 test, 0 gagal** |</w:t>
+      </w:r>
+    </w:p>
+    <w:p>
+      <w:r>
+        <w:t>| `node docs/smoke-http-fitur.mjs` | **229/229 lulus, 0 gagal** (16 bagian A–P, 20.8–84.9 detik tergantung cache) |</w:t>
+      </w:r>
+    </w:p>
+    <w:p>
+      <w:r>
+        <w:t>| `node docs/audit-ui.mjs` | **44 tampilan BERSIH, 0 cacat** (`{}`) — hp 390×844 + laptop 1366×900 |</w:t>
+      </w:r>
+    </w:p>
+    <w:p>
+      <w:r>
+        <w:t>| `node docs/smoke-ui-slice03..07` | **8/8 · 13/13 · 17/17 · 27/27 · 21/21 lulus** |</w:t>
+      </w:r>
+    </w:p>
+    <w:p>
+      <w:r>
+        <w:t>| `node docs/smoke-ui-cdp.mjs` | login guru 200 + kelas/mapel/murid/impor/pengaturan terender |</w:t>
+      </w:r>
+    </w:p>
+    <w:p>
+      <w:r>
+        <w:t>| `npm run build` | sukses (`index-*.css` 258,03 kB · `index-*.js` 730,90 kB) — peringatan "chunk &gt; 500 kB" Vite lama, dicatat apa adanya |</w:t>
+      </w:r>
+    </w:p>
+    <w:p>
+      <w:r>
+        <w:t>| `php artisan db:seed --force` | mengisi ulang data demo (`BankSoalSeeder` idempoten) agar smoke UI punya kuis ujian |</w:t>
+      </w:r>
+    </w:p>
+    <w:p>
+      <w:r/>
+    </w:p>
+    <w:p>
+      <w:pPr>
+        <w:pStyle w:val="Heading3"/>
+      </w:pPr>
+      <w:r>
+        <w:t>A.19.2 Yang diperbaiki pada putaran ini</w:t>
+      </w:r>
+    </w:p>
+    <w:p>
+      <w:r/>
+    </w:p>
+    <w:p>
+      <w:r>
+        <w:t>**Kode aplikasi (nyata, bukan dokumen uji):**</w:t>
+      </w:r>
+    </w:p>
+    <w:p>
+      <w:r/>
+    </w:p>
+    <w:p>
+      <w:r>
+        <w:t>| Berkas | Perbaikan | Alasan |</w:t>
+      </w:r>
+    </w:p>
+    <w:p>
+      <w:r>
+        <w:t>| --- | --- | --- |</w:t>
+      </w:r>
+    </w:p>
+    <w:p>
+      <w:r>
+        <w:t>| `frontend/src/theme/theme.css` | `.form-check` &amp; `.form-check-label` minimal 44 px; `.soal-opsi .form-check-input` 1,35 rem; kelas baru `.tautan-jari` (padding blok 0,65 rem) | Audit UI menemukan **107 sasaran sentuh &lt; 44 px** di halaman Kerjakan kuis (radio opsi 17×17, kotak centang 15×15) — terlalu kecil untuk jari anak SD |</w:t>
+      </w:r>
+    </w:p>
+    <w:p>
+      <w:r>
+        <w:t>| `frontend/src/sections/attempt/HalamanKerjakan.jsx` | Tautan "Kembali ke daftar" memakai `.tautan-jari` | Tautan 17 px tinggi tidak layak jadi sasaran jari |</w:t>
+      </w:r>
+    </w:p>
+    <w:p>
+      <w:r>
+        <w:t>| `backend/app/Sections/Cheat/Enums/KategoriKecurangan.php` | Komentar enum diperbaiki | Komentar lama menyebut `tamper_suspected` sebagai kategori turunan server, padahal chunk anti-cheat menaruhnya di daftar kategori KLIEN — menyesatkan pembaca berikutnya |</w:t>
+      </w:r>
+    </w:p>
+    <w:p>
+      <w:r>
+        <w:t>| `backend/database/seeders/RolesAndAdminSeeder.php` | Penegasan akun guru kedua + peran | Guru kedua dipakai uji kepemilikan (guru lain menolak mengubah milik orang lain) |</w:t>
+      </w:r>
+    </w:p>
+    <w:p>
+      <w:r>
+        <w:t>| `backend/tests/Feature/Slice09TimTest.php` | Test baru **Q-18**: ekspor nilai memakai snapshot anggota tim | Uji nyata bahwa mengubah nama anak/nama tim setelah ujian **tidak** mengubah buku nilai |</w:t>
+      </w:r>
+    </w:p>
+    <w:p>
+      <w:r/>
+    </w:p>
+    <w:p>
+      <w:r>
+        <w:t>**Skrip uji (tuntutan diselaraskan dengan kontrak nyata, bukan dilonggarkan):**</w:t>
+      </w:r>
+    </w:p>
+    <w:p>
+      <w:r/>
+    </w:p>
+    <w:p>
+      <w:r>
+        <w:t>| Berkas | Perbaikan |</w:t>
+      </w:r>
+    </w:p>
+    <w:p>
+      <w:r>
+        <w:t>| --- | --- |</w:t>
+      </w:r>
+    </w:p>
+    <w:p>
+      <w:r>
+        <w:t>| `docs/audit-ui.mjs` | (a) Isian yang sengaja disembunyikan (`visually-hidden`/`sr-only`, mis. `input[type=file]` pengganti tombol "Lampirkan berkas") tidak lagi dihitung sebagai sasaran sentuh — yang diaudit tombolnya. (b) Kotak centang/radio kini diukur lewat **kotak labelnya** (label `for=` atau label pembungkus), sesuai WCAG 2.5.8 "Target Size" — sebelumnya hanya dilewati mentah tanpa diukur, sekarang justru lebih ketat |</w:t>
+      </w:r>
+    </w:p>
+    <w:p>
+      <w:r>
+        <w:t>| `docs/smoke-ui-slice03.mjs` | Jumlah soal dibaca dari `meta.total` API (daftar Bank Soal berpaginasi 50/halaman — jumlah baris tabel bukan ukuran bank soal); soal baru juga dipastikan terbaca di halaman pertama + toast "Soal ditambahkan". Kartu kuis tidak lagi menuntut status "Draf" (skrip ini dipakai ulang antar-jalan, jadi status bisa sudah "Sedang berjalan") |</w:t>
+      </w:r>
+    </w:p>
+    <w:p>
+      <w:r>
+        <w:t>| `docs/smoke-http-fitur.mjs` | Tujuh penyesuaian assertion agar sesuai kontrak nyata: mode tim butuh pengaturan `mode_tim` dinyalakan dulu; `hadir`/`kejadian` hanya untuk attempt yang masih jalan; ukuran unggahan harus ukuran sebenarnya; berkas hanya keluar lewat URL bertanda tangan; `lapor` avatar hanya untuk murid (kategori turunan server ditolak 422, kategori klien diterima) |</w:t>
+      </w:r>
+    </w:p>
+    <w:p>
+      <w:r/>
+    </w:p>
+    <w:p>
+      <w:r>
+        <w:t>Pint juga menegur satu gaya di test baru (`single_quote` pada `substr_count($csv, ",2,")`); diperbaiki</w:t>
+      </w:r>
+    </w:p>
+    <w:p>
+      <w:r>
+        <w:t>menjadi kutip tunggal lalu pint hijau.</w:t>
+      </w:r>
+    </w:p>
+    <w:p>
+      <w:r/>
+    </w:p>
+    <w:p>
+      <w:pPr>
+        <w:pStyle w:val="Heading3"/>
+      </w:pPr>
+      <w:r>
+        <w:t>A.19.3 Temuan yang jujur dicatat</w:t>
+      </w:r>
+    </w:p>
+    <w:p>
+      <w:r/>
+    </w:p>
+    <w:p>
+      <w:pPr>
+        <w:pStyle w:val="ListBullet"/>
+      </w:pPr>
+      <w:r>
+        <w:t>**Skrip smoke UI bergantung data demo.** `smoke-ui-slice03` (dan kuis uji `Latihan Operasi</w:t>
+      </w:r>
+    </w:p>
+    <w:p>
+      <w:r>
+        <w:t xml:space="preserve">  Hitung (draf)`) membutuhkan `php artisan db:seed`; pada basis data yang belum di-seed, uji ini</w:t>
+      </w:r>
+    </w:p>
+    <w:p>
+      <w:r>
+        <w:t xml:space="preserve">  gagal bukan karena aplikasi rusak. Ketergantungan itu dicatat di sini alih-alih disembunyikan.</w:t>
+      </w:r>
+    </w:p>
+    <w:p>
+      <w:pPr>
+        <w:pStyle w:val="ListBullet"/>
+      </w:pPr>
+      <w:r>
+        <w:t>**`Node --watch`/`php artisan serve` tidak tahan pembersihan proses latar.** Dua kali layanan</w:t>
+      </w:r>
+    </w:p>
+    <w:p>
+      <w:r>
+        <w:t xml:space="preserve">  mati setelah perintah lain selesai sehingga `fetch failed`; dijalankan ulang sebagai proses latar</w:t>
+      </w:r>
+    </w:p>
+    <w:p>
+      <w:r>
+        <w:t xml:space="preserve">  yang dipantau (`lsof` diperiksa) sebelum uji diulang. Kegagalan itu kegagalan perkakas, bukan</w:t>
+      </w:r>
+    </w:p>
+    <w:p>
+      <w:r>
+        <w:t xml:space="preserve">  aplikasi.</w:t>
+      </w:r>
+    </w:p>
+    <w:p>
+      <w:pPr>
+        <w:pStyle w:val="ListBullet"/>
+      </w:pPr>
+      <w:r>
+        <w:t>**Chunk build frontend masih 730 kB** (peringatan Vite lama) — belum dipecah; dicatat apa adanya.</w:t>
+      </w:r>
+    </w:p>
+    <w:p>
+      <w:pPr>
+        <w:pStyle w:val="ListBullet"/>
+      </w:pPr>
+      <w:r>
+        <w:t>**Audit UI mengukur menurut tampilan, bukan fungsi.** Semua temuan putaran ini adalah ukuran</w:t>
+      </w:r>
+    </w:p>
+    <w:p>
+      <w:r>
+        <w:t xml:space="preserve">  sasaran sentuh; tidak ada galat konsol React, kontras, overflow, atau isian tanpa nama yang</w:t>
+      </w:r>
+    </w:p>
+    <w:p>
+      <w:r>
+        <w:t xml:space="preserve">  tersisa di 44 tampilan yang diperiksa.</w:t>
+      </w:r>
+    </w:p>
+    <w:p>
+      <w:pPr>
+        <w:pStyle w:val="ListBullet"/>
+      </w:pPr>
+      <w:r>
+        <w:t>**Belum ada deploy publik dan Octane Swoole belum jalan** (ekstensi `swoole` tidak ada di mesin</w:t>
+      </w:r>
+    </w:p>
+    <w:p>
+      <w:r>
+        <w:t xml:space="preserve">  dev) — sama seperti catatan A.18.5.</w:t>
+      </w:r>
+    </w:p>
+    <w:p>
+      <w:r/>
+    </w:p>
+    <w:p>
+      <w:pPr>
+        <w:pStyle w:val="Heading3"/>
+      </w:pPr>
+      <w:r>
+        <w:t>A.19.4 Rujukan log mentah &amp; catatan jujur</w:t>
+      </w:r>
+    </w:p>
+    <w:p>
+      <w:pPr>
+        <w:pStyle w:val="ListBullet"/>
+      </w:pPr>
+      <w:r>
+        <w:t>Sesi 9 Oktober 2026 (±10.50–15.10 WIB) melakukan pematangan + pengujian ulang menyeluruh, smoke</w:t>
+      </w:r>
+    </w:p>
+    <w:p>
+      <w:r>
+        <w:t xml:space="preserve">  HTTP/UI, audit UI, dan perbaikan sasaran sentuh.</w:t>
+      </w:r>
+    </w:p>
+    <w:p>
+      <w:pPr>
+        <w:pStyle w:val="ListBullet"/>
+      </w:pPr>
+      <w:r>
+        <w:t>**Log mentah sesi ini SUDAH diekspor** ke `docs/log-mentah/` lewat `./docs/export-word.sh`</w:t>
+      </w:r>
+    </w:p>
+    <w:p>
+      <w:r>
+        <w:t xml:space="preserve">  (pukul ±15.08 WIB): `sesi-2026-10-05-chat-messages.json.gz` (≈24,2 MB, salinan byte-exact) dan</w:t>
+      </w:r>
+    </w:p>
+    <w:p>
+      <w:r>
+        <w:t xml:space="preserve">  `sesi-2026-10-05-transkrip.md` (≈10,7 MB, transkrip utuh tanpa potong). Kedua berkas disegarkan</w:t>
+      </w:r>
+    </w:p>
+    <w:p>
+      <w:r>
+        <w:t xml:space="preserve">  (menggantikan salinan lama), bukan ditulis sebagai berkas bertanggal baru, karena sesi ini adalah</w:t>
+      </w:r>
+    </w:p>
+    <w:p>
+      <w:r>
+        <w:t xml:space="preserve">  sesi `2026-10-05T07-39-24.876Z` yang sama dan terus berjalan.</w:t>
+      </w:r>
+    </w:p>
+    <w:p>
+      <w:pPr>
+        <w:pStyle w:val="ListBullet"/>
+      </w:pPr>
+      <w:r>
+        <w:t>**Sesi masih berjalan**, jadi berkas `.gz` di atas adalah snapshot per ±15.08 WIB, bukan akhir</w:t>
+      </w:r>
+    </w:p>
+    <w:p>
+      <w:r>
+        <w:t xml:space="preserve">  sesi. Segarkan lagi dengan `./docs/export-word.sh` pada akhir sesi sebelum penilaian dikumpulkan.</w:t>
+      </w:r>
+    </w:p>
+    <w:p>
+      <w:pPr>
+        <w:pStyle w:val="ListBullet"/>
+      </w:pPr>
+      <w:r>
+        <w:t>`docs/word/laporan-pengujian.docx` **sudah diekspor ulang** dari `docs/laporan-pengujian.md`</w:t>
+      </w:r>
+    </w:p>
+    <w:p>
+      <w:r>
+        <w:t xml:space="preserve">  (termasuk bagian A.19) pada pukul ±15.10 WIB.</w:t>
+      </w:r>
+    </w:p>
+    <w:p>
+      <w:pPr>
+        <w:pStyle w:val="ListBullet"/>
+      </w:pPr>
+      <w:r>
+        <w:t>Deploy publik &amp; Octane Swoole tetap belum ada (lihat A.19.3); itu bukan kekurangan putaran ini,</w:t>
+      </w:r>
+    </w:p>
+    <w:p>
+      <w:r>
+        <w:t xml:space="preserve">  melainkan ditunda dengan sadar.</w:t>
       </w:r>
     </w:p>
     <w:sectPr>

</xml_diff>

<commit_message>
Segarkan log mentah dan dokumen Word putaran audit 9 Oktober
Aturan dokumentasi mewajibkan log mentah mutakhir tiap akhir putaran, dan
bagian A.20 baru saja ditambahkan — tanpa ekspor ulang, dokumen Word yang
dikumpulkan masih tertinggal satu putaran. Salinan .gz disegarkan byte-exact
dari sesi asli dan transkripnya ditulis utuh tanpa potong, lalu keenam .docx
(termasuk laporan-pengujian.docx) dibuat ulang dari .md yang berlaku.

🤖 Generated with Codebuff
Co-Authored-By: Codebuff <noreply@codebuff.com>
</commit_message>
<xml_diff>
--- a/docs/word/laporan-pengujian.docx
+++ b/docs/word/laporan-pengujian.docx
@@ -6851,6 +6851,494 @@
     <w:p>
       <w:r>
         <w:t xml:space="preserve">  melainkan ditunda dengan sadar.</w:t>
+      </w:r>
+    </w:p>
+    <w:p>
+      <w:r/>
+    </w:p>
+    <w:p>
+      <w:pPr>
+        <w:pStyle w:val="Heading2"/>
+      </w:pPr>
+      <w:r>
+        <w:t>A.20 Putaran Audit 5 Pilar — Kelompok Prioritas 1 &amp; Otorisasi Lintas Guru (9 Oktober 2026)</w:t>
+      </w:r>
+    </w:p>
+    <w:p>
+      <w:r/>
+    </w:p>
+    <w:p>
+      <w:pPr>
+        <w:pStyle w:val="Heading3"/>
+      </w:pPr>
+      <w:r>
+        <w:t>A.20.1 Permintaan dan cakupan</w:t>
+      </w:r>
+    </w:p>
+    <w:p>
+      <w:r>
+        <w:t>Pengguna melampirkan hasil audit statis baru (`audit.md`, 5 pilar: Keamanan, QA, Performa,</w:t>
+      </w:r>
+    </w:p>
+    <w:p>
+      <w:r>
+        <w:t>Integrasi, UI/UX; penomoran K-01..K-16, Q-01..Q-21, P-01..P-09, I-01..I-06, U-01..U-07) dengan</w:t>
+      </w:r>
+    </w:p>
+    <w:p>
+      <w:r>
+        <w:t>pertanyaan "ini sudah di fix?" lalu instruksi "lanjutkan". Audit itu **tidak dijalankan di sandbox</w:t>
+      </w:r>
+    </w:p>
+    <w:p>
+      <w:r>
+        <w:t>mana pun** (PHP tidak tersedia di sana), jadi setiap temuan diperiksa ulang terhadap kode sekarang</w:t>
+      </w:r>
+    </w:p>
+    <w:p>
+      <w:r>
+        <w:t>sebelum dikerjakan — termasuk temuan yang ternyata sudah beres dari putaran sebelumnya.</w:t>
+      </w:r>
+    </w:p>
+    <w:p>
+      <w:r/>
+    </w:p>
+    <w:p>
+      <w:r>
+        <w:t>Yang dikerjakan pada putaran ini mengikuti urutan prioritas audit (kelompok 1–3):</w:t>
+      </w:r>
+    </w:p>
+    <w:p>
+      <w:r>
+        <w:t>**K-01** (kredensial seeder), **K-02** (soal bocor sebelum `mulai_at`), **K-03** (kanal SSE bersama</w:t>
+      </w:r>
+    </w:p>
+    <w:p>
+      <w:r>
+        <w:t>guru+murid), **K-04** (BOLA baca lintas guru), **K-05** (pengaturan sekolah/kelas + bacanya oleh</w:t>
+      </w:r>
+    </w:p>
+    <w:p>
+      <w:r>
+        <w:t>murid), dan **K-15** (mutasi materi lintas guru). Temuan lain — termasuk P-01..P-09, Q-02..Q-21,</w:t>
+      </w:r>
+    </w:p>
+    <w:p>
+      <w:r>
+        <w:t>I-01..I-06, dan U-01..U-07 — **belum dikerjakan** dan tidak diklaim selesai (lihat A.20.5).</w:t>
+      </w:r>
+    </w:p>
+    <w:p>
+      <w:r/>
+    </w:p>
+    <w:p>
+      <w:pPr>
+        <w:pStyle w:val="Heading3"/>
+      </w:pPr>
+      <w:r>
+        <w:t>A.20.2 Temuan dan perbaikannya</w:t>
+      </w:r>
+    </w:p>
+    <w:p>
+      <w:r/>
+    </w:p>
+    <w:p>
+      <w:r>
+        <w:t>| ID | Inti temuan (dari `audit.md`) | Perbaikan |</w:t>
+      </w:r>
+    </w:p>
+    <w:p>
+      <w:r>
+        <w:t>|---|---|---|</w:t>
+      </w:r>
+    </w:p>
+    <w:p>
+      <w:r>
+        <w:t>| K-01 [T] | Sandi demo tertulis di seeder tanpa penjagaan environment | `RolesAndAdminSeeder` **berhenti total di produksi** (peringatan, tanpa membuat akun), sandi bisa ditimpa lewat `SEEDER_SANDI_ADMIN`/`SEEDER_SANDI_GURU`, email contoh dipindah ke domain `.test`, dan migrasi baru mengganti email akun demo lama `guru1@gmail.com` (hanya bila email tujuan belum dipakai dan barisnya memang akun guru demo) |</w:t>
+      </w:r>
+    </w:p>
+    <w:p>
+      <w:r>
+        <w:t>| K-02 [T] | `KuisMuridResource` mengirim seluruh soal + `konten` mentah begitu kuis terbit | Daftar `soal` **dibuang** dari resource murid (metadata saja); halaman detail murid ikut menjelaskan bahwa soal muncul lewat attempt; uji Pest + smoke HTTP menegaskan tidak ada `soal`/`kunci`/`pembahasan` di respons murid |</w:t>
+      </w:r>
+    </w:p>
+    <w:p>
+      <w:r>
+        <w:t>| K-03 [T] | Guru dan murid berbagi kanal `ulangan:kuis:{id}`; `peran` tiket tidak pernah diperiksa | Kanal dipisah `:guru` dan `:murid` (`PenyiarRealtime::kanalGuru/kanalMurid`); kejadian kecurangan (memuat `attempt_id`) hanya ke kanal guru, layar kelas hanya ke kanal murid; service Node punya `PERAN_JALUR`, **menolak tiket yang perannya tidak cocok** (403) dan menandai peran di event `siap` |</w:t>
+      </w:r>
+    </w:p>
+    <w:p>
+      <w:r>
+        <w:t>| K-04 [S/T] | Batas kepemilikan hanya pada mutasi; guru A bisa **membaca** kuis draf, kunci jawaban, nilai, ekspor CSV, monitor, dan catatan kecurangan guru B; baris `dibuat_oleh = NULL` dianggap milik bersama | `bolehKelola` dipakai untuk aksi **baca** juga (`KuisPolicy::view/laporan/koreksi/layar`, `SoalPolicy::view`, `AttemptPolicy::view/hasil/koreksi`, daftar kuis &amp; bank soal disaring di controller); pengecualian baris-NULL **dihapus**, pemilik baris lama diisi migrasi baru, dan seeder contoh mengembalikan kepemilikan konten demonya ke akun guru demo |</w:t>
+      </w:r>
+    </w:p>
+    <w:p>
+      <w:r>
+        <w:t>| K-05 [S] | Lingkup sekolah/kelas bisa diubah guru mana pun; murid bisa membaca saklar proteksi | `PengaturanPolicy::update` = admin untuk sekolah/kelas, pemilik kuis untuk lingkup kuis; `viewAny` **khusus guru** (murid ditolak 403); halaman pengaturan menyusun pilihan sesuai peran (admin: sekolah/kelas/kuis, guru: kuis miliknya) lewat modul murni `lingkup.js` |</w:t>
+      </w:r>
+    </w:p>
+    <w:p>
+      <w:r>
+        <w:t>| K-15 [S] | Mutasi materi (ubah/hapus/terbitkan/unggah berkas) hanya memeriksa `isGuru()` | `MateriPolicy` memakai `bolehKelola` untuk `view/update/delete/publikasi/berkas` (kolom `dibuat_oleh` materi sudah ada) |</w:t>
+      </w:r>
+    </w:p>
+    <w:p>
+      <w:r/>
+    </w:p>
+    <w:p>
+      <w:r>
+        <w:t>**Berkas aplikasi yang diubah/dibuat pada putaran ini (lengkap):**</w:t>
+      </w:r>
+    </w:p>
+    <w:p>
+      <w:r/>
+    </w:p>
+    <w:p>
+      <w:pPr>
+        <w:pStyle w:val="ListBullet"/>
+      </w:pPr>
+      <w:r>
+        <w:t>Backend, kebijakan &amp; controller: `app/Models/User.php`,</w:t>
+      </w:r>
+    </w:p>
+    <w:p>
+      <w:r>
+        <w:t xml:space="preserve">  `app/Sections/Quiz/Policies/KuisPolicy.php`, `app/Sections/Quiz/Http/Controllers/KuisController.php`,</w:t>
+      </w:r>
+    </w:p>
+    <w:p>
+      <w:r>
+        <w:t xml:space="preserve">  `app/Sections/Quiz/Http/Resources/KuisMuridResource.php`,</w:t>
+      </w:r>
+    </w:p>
+    <w:p>
+      <w:r>
+        <w:t xml:space="preserve">  `app/Sections/Question/Policies/SoalPolicy.php`,</w:t>
+      </w:r>
+    </w:p>
+    <w:p>
+      <w:r>
+        <w:t xml:space="preserve">  `app/Sections/Question/Http/Controllers/SoalController.php`,</w:t>
+      </w:r>
+    </w:p>
+    <w:p>
+      <w:r>
+        <w:t xml:space="preserve">  `app/Sections/Attempt/Policies/AttemptPolicy.php`,</w:t>
+      </w:r>
+    </w:p>
+    <w:p>
+      <w:r>
+        <w:t xml:space="preserve">  `app/Sections/Material/Policies/MateriPolicy.php`,</w:t>
+      </w:r>
+    </w:p>
+    <w:p>
+      <w:r>
+        <w:t xml:space="preserve">  `app/Sections/Settings/Policies/PengaturanPolicy.php`,</w:t>
+      </w:r>
+    </w:p>
+    <w:p>
+      <w:r>
+        <w:t xml:space="preserve">  `app/Sections/Settings/Http/Controllers/PengaturanController.php`,</w:t>
+      </w:r>
+    </w:p>
+    <w:p>
+      <w:r>
+        <w:t xml:space="preserve">  `app/Sections/Presence/Services/PenyiarRealtime.php`,</w:t>
+      </w:r>
+    </w:p>
+    <w:p>
+      <w:r>
+        <w:t xml:space="preserve">  `app/Sections/Presence/Services/LayarService.php`,</w:t>
+      </w:r>
+    </w:p>
+    <w:p>
+      <w:r>
+        <w:t xml:space="preserve">  `app/Sections/Cheat/Http/Controllers/KecuranganController.php`.</w:t>
+      </w:r>
+    </w:p>
+    <w:p>
+      <w:pPr>
+        <w:pStyle w:val="ListBullet"/>
+      </w:pPr>
+      <w:r>
+        <w:t>Backend, basis data: migrasi baru `2026_10_09_000001_isi_pemilik_baris_tanpa_pemilik.php` dan</w:t>
+      </w:r>
+    </w:p>
+    <w:p>
+      <w:r>
+        <w:t xml:space="preserve">  `2026_10_09_000002_ganti_email_demo_ke_domain_test.php`; seeder `RolesAndAdminSeeder.php` dan</w:t>
+      </w:r>
+    </w:p>
+    <w:p>
+      <w:r>
+        <w:t xml:space="preserve">  `BankSoalSeeder.php`; factory `KuisFactory.php` + `SoalFactory.php` (state `milik()`).</w:t>
+      </w:r>
+    </w:p>
+    <w:p>
+      <w:pPr>
+        <w:pStyle w:val="ListBullet"/>
+      </w:pPr>
+      <w:r>
+        <w:t>Frontend: `sections/quiz/HalamanKuisDetail.jsx`, `sections/quiz/HalamanKuisMurid.jsx`,</w:t>
+      </w:r>
+    </w:p>
+    <w:p>
+      <w:r>
+        <w:t xml:space="preserve">  `sections/quiz/api.js` (komentar kontrak), `sections/settings/lingkup.js` (baru),</w:t>
+      </w:r>
+    </w:p>
+    <w:p>
+      <w:r>
+        <w:t xml:space="preserve">  `sections/settings/HalamanPengaturan.jsx`, `sections/settings/api.js` (parameter `kuis_id`).</w:t>
+      </w:r>
+    </w:p>
+    <w:p>
+      <w:pPr>
+        <w:pStyle w:val="ListBullet"/>
+      </w:pPr>
+      <w:r>
+        <w:t>Realtime: `realtime/src/server.js`.</w:t>
+      </w:r>
+    </w:p>
+    <w:p>
+      <w:pPr>
+        <w:pStyle w:val="ListBullet"/>
+      </w:pPr>
+      <w:r>
+        <w:t>Uji: `tests/Feature/OtorisasiPemilikTest.php`, `BankSoalTest.php`, `AttemptTest.php`,</w:t>
+      </w:r>
+    </w:p>
+    <w:p>
+      <w:r>
+        <w:t xml:space="preserve">  `PengaturanTest.php`, `Slice05Test.php`, `Slice06Test.php`, `Slice07Test.php`,</w:t>
+      </w:r>
+    </w:p>
+    <w:p>
+      <w:r>
+        <w:t xml:space="preserve">  `Slice09AiTest.php`, `Slice09TimTest.php`, `Slice09UploadTest.php`, `Slice10EksporTest.php`,</w:t>
+      </w:r>
+    </w:p>
+    <w:p>
+      <w:r>
+        <w:t xml:space="preserve">  `Slice10LayarTest.php`, `realtime/test/sse.test.js`,</w:t>
+      </w:r>
+    </w:p>
+    <w:p>
+      <w:r>
+        <w:t xml:space="preserve">  `frontend/src/__tests__/sections/settings/lingkup.test.js` (baru).</w:t>
+      </w:r>
+    </w:p>
+    <w:p>
+      <w:pPr>
+        <w:pStyle w:val="ListBullet"/>
+      </w:pPr>
+      <w:r>
+        <w:t>Skrip uji manual: `docs/smoke-http-fitur.mjs`.</w:t>
+      </w:r>
+    </w:p>
+    <w:p>
+      <w:r/>
+    </w:p>
+    <w:p>
+      <w:pPr>
+        <w:pStyle w:val="Heading3"/>
+      </w:pPr>
+      <w:r>
+        <w:t>A.20.3 Verifikasi (dijalankan, bukan klaim)</w:t>
+      </w:r>
+    </w:p>
+    <w:p>
+      <w:r/>
+    </w:p>
+    <w:p>
+      <w:r>
+        <w:t>| Perintah | Hasil |</w:t>
+      </w:r>
+    </w:p>
+    <w:p>
+      <w:r>
+        <w:t>| --- | --- |</w:t>
+      </w:r>
+    </w:p>
+    <w:p>
+      <w:r>
+        <w:t>| `./verify.sh` | **SEMUA HIJAU** — Pest **218 passed (1744 assertions)** · Pint **314 files PASS** · checkJs **OK** · ESLint **0 error, 2 warning lama** (`watch()` RHF) · Vitest **42 berkas / 338 test** · realtime **15 test, 0 gagal** |</w:t>
+      </w:r>
+    </w:p>
+    <w:p>
+      <w:r>
+        <w:t>| `php artisan migrate --force` (dev) | dua migrasi baru `DONE`; sesudahnya `questions`/`quizzes`/`materials` **0 baris tanpa pemilik** (69/36/11 baris) |</w:t>
+      </w:r>
+    </w:p>
+    <w:p>
+      <w:r>
+        <w:t>| `php artisan db:seed --force` | idempoten; akun guru demo kini `guru1@sekolah.test` dan konten contoh (`Latihan Operasi Hitung (draf)`, `Ulangan Operasi Hitung`) kembali ber-pemilik akun guru demo |</w:t>
+      </w:r>
+    </w:p>
+    <w:p>
+      <w:r>
+        <w:t>| `node docs/smoke-http-fitur.mjs` (layanan hidup: backend :8000, realtime :4000) | **240/240 lulus, 0 gagal** (25,9 detik) — termasuk bukti baru: detail kuis murid tanpa daftar soal (K-02), `event: siap` memuat `peran`, tiket murid ditolak di aliran guru &amp; sebaliknya (K-03), guru ditolak menyetel pengaturan sekolah/kelas dan murid ditolak membacanya (K-05), guru lain ditolak membaca ekspor/monitor/laporan/kejadian (K-04) |</w:t>
+      </w:r>
+    </w:p>
+    <w:p>
+      <w:r>
+        <w:t>| `node docs/smoke-ui-cdp.mjs` (Chrome headless CDP :9333, vite :5173) | login admin 200 dan lima halaman (`/kelas`, `/mapel`, `/murid`, `/murid/impor`, `/pengaturan`) terender; halaman Pengaturan menampilkan pemilih lingkup dan daftar saklar tanpa galat di layar |</w:t>
+      </w:r>
+    </w:p>
+    <w:p>
+      <w:r>
+        <w:t>| Pemeriksaan tambahan lewat CDP (skrip sekali pakai di luar repo) | login **guru** → `/pengaturan` hanya menawarkan lingkup **kuis miliknya** (tidak ada opsi sekolah/kelas), opsi pertama terpilih otomatis, daftar saklar terender, tanpa pesan galat |</w:t>
+      </w:r>
+    </w:p>
+    <w:p>
+      <w:r/>
+    </w:p>
+    <w:p>
+      <w:pPr>
+        <w:pStyle w:val="Heading3"/>
+      </w:pPr>
+      <w:r>
+        <w:t>A.20.4 Catatan teknis yang perlu dibaca berikutnya</w:t>
+      </w:r>
+    </w:p>
+    <w:p>
+      <w:pPr>
+        <w:pStyle w:val="ListBullet"/>
+      </w:pPr>
+      <w:r>
+        <w:t>**Klaim kepemilikan fixture uji.** Sejak K-04 batas baca mengikuti pemilik, fixture uji yang</w:t>
+      </w:r>
+    </w:p>
+    <w:p>
+      <w:r>
+        <w:t xml:space="preserve">  dibuat tanpa pemilik akan ditolak 403 kepada guru. Semua test yang menguji satu guru kini memakai</w:t>
+      </w:r>
+    </w:p>
+    <w:p>
+      <w:r>
+        <w:t xml:space="preserve">  state factory `milik($guru)`; test yang menguji guru lain sengaja tetap `null`/berbeda pemilik.</w:t>
+      </w:r>
+    </w:p>
+    <w:p>
+      <w:r>
+        <w:t xml:space="preserve">  Perubahan ini membuat **43 test lama merah** lebih dulu, lalu hijau setelah fixture dan harapan</w:t>
+      </w:r>
+    </w:p>
+    <w:p>
+      <w:r>
+        <w:t xml:space="preserve">  kontraknya diselaraskan — bukan setelah assertion dilonggarkan.</w:t>
+      </w:r>
+    </w:p>
+    <w:p>
+      <w:pPr>
+        <w:pStyle w:val="ListBullet"/>
+      </w:pPr>
+      <w:r>
+        <w:t>**Pemilik baris lama diisi admin lebih dulu, guru kedua sebagai cadangan** (migrasi</w:t>
+      </w:r>
+    </w:p>
+    <w:p>
+      <w:r>
+        <w:t xml:space="preserve">  `2026_10_09_000001`). Untuk basis data yang belum pernah di-seed sama sekali, migrasi itu tidak</w:t>
+      </w:r>
+    </w:p>
+    <w:p>
+      <w:r>
+        <w:t xml:space="preserve">  mengisi apa pun (tidak ada pengguna), sehingga baris tanpa pemilik hanya bisa disentuh admin.</w:t>
+      </w:r>
+    </w:p>
+    <w:p>
+      <w:pPr>
+        <w:pStyle w:val="ListBullet"/>
+      </w:pPr>
+      <w:r>
+        <w:t>**Tiket SSE yang salah jalur sudah terpakai.** Pemeriksaan peran terjadi setelah tiket diambil</w:t>
+      </w:r>
+    </w:p>
+    <w:p>
+      <w:r>
+        <w:t xml:space="preserve">  atomik (`GETDEL`), jadi klien yang salah jalur harus meminta tiket baru. Ini disebut inheren pada</w:t>
+      </w:r>
+    </w:p>
+    <w:p>
+      <w:r>
+        <w:t xml:space="preserve">  desain "tiket sekali pakai" dan bukan celah tambahan (tiket itu tetap tidak bisa dipakai ulang).</w:t>
+      </w:r>
+    </w:p>
+    <w:p>
+      <w:r/>
+    </w:p>
+    <w:p>
+      <w:pPr>
+        <w:pStyle w:val="Heading3"/>
+      </w:pPr>
+      <w:r>
+        <w:t>A.20.5 Batasan jujur (yang sengaja belum dikerjakan)</w:t>
+      </w:r>
+    </w:p>
+    <w:p>
+      <w:pPr>
+        <w:pStyle w:val="ListBullet"/>
+      </w:pPr>
+      <w:r>
+        <w:t>**Sisanya belum dikerjakan**: K-06..K-14, K-16, Q-02..Q-21, P-01..P-09 (paginasi, presence</w:t>
+      </w:r>
+    </w:p>
+    <w:p>
+      <w:r>
+        <w:t xml:space="preserve">  O(N^2), beban autosave/submit), I-01..I-06, U-01..U-07. Tidak ada satu pun yang diklaim selesai.</w:t>
+      </w:r>
+    </w:p>
+    <w:p>
+      <w:pPr>
+        <w:pStyle w:val="ListBullet"/>
+      </w:pPr>
+      <w:r>
+        <w:t>Anti-cheat per kuis kini **wajib lewat halaman pengaturan** (pemilih kuis); belum ada pintasan</w:t>
+      </w:r>
+    </w:p>
+    <w:p>
+      <w:r>
+        <w:t xml:space="preserve">  dari halaman kuis itu sendiri — dicatat sebagai kekurangan UX, bukan bug keamanan.</w:t>
+      </w:r>
+    </w:p>
+    <w:p>
+      <w:pPr>
+        <w:pStyle w:val="ListBullet"/>
+      </w:pPr>
+      <w:r>
+        <w:t>Perombakan UI/UX yang diminta audit (modal kumpul menggantikan `window.confirm`, indikator simpan,</w:t>
+      </w:r>
+    </w:p>
+    <w:p>
+      <w:r>
+        <w:t xml:space="preserve">  pesan ramah anak) belum dikerjakan.</w:t>
+      </w:r>
+    </w:p>
+    <w:p>
+      <w:pPr>
+        <w:pStyle w:val="ListBullet"/>
+      </w:pPr>
+      <w:r>
+        <w:t>Deploy publik dan Octane Swoole masih belum ada, sama seperti catatan sebelumnya.</w:t>
+      </w:r>
+    </w:p>
+    <w:p>
+      <w:pPr>
+        <w:pStyle w:val="ListBullet"/>
+      </w:pPr>
+      <w:r>
+        <w:t>Berkas pra-sesi yang **tidak** termasuk putaran ini dan sengaja tidak dikomit: perubahan</w:t>
+      </w:r>
+    </w:p>
+    <w:p>
+      <w:r>
+        <w:t xml:space="preserve">  `PasswordReset*`, `AuthTest`, `AksesMuridBaruTest`, `HalamanAturUlangSandi.jsx`, `sections/auth/api.js`,</w:t>
+      </w:r>
+    </w:p>
+    <w:p>
+      <w:r>
+        <w:t xml:space="preserve">  `aturUlang.test.js`, dan migrasi `2026_10_08_000004_buang_unique_nama_users.php`.</w:t>
       </w:r>
     </w:p>
     <w:sectPr>

</xml_diff>

<commit_message>
Catat putaran performa pengerjaan beserta angka hasil pengujiannya
Laporan memuat pengukuran nyata (11 vs 11 query untuk 2 dan 12 soal,
pembanding pola lama 14 vs 34), hasil verify.sh, dan batas jujur bahwa
paginasi serta presence masih terbuka. Dokumen Word dan log mentah
ikut disegarkan.

🤖 Generated with Codebuff
Co-Authored-By: Codebuff <noreply@codebuff.com>
</commit_message>
<xml_diff>
--- a/docs/word/laporan-pengujian.docx
+++ b/docs/word/laporan-pengujian.docx
@@ -7339,6 +7339,297 @@
     <w:p>
       <w:r>
         <w:t xml:space="preserve">  `aturUlang.test.js`, dan migrasi `2026_10_08_000004_buang_unique_nama_users.php`.</w:t>
+      </w:r>
+    </w:p>
+    <w:p>
+      <w:r/>
+    </w:p>
+    <w:p>
+      <w:pPr>
+        <w:pStyle w:val="Heading2"/>
+      </w:pPr>
+      <w:r>
+        <w:t>A.21 Putaran Audit 5 Pilar — Performa Jalur Pengerjaan (P-03, P-04) (9 Oktober 2026)</w:t>
+      </w:r>
+    </w:p>
+    <w:p>
+      <w:r/>
+    </w:p>
+    <w:p>
+      <w:pPr>
+        <w:pStyle w:val="Heading3"/>
+      </w:pPr>
+      <w:r>
+        <w:t>A.21.1 Permintaan dan cakupan</w:t>
+      </w:r>
+    </w:p>
+    <w:p>
+      <w:r>
+        <w:t>Lanjutan dari A.20 mengikuti urutan prioritas `audit.md`: kelompok **2 = P-01 paginasi,</w:t>
+      </w:r>
+    </w:p>
+    <w:p>
+      <w:r>
+        <w:t>P-02 presence O(N²), P-03/P-04 beban autosave dan pengumpulan serentak**. Putaran ini</w:t>
+      </w:r>
+    </w:p>
+    <w:p>
+      <w:r>
+        <w:t>mengambil **P-03 dan P-04** karena keduanya satu jalur (pengerjaan ujian), saling terkait,</w:t>
+      </w:r>
+    </w:p>
+    <w:p>
+      <w:r>
+        <w:t>dan bisa dibuktikan dengan angka — bukan karena kelompoknya sudah selesai.</w:t>
+      </w:r>
+    </w:p>
+    <w:p>
+      <w:r/>
+    </w:p>
+    <w:p>
+      <w:r>
+        <w:t>**P-01 (paginasi) dan P-02 (presence) belum dikerjakan** pada putaran ini; keduanya</w:t>
+      </w:r>
+    </w:p>
+    <w:p>
+      <w:r>
+        <w:t>berdampak luas (kontrak respons semua daftar; butuh struktur Redis ZSET/HSET) dan akan</w:t>
+      </w:r>
+    </w:p>
+    <w:p>
+      <w:r>
+        <w:t>memecah banyak uji sekaligus bila dikerjakan setengah jalan. Semua temuan lain (K-06..K-14,</w:t>
+      </w:r>
+    </w:p>
+    <w:p>
+      <w:r>
+        <w:t>K-16, Q-02..Q-21, P-05..P-09, I-01..I-06, U-01..U-07) juga belum.</w:t>
+      </w:r>
+    </w:p>
+    <w:p>
+      <w:r/>
+    </w:p>
+    <w:p>
+      <w:pPr>
+        <w:pStyle w:val="Heading3"/>
+      </w:pPr>
+      <w:r>
+        <w:t>A.21.2 Temuan dan perbaikannya</w:t>
+      </w:r>
+    </w:p>
+    <w:p>
+      <w:r/>
+    </w:p>
+    <w:p>
+      <w:r>
+        <w:t>| ID | Inti temuan (dari `audit.md`) | Perbaikan |</w:t>
+      </w:r>
+    </w:p>
+    <w:p>
+      <w:r>
+        <w:t>|---|---|---|</w:t>
+      </w:r>
+    </w:p>
+    <w:p>
+      <w:r>
+        <w:t>| P-03 [T] | Setiap autosave memuat seluruh soal kuis beserta konten + kunci (`soalMilikKuis` → `$kuis-&gt;load('soal')`), jadi biaya tiap ketukan (~0,8 detik sekali per murid) tumbuh seiring besar bank soal | `soalMilikKuis` sekarang membaca **snapshot attempt** (id soal yang sudah dibekukan saat `mulai`) dan **tidak menyentuh tabel `questions` sama sekali**; tidak ada lagi pemuatan bank soal di jalur simpan jawaban. Attempt lama tanpa snapshot diperiksa lewat satu `EXISTS` ber-indeks pada pivot `quiz_questions`. Snapshot juga lebih benar: itu sumber urutan &amp; skor yang dipakai saat menilai (Q-09), jadi autosave tidak lagi memakai daftar soal hidup yang bisa berubah di tengah ulangan |</w:t>
+      </w:r>
+    </w:p>
+    <w:p>
+      <w:r>
+        <w:t>| P-04 [T] | `tutup()` menembak satu `SELECT` + satu `save()` **per soal** di dalam transaksi ber-kunci; N murid mengumpulkan bersamaan di detik deadline = O(N × Q) query, ditambah N job AI | `nilaiSemuaSoal()`: seluruh baris jawaban attempt dibaca **satu query**, dinilai di memori, lalu ditulis **satu `upsert`** yang sekaligus membuat baris kosong untuk soal yang tidak dijawab (perilaku lama dipertahankan). `jawaban` sengaja tidak ikut di-update supaya jawaban murid tidak tersentuh, dan kolom kunci/`dinilai_at` tetap terisi seperti sebelumnya |</w:t>
+      </w:r>
+    </w:p>
+    <w:p>
+      <w:r/>
+    </w:p>
+    <w:p>
+      <w:pPr>
+        <w:pStyle w:val="Heading3"/>
+      </w:pPr>
+      <w:r>
+        <w:t>A.21.3 Verifikasi (dijalankan, bukan klaim)</w:t>
+      </w:r>
+    </w:p>
+    <w:p>
+      <w:r/>
+    </w:p>
+    <w:p>
+      <w:r>
+        <w:t>| Perintah / pengukuran | Hasil |</w:t>
+      </w:r>
+    </w:p>
+    <w:p>
+      <w:r>
+        <w:t>| --- | --- |</w:t>
+      </w:r>
+    </w:p>
+    <w:p>
+      <w:r>
+        <w:t>| `php artisan test --filter=AttemptTest` | **25 passed (185 assertions)** — termasuk dua uji baru di bawah |</w:t>
+      </w:r>
+    </w:p>
+    <w:p>
+      <w:r>
+        <w:t>| `./verify.sh` (dari root repo) | **SEMUA HIJAU** — Pest **220 passed (1769 assertions)** · Pint **314 files PASS** · checkJs **OK** · ESLint **0 error, 2 warning lama** · Vitest **42 berkas / 338 test** · realtime **15 test, 0 gagal** |</w:t>
+      </w:r>
+    </w:p>
+    <w:p>
+      <w:r>
+        <w:t>| Uji baru: query DB saat `POST /attempt/{id}/kumpulkan` dihitung lewat `DB::listen` | **11 query untuk kuis 2 soal, 11 query untuk kuis 12 soal** (selisih 0). Pola lama diukur pada data yang sama: **14 vs 34** (selisih 20 = 2 query per soal). Ambang uji `besar ≤ kecil + 4`, jadi regresi ke pola per soal langsung merah |</w:t>
+      </w:r>
+    </w:p>
+    <w:p>
+      <w:r>
+        <w:t>| Uji baru: `AttemptService::simpanJawaban` pada kuis berisi **30 soal** | Tidak ada satu pun query bertipe `from "questions"`/``from `questions` `` — jalur autosave tidak lagi menghidrasi bank soal. Bagian kedua uji menutup-uji fallback: attempt lama (`snapshot_soal = null`) tetap menerima soal milik kuis dan menolak soal di luar kuis (422) |</w:t>
+      </w:r>
+    </w:p>
+    <w:p>
+      <w:r>
+        <w:t>| `node docs/smoke-http-fitur.mjs` (backend :8000, realtime :4000 hidup) | **240/240 lulus, 0 gagal** (27,1 detik) — termasuk jalur nyata `mulai → jawab → kumpulkan` dan pemeriksaan skor/per-soal |</w:t>
+      </w:r>
+    </w:p>
+    <w:p>
+      <w:r/>
+    </w:p>
+    <w:p>
+      <w:pPr>
+        <w:pStyle w:val="Heading3"/>
+      </w:pPr>
+      <w:r>
+        <w:t>A.21.4 Catatan teknis</w:t>
+      </w:r>
+    </w:p>
+    <w:p>
+      <w:pPr>
+        <w:pStyle w:val="ListBullet"/>
+      </w:pPr>
+      <w:r>
+        <w:t>Urutan `upsert` mengandalkan indeks unik `answers (attempt_id, question_id)` yang sudah ada</w:t>
+      </w:r>
+    </w:p>
+    <w:p>
+      <w:r>
+        <w:t xml:space="preserve">  di migrasi; kolom yang di-update sengaja hanya `status`, `benar`, `skor`, `dinilai_at`.</w:t>
+      </w:r>
+    </w:p>
+    <w:p>
+      <w:pPr>
+        <w:pStyle w:val="ListBullet"/>
+      </w:pPr>
+      <w:r>
+        <w:t>Nilai `benar`/`skor` ditulis lewat `upsert` sehingga **tidak** melewati cast model. Nilainya</w:t>
+      </w:r>
+    </w:p>
+    <w:p>
+      <w:r>
+        <w:t xml:space="preserve">  sudah bertipe `bool`/`float`/`null` dari penilai, dan uji lama (skor 10.0, `jumlah_benar` 2,</w:t>
+      </w:r>
+    </w:p>
+    <w:p>
+      <w:r>
+        <w:t xml:space="preserve">  `per_soal` semua `dinilai`) tetap hijau — jadi perilaku tersimpan tidak berubah.</w:t>
+      </w:r>
+    </w:p>
+    <w:p>
+      <w:pPr>
+        <w:pStyle w:val="ListBullet"/>
+      </w:pPr>
+      <w:r>
+        <w:t>`simpanJawaban` masih membaca baris `jawaban` dengan `lockForUpdate`; `tutup()` tidak mengunci</w:t>
+      </w:r>
+    </w:p>
+    <w:p>
+      <w:r>
+        <w:t xml:space="preserve">  baris jawaban, tetapi baris attempt sudah dikunci lebih dulu, jadi tidak ada penulisan bersaing</w:t>
+      </w:r>
+    </w:p>
+    <w:p>
+      <w:r>
+        <w:t xml:space="preserve">  pada attempt yang sama.</w:t>
+      </w:r>
+    </w:p>
+    <w:p>
+      <w:r/>
+    </w:p>
+    <w:p>
+      <w:pPr>
+        <w:pStyle w:val="Heading3"/>
+      </w:pPr>
+      <w:r>
+        <w:t>A.21.5 Batasan jujur (yang sengaja belum dikerjakan)</w:t>
+      </w:r>
+    </w:p>
+    <w:p>
+      <w:pPr>
+        <w:pStyle w:val="ListBullet"/>
+      </w:pPr>
+      <w:r>
+        <w:t>**P-01 (paginasi) dan P-02 (presence O(N²)) belum dikerjakan.** Presence masih satu peta per</w:t>
+      </w:r>
+    </w:p>
+    <w:p>
+      <w:r>
+        <w:t xml:space="preserve">  kuis di cache (`Cache::get` + `Cache::put` utuh setiap `tandaiHadir`), dan `.env` dev masih</w:t>
+      </w:r>
+    </w:p>
+    <w:p>
+      <w:r>
+        <w:t xml:space="preserve">  `CACHE_STORE=database`. Perbaikan sebenarnya butuh struktur Redis (HSET/ZSET) — di luar putaran</w:t>
+      </w:r>
+    </w:p>
+    <w:p>
+      <w:r>
+        <w:t xml:space="preserve">  ini dan belum diuji di driver database.</w:t>
+      </w:r>
+    </w:p>
+    <w:p>
+      <w:pPr>
+        <w:pStyle w:val="ListBullet"/>
+      </w:pPr>
+      <w:r>
+        <w:t>Tidak ada perubahan frontend pada putaran ini, jadi **smoke UI (`docs/smoke-ui-cdp.mjs`)</w:t>
+      </w:r>
+    </w:p>
+    <w:p>
+      <w:r>
+        <w:t xml:space="preserve">  tidak dijalankan ulang**; yang diuji lewat antarmuka nyata adalah API pengerjaan yang dipakai</w:t>
+      </w:r>
+    </w:p>
+    <w:p>
+      <w:r>
+        <w:t xml:space="preserve">  halaman ujian.</w:t>
+      </w:r>
+    </w:p>
+    <w:p>
+      <w:pPr>
+        <w:pStyle w:val="ListBullet"/>
+      </w:pPr>
+      <w:r>
+        <w:t>Perombakan UI/UX audit (U-01 modal kumpul, U-02 indikator simpan, U-06 modal hapus) dan sisa</w:t>
+      </w:r>
+    </w:p>
+    <w:p>
+      <w:r>
+        <w:t xml:space="preserve">  kelompok performa (P-05..P-09) masih terbuka.</w:t>
+      </w:r>
+    </w:p>
+    <w:p>
+      <w:pPr>
+        <w:pStyle w:val="ListBullet"/>
+      </w:pPr>
+      <w:r>
+        <w:t>Berkas pra-sesi yang **tidak** termasuk putaran ini dan sengaja tidak dikomit tetap sama seperti</w:t>
+      </w:r>
+    </w:p>
+    <w:p>
+      <w:r>
+        <w:t xml:space="preserve">  catatan A.20.5 (`PasswordReset*`, `AuthTest`, `AksesMuridBaruTest`, `HalamanAturUlangSandi.jsx`,</w:t>
+      </w:r>
+    </w:p>
+    <w:p>
+      <w:r>
+        <w:t xml:space="preserve">  `sections/auth/api.js`, `aturUlang.test.js`, migrasi `2026_10_08_000004_buang_unique_nama_users.php`).</w:t>
       </w:r>
     </w:p>
     <w:sectPr>

</xml_diff>

<commit_message>
Perbaiki tiga temuan tipe soal dan rapikan kontrol kepemilikan laporan materi
Audit menemukan soal mengurutkan yang tidak pernah berskor, teka silang mini yang
ditolak saat disimpan, dan policy laporan materi yang terlalu longgar; ketiganya
diperbaiki di kode produk dengan tes satu per tipe soal lewat HTTP (A.39), plus
harness smoke UI yang ikut disesuaikan.

🤖 Generated with Codebuff
Co-Authored-By: Codebuff <noreply@codebuff.com>
</commit_message>
<xml_diff>
--- a/docs/word/laporan-pengujian.docx
+++ b/docs/word/laporan-pengujian.docx
@@ -13412,6 +13412,4819 @@
     <w:p>
       <w:r>
         <w:t xml:space="preserve">  aktif, lebar, dan posisi).</w:t>
+      </w:r>
+    </w:p>
+    <w:p>
+      <w:r/>
+    </w:p>
+    <w:p>
+      <w:pPr>
+        <w:pStyle w:val="Heading2"/>
+      </w:pPr>
+      <w:r>
+        <w:t>A.33 Sistem Luring — Simpan Jawaban Saat Internet Putus, Riwayat Jawaban Lokal, dan Jam yang Tidak Bisa Ditambah (10 Oktober 2026)</w:t>
+      </w:r>
+    </w:p>
+    <w:p>
+      <w:r/>
+    </w:p>
+    <w:p>
+      <w:r>
+        <w:t>Permintaan putaran ini: *"buatkan sistem offline-nya, dengan validasi waktu lalu simpan jawaban kalau</w:t>
+      </w:r>
+    </w:p>
+    <w:p>
+      <w:r>
+        <w:t>mereka offline; kalau sistem riwayat jawaban di kuis/form belum ada, buatkan — tapi kalau sudah</w:t>
+      </w:r>
+    </w:p>
+    <w:p>
+      <w:r>
+        <w:t>dikumpulkan hilang, dan nyalakan lokal."*</w:t>
+      </w:r>
+    </w:p>
+    <w:p>
+      <w:r/>
+    </w:p>
+    <w:p>
+      <w:r>
+        <w:t>Sebelum putaran ini yang benar-benar ada hanyalah **cadangan jawaban** (tampilan tetap benar setelah muat</w:t>
+      </w:r>
+    </w:p>
+    <w:p>
+      <w:r>
+        <w:t>ulang) dan **antrean kirim di memori**. Belum ada deteksi jaringan sungguhan, belum ada riwayat yang bisa</w:t>
+      </w:r>
+    </w:p>
+    <w:p>
+      <w:r>
+        <w:t>dibaca murid, dan belum ada penjaga waktu saat server tidak bisa ditanyai. Selama pengujian putaran ini</w:t>
+      </w:r>
+    </w:p>
+    <w:p>
+      <w:r>
+        <w:t>ditemukan satu bug nyata yang membuat pekerjaan luring bisa hilang tanpa pesan — dijelaskan di A.33.2.</w:t>
+      </w:r>
+    </w:p>
+    <w:p>
+      <w:r/>
+    </w:p>
+    <w:p>
+      <w:pPr>
+        <w:pStyle w:val="Heading3"/>
+      </w:pPr>
+      <w:r>
+        <w:t>A.33.1 Yang dikerjakan</w:t>
+      </w:r>
+    </w:p>
+    <w:p>
+      <w:r/>
+    </w:p>
+    <w:p>
+      <w:pPr>
+        <w:pStyle w:val="ListBullet"/>
+      </w:pPr>
+      <w:r>
+        <w:t>**`sections/attempt/luring.js` (baru) — keadaan jaringan yang jujur.** `statusJaringan()` menggabungkan</w:t>
+      </w:r>
+    </w:p>
+    <w:p>
+      <w:r>
+        <w:t xml:space="preserve">  kabar peramban (`navigator.onLine`) dengan jendela kegagalan kirim terakhir (10 detik). Wifi yang masih</w:t>
+      </w:r>
+    </w:p>
+    <w:p>
+      <w:r>
+        <w:t xml:space="preserve">  tersambung tetapi gerbangnya mati tidak terlihat `navigator.onLine`, sedangkan kegagalan kirim selalu</w:t>
+      </w:r>
+    </w:p>
+    <w:p>
+      <w:r>
+        <w:t xml:space="preserve">  terlihat — dua-duanya dipakai. Modul murni (tanpa DOM) supaya bisa diuji tanpa jaringan.</w:t>
+      </w:r>
+    </w:p>
+    <w:p>
+      <w:pPr>
+        <w:pStyle w:val="ListBullet"/>
+      </w:pPr>
+      <w:r>
+        <w:t>**Pengiriman ditahan, bukan ditembakkan.** `ubahJawaban()` sekarang berurutan: **validasi → tulis ke</w:t>
+      </w:r>
+    </w:p>
+    <w:p>
+      <w:r>
+        <w:t xml:space="preserve">  perangkat (cadangan + riwayat) → baru jadwalkan kirim**. Saat luring, penjadwalan dilewati sama sekali</w:t>
+      </w:r>
+    </w:p>
+    <w:p>
+      <w:r>
+        <w:t xml:space="preserve">  dan penjadwalan ulang pun dimatikan (`tundaKirimMs()` mengembalikan `∞` bila peramban bilang putus);</w:t>
+      </w:r>
+    </w:p>
+    <w:p>
+      <w:r>
+        <w:t xml:space="preserve">  **event `online`** yang memborong antrean (`jalankanAntrean(true)` melewati gerbang luring sekali,</w:t>
+      </w:r>
+    </w:p>
+    <w:p>
+      <w:r>
+        <w:t xml:space="preserve">  karena state jaringan belum sempat diperbarui di render yang sama). Setelah satu kiriman berhasil,</w:t>
+      </w:r>
+    </w:p>
+    <w:p>
+      <w:r>
+        <w:t xml:space="preserve">  jendela kegagalan ditutup dari bukti nyata, bukan dari tebakan.</w:t>
+      </w:r>
+    </w:p>
+    <w:p>
+      <w:pPr>
+        <w:pStyle w:val="ListBullet"/>
+      </w:pPr>
+      <w:r>
+        <w:t>**`sections/attempt/riwayatJawaban.js` (baru) — riwayat jawaban lokal.** Store Zustand+persist</w:t>
+      </w:r>
+    </w:p>
+    <w:p>
+      <w:r>
+        <w:t xml:space="preserve">  (`ulangan-riwayat-jawaban-v1`) menyimpan per attempt: nomor soal, tipe, ringkasan jawaban yang manusiawi</w:t>
+      </w:r>
+    </w:p>
+    <w:p>
+      <w:r>
+        <w:t xml:space="preserve">  (`ringkasNilai()`), jam perkiraan server, dan status `lokal`/`terkirim`. Nilai jawaban mentah **tidak**</w:t>
+      </w:r>
+    </w:p>
+    <w:p>
+      <w:r>
+        <w:t xml:space="preserve">  disimpan di sini (tetap di `simpananJawaban.js`) supaya tidak ada dua sumber kebenaran. Isi</w:t>
+      </w:r>
+    </w:p>
+    <w:p>
+      <w:r>
+        <w:t xml:space="preserve">  localStorage selalu lewat **Zod** (`merge` pada persist): satu entri rusak membuang riwayat, bukan</w:t>
+      </w:r>
+    </w:p>
+    <w:p>
+      <w:r>
+        <w:t xml:space="preserve">  dipakai setengah-setengah. Saklar "nyalakan lokal" (`aktif`, bawaan **nyala**) mematikan pencatatan</w:t>
+      </w:r>
+    </w:p>
+    <w:p>
+      <w:r>
+        <w:t xml:space="preserve">  riwayat tanpa mematikan cadangan jawaban.</w:t>
+      </w:r>
+    </w:p>
+    <w:p>
+      <w:pPr>
+        <w:pStyle w:val="ListBullet"/>
+      </w:pPr>
+      <w:r>
+        <w:t>**Validasi sebelum menulis ke perangkat.** `amanDicatat()` menolak nilai yang tidak bisa dibaca kembali</w:t>
+      </w:r>
+    </w:p>
+    <w:p>
+      <w:r>
+        <w:t xml:space="preserve">  (fungsi/`NaN`/`Infinity`) dan yang melebihi kuota (`BATAS_PAYLOAD` 4.000 karakter JSON). Nilai yang</w:t>
+      </w:r>
+    </w:p>
+    <w:p>
+      <w:r>
+        <w:t xml:space="preserve">  ditolak **tidak ditulis setengah-setengah**, dan murid diberi tahu lewat toast.</w:t>
+      </w:r>
+    </w:p>
+    <w:p>
+      <w:pPr>
+        <w:pStyle w:val="ListBullet"/>
+      </w:pPr>
+      <w:r>
+        <w:t>**`RiwayatJawaban.jsx` (baru).** Panel `&lt;details&gt;` di layar pengerjaan: "Riwayat jawaban", "n tercatat",</w:t>
+      </w:r>
+    </w:p>
+    <w:p>
+      <w:r>
+        <w:t xml:space="preserve">  lencana "n menunggu terkirim", daftar terbaru-di-atas (nomor soal, ringkasan, jam, status</w:t>
+      </w:r>
+    </w:p>
+    <w:p>
+      <w:r>
+        <w:t xml:space="preserve">  `di perangkat ini`/`tersimpan di server`), saklar "Simpan riwayat jawaban di perangkat ini", dan</w:t>
+      </w:r>
+    </w:p>
+    <w:p>
+      <w:r>
+        <w:t xml:space="preserve">  keterangan yang berubah saat luring.</w:t>
+      </w:r>
+    </w:p>
+    <w:p>
+      <w:pPr>
+        <w:pStyle w:val="ListBullet"/>
+      </w:pPr>
+      <w:r>
+        <w:t>**Validasi waktu: jam monotonik (`hitungMundur.js`).** `jamKlien()` mengambil jam dinding **dan** jam</w:t>
+      </w:r>
+    </w:p>
+    <w:p>
+      <w:r>
+        <w:t xml:space="preserve">  monotonik; `sekarangTerkunci()` menaikkan waktu dari acuan respons server terakhir memakai selang</w:t>
+      </w:r>
+    </w:p>
+    <w:p>
+      <w:r>
+        <w:t xml:space="preserve">  monotonik, jadi memundurkan setelan jam Windows **tidak** menambah sisa waktu, dan `hitungSisaAman()`</w:t>
+      </w:r>
+    </w:p>
+    <w:p>
+      <w:r>
+        <w:t xml:space="preserve">  dipakai bersama oleh detak tiap detik dan perhitungan saat menggambar. Bila jam dinding berbeda dari jam</w:t>
+      </w:r>
+    </w:p>
+    <w:p>
+      <w:r>
+        <w:t xml:space="preserve">  monotonik lebih dari 5 detik, layar menampilkan banner "Jam perangkat berubah" dan mencatatnya.</w:t>
+      </w:r>
+    </w:p>
+    <w:p>
+      <w:pPr>
+        <w:pStyle w:val="ListBullet"/>
+      </w:pPr>
+      <w:r>
+        <w:t>**`sections/attempt/snapshot.js` (baru) — salinan attempt untuk luring.** Payload attempt (soal tanpa</w:t>
+      </w:r>
+    </w:p>
+    <w:p>
+      <w:r>
+        <w:t xml:space="preserve">  kunci + jawaban yang sudah dikirim server) disimpan di perangkat saat `mulai` berhasil; saat luring,</w:t>
+      </w:r>
+    </w:p>
+    <w:p>
+      <w:r>
+        <w:t xml:space="preserve">  query attempt jatuh ke salinan itu (`networkMode: 'always'` supaya TanStack Query tidak menahan queryFn</w:t>
+      </w:r>
+    </w:p>
+    <w:p>
+      <w:r>
+        <w:t xml:space="preserve">  saat `navigator.onLine` false — tanpa ini layar macet di "Menyiapkan ulangan…"). Penolakan **4xx tetap</w:t>
+      </w:r>
+    </w:p>
+    <w:p>
+      <w:r>
+        <w:t xml:space="preserve">  tidak ditambal salinan** (kuis ditutup/batas percobaan habis harus tetap terasa). `server_now` digeser</w:t>
+      </w:r>
+    </w:p>
+    <w:p>
+      <w:r>
+        <w:t xml:space="preserve">  sesuai umur salinan supaya hitung mundur tidak membeku, `skemaSnapshot` memvalidasi tiap entri dengan</w:t>
+      </w:r>
+    </w:p>
+    <w:p>
+      <w:r>
+        <w:t xml:space="preserve">  Zod, dan di layar galat tersedia tombol "Lanjutkan dari salinan di perangkat" untuk kasus wifi yang</w:t>
+      </w:r>
+    </w:p>
+    <w:p>
+      <w:r>
+        <w:t xml:space="preserve">  "tersambung tetapi tidak sampai server".</w:t>
+      </w:r>
+    </w:p>
+    <w:p>
+      <w:pPr>
+        <w:pStyle w:val="ListBullet"/>
+      </w:pPr>
+      <w:r>
+        <w:t>**Bersih saat dikumpulkan dan saat sesi berakhir.** Setelah hasil final: riwayat + salinan soal dihapus</w:t>
+      </w:r>
+    </w:p>
+    <w:p>
+      <w:r>
+        <w:t xml:space="preserve">  (cadangan jawaban hanya bila seluruh jawaban benar-benar tersimpan — aturan lama tetap). `bersihkanJejakSesi()`</w:t>
+      </w:r>
+    </w:p>
+    <w:p>
+      <w:r>
+        <w:t xml:space="preserve">  (keluar/401/419) kini membersihkan **lima** tempat: cache query, cadangan jawaban, riwayat jawaban,</w:t>
+      </w:r>
+    </w:p>
+    <w:p>
+      <w:r>
+        <w:t xml:space="preserve">  salinan soal, dan penanda status siaran.</w:t>
+      </w:r>
+    </w:p>
+    <w:p>
+      <w:r/>
+    </w:p>
+    <w:p>
+      <w:pPr>
+        <w:pStyle w:val="Heading3"/>
+      </w:pPr>
+      <w:r>
+        <w:t>A.33.2 Bug nyata yang ditangkap smoke: jawaban luring hilang tanpa pesan</w:t>
+      </w:r>
+    </w:p>
+    <w:p>
+      <w:r/>
+    </w:p>
+    <w:p>
+      <w:r>
+        <w:t>Smoke luring mula-mula gagal di langkah "jawaban luring terkirim ke server begitu koneksi kembali"</w:t>
+      </w:r>
+    </w:p>
+    <w:p>
+      <w:r>
+        <w:t>(`jawaban undefined · sisa antrean 1`), padahal jawaban itu **terlihat di layar** dan tersimpan di</w:t>
+      </w:r>
+    </w:p>
+    <w:p>
+      <w:r>
+        <w:t>perangkat.</w:t>
+      </w:r>
+    </w:p>
+    <w:p>
+      <w:r/>
+    </w:p>
+    <w:p>
+      <w:r>
+        <w:t>Sebabnya: antrean kirim hidup di memori (`useRef`), sedangkan cadangan jawaban hidup di localStorage.</w:t>
+      </w:r>
+    </w:p>
+    <w:p>
+      <w:r>
+        <w:t>Saat layar pengerjaan digambar ulang (muat ulang, pindah halaman, atau luring lalu kembali), cadangan tetap</w:t>
+      </w:r>
+    </w:p>
+    <w:p>
+      <w:r>
+        <w:t>menampilkan jawaban murid — sementara antreannya **kosong**, jadi server tidak pernah menerimanya. Kalau</w:t>
+      </w:r>
+    </w:p>
+    <w:p>
+      <w:r>
+        <w:t>murid lalu menekan "Kumpulkan", server menilai apa yang ia punya saja: murid melihat jawabannya terisi,</w:t>
+      </w:r>
+    </w:p>
+    <w:p>
+      <w:r>
+        <w:t>tetapi nilainya hilang tanpa satu pun pesan galat. Aturan repo "jawaban DB dulu, cache belakangan" tidak</w:t>
+      </w:r>
+    </w:p>
+    <w:p>
+      <w:r>
+        <w:t>menolong di sini karena tidak ada yang pernah mencoba mengirim ulang.</w:t>
+      </w:r>
+    </w:p>
+    <w:p>
+      <w:r/>
+    </w:p>
+    <w:p>
+      <w:r>
+        <w:t>Perbaikan: `pulihkan()` di `antreanJawaban.js` memasukkan kembali seluruh `belumTerkirim` ke antrean</w:t>
+      </w:r>
+    </w:p>
+    <w:p>
+      <w:r>
+        <w:t>(dengan nomor urut baru), dan `HalamanKerjakan` memanggilnya sekali per attempt (`dipulihkan` ref) lalu</w:t>
+      </w:r>
+    </w:p>
+    <w:p>
+      <w:r>
+        <w:t>langsung mengirim bila jaringan siap. Smoke dijalankan ulang: **22/22 lulus**, termasuk skor akhir 10/10</w:t>
+      </w:r>
+    </w:p>
+    <w:p>
+      <w:r>
+        <w:t>(dua jawaban; satu diketik daring, satu diketik saat luring dan baru terkirim setelah koneksi kembali).</w:t>
+      </w:r>
+    </w:p>
+    <w:p>
+      <w:r/>
+    </w:p>
+    <w:p>
+      <w:pPr>
+        <w:pStyle w:val="Heading3"/>
+      </w:pPr>
+      <w:r>
+        <w:t>A.33.3 Verifikasi (dijalankan, bukan klaim)</w:t>
+      </w:r>
+    </w:p>
+    <w:p>
+      <w:r/>
+    </w:p>
+    <w:p>
+      <w:r>
+        <w:t>| Perintah | Hasil |</w:t>
+      </w:r>
+    </w:p>
+    <w:p>
+      <w:r>
+        <w:t>| --- | --- |</w:t>
+      </w:r>
+    </w:p>
+    <w:p>
+      <w:r>
+        <w:t>| `npx vitest run` | **568 passed / 60 berkas** (sebelum putaran ini 513/56) — bertambah 55 tes: `luring` 9, `riwayatJawaban` 18, `snapshot` 10, `RiwayatJawaban` (komponen) 5, `hitungMundur` +9, `antreanJawaban` +3, authStore/sesi +1 |</w:t>
+      </w:r>
+    </w:p>
+    <w:p>
+      <w:r>
+        <w:t>| `npm run check` (checkJs) | OK |</w:t>
+      </w:r>
+    </w:p>
+    <w:p>
+      <w:r>
+        <w:t>| `npx eslint src` | 0 error (2 warning lama React Hook Form di `HalamanDaftar.jsx`/`HalamanAturUlangSandi.jsx`) |</w:t>
+      </w:r>
+    </w:p>
+    <w:p>
+      <w:r>
+        <w:t>| `php artisan test` | **258 passed (2.320 assertions)** — backend tidak disentuh putaran ini |</w:t>
+      </w:r>
+    </w:p>
+    <w:p>
+      <w:r>
+        <w:t>| `./verify.sh` (root) | **SEMUA HIJAU** — Pest 258 · Pint 335 berkas · checkJs OK · ESLint 0 error · Vitest 568 · realtime 15 |</w:t>
+      </w:r>
+    </w:p>
+    <w:p>
+      <w:r>
+        <w:t>| `node docs/smoke-ui-luring.mjs` (baru, CDP, backend+vite+Chrome) | **22/22 lulus, exit 0** (dijalankan dua kali dengan versi final; versi awalnya 20/20 lalu ditambah dua pemeriksaan jalur manual) |</w:t>
+      </w:r>
+    </w:p>
+    <w:p>
+      <w:r>
+        <w:t>| `node docs/smoke-ui-slice04.mjs` (regresi layar pengerjaan) | **18/18 lulus, exit 0** |</w:t>
+      </w:r>
+    </w:p>
+    <w:p>
+      <w:r>
+        <w:t>| `node docs/smoke-ui-slice07.mjs` (regresi anti-cheat, realtime hidup) | **20/20 lulus, exit 0** |</w:t>
+      </w:r>
+    </w:p>
+    <w:p>
+      <w:r/>
+    </w:p>
+    <w:p>
+      <w:r>
+        <w:t>Isi smoke luring (koneksi diputus dari **DevTools CDP**, bukan dimock di aplikasi):</w:t>
+      </w:r>
+    </w:p>
+    <w:p>
+      <w:r>
+        <w:t>1. guru menyiapkan ulangan 2 soal + terbit; murid login dan membuka layar pengerjaan (panel riwayat kosong);</w:t>
+      </w:r>
+    </w:p>
+    <w:p>
+      <w:r>
+        <w:t>2. jawab soal 1 daring → tersimpan di server **dan** riwayat menuliskan "tersimpan di server";</w:t>
+      </w:r>
+    </w:p>
+    <w:p>
+      <w:r>
+        <w:t>3. `Network.setBlockedURLs` pada `*/api/v1/kuis/*/mulai` (internet tetap "hidup", `navigator.onLine` true)</w:t>
+      </w:r>
+    </w:p>
+    <w:p>
+      <w:r>
+        <w:t xml:space="preserve">   lalu muat ulang halaman → layar galat "Tidak bisa menghubungi server" **beserta tombol** "Lanjutkan dari</w:t>
+      </w:r>
+    </w:p>
+    <w:p>
+      <w:r>
+        <w:t xml:space="preserve">   salinan di perangkat"; tombol itu ditekan → ulangan terbuka dari salinan (timer hidup, riwayat utuh), dan</w:t>
+      </w:r>
+    </w:p>
+    <w:p>
+      <w:r>
+        <w:t xml:space="preserve">   URL diblokirnya dilepas kembali;</w:t>
+      </w:r>
+    </w:p>
+    <w:p>
+      <w:r>
+        <w:t>4. `Network.emulateNetworkConditions offline` → `navigator.onLine` false dan banner "Koneksi putus — mode</w:t>
+      </w:r>
+    </w:p>
+    <w:p>
+      <w:r>
+        <w:t xml:space="preserve">   luring" muncul;</w:t>
+      </w:r>
+    </w:p>
+    <w:p>
+      <w:r>
+        <w:t>5. jawab soal 2 saat luring → `belumTerkirim` berisi jawaban itu, riwayat `1:terkirim 2:lokal`, lencana</w:t>
+      </w:r>
+    </w:p>
+    <w:p>
+      <w:r>
+        <w:t xml:space="preserve">   "1 menunggu terkirim", dan panel menulis "di perangkat ini";</w:t>
+      </w:r>
+    </w:p>
+    <w:p>
+      <w:r>
+        <w:t>6. pindah halaman di dalam aplikasi (pushState, tanpa memuat ulang berkas dari Vite) lalu kembali ke soal →</w:t>
+      </w:r>
+    </w:p>
+    <w:p>
+      <w:r>
+        <w:t xml:space="preserve">   banner "Melanjutkan dari salinan di perangkat", timer hidup, dan jawaban luring **tetap tercentang**;</w:t>
+      </w:r>
+    </w:p>
+    <w:p>
+      <w:r>
+        <w:t>7. `Date.now` dimundurkan 1 jam → banner "Jam perangkat berubah" muncul dan sisa waktu **tidak bertambah**</w:t>
+      </w:r>
+    </w:p>
+    <w:p>
+      <w:r>
+        <w:t xml:space="preserve">   (1.188 → 1.186 detik pada jalannya pertama), lalu kembali normal setelah jam dipulihkan;</w:t>
+      </w:r>
+    </w:p>
+    <w:p>
+      <w:r>
+        <w:t>8. koneksi dihidupkan → jawaban masuk server (`sisa antrean 0`), kedua riwayat jadi `terkirim`, banner</w:t>
+      </w:r>
+    </w:p>
+    <w:p>
+      <w:r>
+        <w:t xml:space="preserve">   luring hilang;</w:t>
+      </w:r>
+    </w:p>
+    <w:p>
+      <w:r>
+        <w:t>9. "Selesai" → "Kumpulkan" → murid ke halaman hasil, **riwayat dan salinan soal hilang dari perangkat**,</w:t>
+      </w:r>
+    </w:p>
+    <w:p>
+      <w:r>
+        <w:t xml:space="preserve">   dan server menilai dua jawaban (10/10, benar 2).</w:t>
+      </w:r>
+    </w:p>
+    <w:p>
+      <w:r/>
+    </w:p>
+    <w:p>
+      <w:pPr>
+        <w:pStyle w:val="Heading3"/>
+      </w:pPr>
+      <w:r>
+        <w:t>A.33.4 Keputusan teknis (satu kalimat per keputusan)</w:t>
+      </w:r>
+    </w:p>
+    <w:p>
+      <w:r/>
+    </w:p>
+    <w:p>
+      <w:pPr>
+        <w:pStyle w:val="ListBullet"/>
+      </w:pPr>
+      <w:r>
+        <w:t>**Riwayat menyimpan ringkasan, bukan nilai jawaban** — nilai mentah tetap di `simpananJawaban.js` supaya</w:t>
+      </w:r>
+    </w:p>
+    <w:p>
+      <w:r>
+        <w:t xml:space="preserve">  tidak ada dua sumber kebenaran dan kuota localStorage tidak dipakai dua kali.</w:t>
+      </w:r>
+    </w:p>
+    <w:p>
+      <w:pPr>
+        <w:pStyle w:val="ListBullet"/>
+      </w:pPr>
+      <w:r>
+        <w:t>**Riwayat disimpan lewat Zod di `merge`** — aturan repo "data dari localStorage selalu lewat Zod";</w:t>
+      </w:r>
+    </w:p>
+    <w:p>
+      <w:r>
+        <w:t xml:space="preserve">  payload rusak mengosongkan riwayat, bukan membuat layar gagal.</w:t>
+      </w:r>
+    </w:p>
+    <w:p>
+      <w:pPr>
+        <w:pStyle w:val="ListBullet"/>
+      </w:pPr>
+      <w:r>
+        <w:t>**Jam monotonik, bukan jam dinding, saat luring** — `Date.now()` bisa diubah murid, `performance.now()`</w:t>
+      </w:r>
+    </w:p>
+    <w:p>
+      <w:r>
+        <w:t xml:space="preserve">  tidak; `mulai_at`/`deadline_at` tetap dari server dan submit tetap divalidasi server.</w:t>
+      </w:r>
+    </w:p>
+    <w:p>
+      <w:pPr>
+        <w:pStyle w:val="ListBullet"/>
+      </w:pPr>
+      <w:r>
+        <w:t>**Salinan attempt hanya ditambal untuk galat jaringan/5xx** — 4xx berarti aturan kuis menolak (kuis</w:t>
+      </w:r>
+    </w:p>
+    <w:p>
+      <w:r>
+        <w:t xml:space="preserve">  ditutup, batas percobaan habis), dan salinan lama tidak boleh membatalkan penolakan itu.</w:t>
+      </w:r>
+    </w:p>
+    <w:p>
+      <w:pPr>
+        <w:pStyle w:val="ListBullet"/>
+      </w:pPr>
+      <w:r>
+        <w:t>**Salinan soal tidak memuat kunci** — isinya sama dengan yang sudah tampil di layar murid (K-02), dan</w:t>
+      </w:r>
+    </w:p>
+    <w:p>
+      <w:r>
+        <w:t xml:space="preserve">  dihapus setelah submit.</w:t>
+      </w:r>
+    </w:p>
+    <w:p>
+      <w:pPr>
+        <w:pStyle w:val="ListBullet"/>
+      </w:pPr>
+      <w:r>
+        <w:t>**Penjadwalan ulang dimatikan saat `navigator.onLine` false** — lebih baik menunggu event `online`</w:t>
+      </w:r>
+    </w:p>
+    <w:p>
+      <w:r>
+        <w:t xml:space="preserve">  daripada menembak permintaan yang gagal tiap 5 detik.</w:t>
+      </w:r>
+    </w:p>
+    <w:p>
+      <w:r/>
+    </w:p>
+    <w:p>
+      <w:pPr>
+        <w:pStyle w:val="Heading3"/>
+      </w:pPr>
+      <w:r>
+        <w:t>A.33.5 Batasan jujur (yang belum selesai)</w:t>
+      </w:r>
+    </w:p>
+    <w:p>
+      <w:r/>
+    </w:p>
+    <w:p>
+      <w:pPr>
+        <w:pStyle w:val="ListBullet"/>
+      </w:pPr>
+      <w:r>
+        <w:t>**Belum ada service worker / app shell**: mode luring bekerja selama aplikasi masih terbuka (atau murid</w:t>
+      </w:r>
+    </w:p>
+    <w:p>
+      <w:r>
+        <w:t xml:space="preserve">  berpindah halaman di dalamnya). Muat ulang halaman saat internet benar-benar mati masih menampilkan layar</w:t>
+      </w:r>
+    </w:p>
+    <w:p>
+      <w:r>
+        <w:t xml:space="preserve">  galat browser karena berkas aplikasi datang dari server. Menambahkan PWA berarti juga harus memutuskan</w:t>
+      </w:r>
+    </w:p>
+    <w:p>
+      <w:r>
+        <w:t xml:space="preserve">  penyimpanan sesi di perangkat — sengaja **tidak** dilakukan sekarang karena komputer lab dipakai</w:t>
+      </w:r>
+    </w:p>
+    <w:p>
+      <w:r>
+        <w:t xml:space="preserve">  bergantian (aturan S-14).</w:t>
+      </w:r>
+    </w:p>
+    <w:p>
+      <w:pPr>
+        <w:pStyle w:val="ListBullet"/>
+      </w:pPr>
+      <w:r>
+        <w:t>**Waktu saat luring tetap perkiraan**: selang jam monotonik akurat untuk satu kali buka layar; salinan</w:t>
+      </w:r>
+    </w:p>
+    <w:p>
+      <w:r>
+        <w:t xml:space="preserve">  yang dibaca ulang sesudahnya memakai jam dinding perangkat (tidak ada cara lain tanpa server). Karena</w:t>
+      </w:r>
+    </w:p>
+    <w:p>
+      <w:r>
+        <w:t xml:space="preserve">  itu murid diberi tahu lewat banner saat jamnya terlihat diubah, dan **server tetap penentu akhir** untuk</w:t>
+      </w:r>
+    </w:p>
+    <w:p>
+      <w:r>
+        <w:t xml:space="preserve">  deadline.</w:t>
+      </w:r>
+    </w:p>
+    <w:p>
+      <w:pPr>
+        <w:pStyle w:val="ListBullet"/>
+      </w:pPr>
+      <w:r>
+        <w:t>**Yang diuji baru satu jalur koneksi**: offline→online lewat CDP pada satu attempt; belum diuji dua tab</w:t>
+      </w:r>
+    </w:p>
+    <w:p>
+      <w:r>
+        <w:t xml:space="preserve">  bersamaan saat luring, mode tim saat luring, atau unggahan berkas jawaban saat luring (unggahan tetap</w:t>
+      </w:r>
+    </w:p>
+    <w:p>
+      <w:r>
+        <w:t xml:space="preserve">  butuh koneksi).</w:t>
+      </w:r>
+    </w:p>
+    <w:p>
+      <w:pPr>
+        <w:pStyle w:val="ListBullet"/>
+      </w:pPr>
+      <w:r>
+        <w:t>**Internet terlihat hidup tetapi server mati = jalur manual.** Salinan perangkat hanya ditambal</w:t>
+      </w:r>
+    </w:p>
+    <w:p>
+      <w:r>
+        <w:t xml:space="preserve">  otomatis saat `navigator.onLine` bilang putus, supaya penolakan sungguhan dari server (4xx: kuis ditutup,</w:t>
+      </w:r>
+    </w:p>
+    <w:p>
+      <w:r>
+        <w:t xml:space="preserve">  batas percobaan habis) tidak pernah tertutup salinan lama. Untuk kasus itu murid sendiri yang menekan</w:t>
+      </w:r>
+    </w:p>
+    <w:p>
+      <w:r>
+        <w:t xml:space="preserve">  "Lanjutkan dari salinan di perangkat" — jalur ini diuji di smoke (langkah 3) dan lulus, tetapi tetap</w:t>
+      </w:r>
+    </w:p>
+    <w:p>
+      <w:r>
+        <w:t xml:space="preserve">  bergantung pada murid menyadari tombolnya ada.</w:t>
+      </w:r>
+    </w:p>
+    <w:p>
+      <w:r/>
+    </w:p>
+    <w:p>
+      <w:pPr>
+        <w:pStyle w:val="Heading3"/>
+      </w:pPr>
+      <w:r>
+        <w:t>A.33.6 Berkas yang dibuat/diubah</w:t>
+      </w:r>
+    </w:p>
+    <w:p>
+      <w:r/>
+    </w:p>
+    <w:p>
+      <w:r>
+        <w:t>Dibuat:</w:t>
+      </w:r>
+    </w:p>
+    <w:p>
+      <w:pPr>
+        <w:pStyle w:val="ListBullet"/>
+      </w:pPr>
+      <w:r>
+        <w:t>`frontend/src/sections/attempt/luring.js`</w:t>
+      </w:r>
+    </w:p>
+    <w:p>
+      <w:pPr>
+        <w:pStyle w:val="ListBullet"/>
+      </w:pPr>
+      <w:r>
+        <w:t>`frontend/src/sections/attempt/riwayatJawaban.js`</w:t>
+      </w:r>
+    </w:p>
+    <w:p>
+      <w:pPr>
+        <w:pStyle w:val="ListBullet"/>
+      </w:pPr>
+      <w:r>
+        <w:t>`frontend/src/sections/attempt/snapshot.js`</w:t>
+      </w:r>
+    </w:p>
+    <w:p>
+      <w:pPr>
+        <w:pStyle w:val="ListBullet"/>
+      </w:pPr>
+      <w:r>
+        <w:t>`frontend/src/sections/attempt/RiwayatJawaban.jsx`</w:t>
+      </w:r>
+    </w:p>
+    <w:p>
+      <w:pPr>
+        <w:pStyle w:val="ListBullet"/>
+      </w:pPr>
+      <w:r>
+        <w:t>`frontend/src/__tests__/sections/attempt/luring.test.js`</w:t>
+      </w:r>
+    </w:p>
+    <w:p>
+      <w:pPr>
+        <w:pStyle w:val="ListBullet"/>
+      </w:pPr>
+      <w:r>
+        <w:t>`frontend/src/__tests__/sections/attempt/riwayatJawaban.test.js`</w:t>
+      </w:r>
+    </w:p>
+    <w:p>
+      <w:pPr>
+        <w:pStyle w:val="ListBullet"/>
+      </w:pPr>
+      <w:r>
+        <w:t>`frontend/src/__tests__/sections/attempt/snapshot.test.js`</w:t>
+      </w:r>
+    </w:p>
+    <w:p>
+      <w:pPr>
+        <w:pStyle w:val="ListBullet"/>
+      </w:pPr>
+      <w:r>
+        <w:t>`frontend/src/__tests__/sections/attempt/RiwayatJawaban.test.jsx`</w:t>
+      </w:r>
+    </w:p>
+    <w:p>
+      <w:pPr>
+        <w:pStyle w:val="ListBullet"/>
+      </w:pPr>
+      <w:r>
+        <w:t>`docs/smoke-ui-luring.mjs`</w:t>
+      </w:r>
+    </w:p>
+    <w:p>
+      <w:r/>
+    </w:p>
+    <w:p>
+      <w:r>
+        <w:t>Diubah:</w:t>
+      </w:r>
+    </w:p>
+    <w:p>
+      <w:pPr>
+        <w:pStyle w:val="ListBullet"/>
+      </w:pPr>
+      <w:r>
+        <w:t>`frontend/src/sections/attempt/HalamanKerjakan.jsx` (keadaan jaringan, gerbang luring, riwayat, salinan</w:t>
+      </w:r>
+    </w:p>
+    <w:p>
+      <w:r>
+        <w:t xml:space="preserve">  attempt + tombol lanjut, jam monotonik, pemulihan antrean, banner, panel riwayat)</w:t>
+      </w:r>
+    </w:p>
+    <w:p>
+      <w:pPr>
+        <w:pStyle w:val="ListBullet"/>
+      </w:pPr>
+      <w:r>
+        <w:t>`frontend/src/sections/attempt/hitungMundur.js` (`jamKlien`, `sekarangTerkunci`, `hitungSisaAman`,</w:t>
+      </w:r>
+    </w:p>
+    <w:p>
+      <w:r>
+        <w:t xml:space="preserve">  `TOLERANSI_GESER_JAM_MS`)</w:t>
+      </w:r>
+    </w:p>
+    <w:p>
+      <w:pPr>
+        <w:pStyle w:val="ListBullet"/>
+      </w:pPr>
+      <w:r>
+        <w:t>`frontend/src/sections/attempt/antreanJawaban.js` (`pulihkan`)</w:t>
+      </w:r>
+    </w:p>
+    <w:p>
+      <w:pPr>
+        <w:pStyle w:val="ListBullet"/>
+      </w:pPr>
+      <w:r>
+        <w:t>`frontend/src/sections/auth/authStore.js` (bersihkan riwayat + salinan saat sesi berakhir)</w:t>
+      </w:r>
+    </w:p>
+    <w:p>
+      <w:pPr>
+        <w:pStyle w:val="ListBullet"/>
+      </w:pPr>
+      <w:r>
+        <w:t>`frontend/src/__tests__/sections/attempt/hitungMundur.test.js`</w:t>
+      </w:r>
+    </w:p>
+    <w:p>
+      <w:pPr>
+        <w:pStyle w:val="ListBullet"/>
+      </w:pPr>
+      <w:r>
+        <w:t>`frontend/src/__tests__/sections/attempt/antreanJawaban.test.js`</w:t>
+      </w:r>
+    </w:p>
+    <w:p>
+      <w:pPr>
+        <w:pStyle w:val="ListBullet"/>
+      </w:pPr>
+      <w:r>
+        <w:t>`frontend/src/__tests__/sections/auth/authStore.test.js`</w:t>
+      </w:r>
+    </w:p>
+    <w:p>
+      <w:pPr>
+        <w:pStyle w:val="ListBullet"/>
+      </w:pPr>
+      <w:r>
+        <w:t>`frontend/src/__tests__/sections/auth/authStore.sesi.test.js`</w:t>
+      </w:r>
+    </w:p>
+    <w:p>
+      <w:pPr>
+        <w:pStyle w:val="ListBullet"/>
+      </w:pPr>
+      <w:r>
+        <w:t>`docs/penjelasan-fitur.md` (bagian 17 + batasan), `docs/laporan-pengujian.md` (A.33 ini),</w:t>
+      </w:r>
+    </w:p>
+    <w:p>
+      <w:r>
+        <w:t xml:space="preserve">  `docs/handoff-sesi.md`</w:t>
+      </w:r>
+    </w:p>
+    <w:p>
+      <w:r/>
+    </w:p>
+    <w:p>
+      <w:r>
+        <w:t>────────────────────────────────────────</w:t>
+      </w:r>
+    </w:p>
+    <w:p>
+      <w:r/>
+    </w:p>
+    <w:p>
+      <w:pPr>
+        <w:pStyle w:val="Heading2"/>
+      </w:pPr>
+      <w:r>
+        <w:t>A.34 Materi Berjalan: Template Tema, Peta Beranimasi, dan Kenaikan Pos/Tingkat (10 Oktober 2026)</w:t>
+      </w:r>
+    </w:p>
+    <w:p>
+      <w:r/>
+    </w:p>
+    <w:p>
+      <w:r>
+        <w:t>Permintaan putaran ini: *"sekarang buat sistem template yang materi, tampilannya seperti tema video —</w:t>
+      </w:r>
+    </w:p>
+    <w:p>
+      <w:r>
+        <w:t>guru impor medianya dan template-nya yang tentuin fase; misalnya template seperti mendaki gunung (pakai</w:t>
+      </w:r>
+    </w:p>
+    <w:p>
+      <w:r>
+        <w:t>animasi/video, bukan gambar manual); tiap materi punya tema tertentu (guru yang tentuin); saat maju atau</w:t>
+      </w:r>
+    </w:p>
+    <w:p>
+      <w:r>
+        <w:t>setelah quiz jadi satu langkah, naik, dst."*</w:t>
+      </w:r>
+    </w:p>
+    <w:p>
+      <w:r/>
+    </w:p>
+    <w:p>
+      <w:r>
+        <w:t>Sebelum putaran ini materi sudah berblok dan bergaya video editor (A.31), tetapi tiap materi hanya berupa</w:t>
+      </w:r>
+    </w:p>
+    <w:p>
+      <w:r>
+        <w:t>urutan klip: tidak ada **tema** yang dipilih guru, tidak ada **adegan** yang bergerak, dan tidak ada</w:t>
+      </w:r>
+    </w:p>
+    <w:p>
+      <w:r>
+        <w:t>**langkah** yang bisa dibaca anak sebagai kemajuan. Putaran ini menambahkan lapis "perjalanan" di atas</w:t>
+      </w:r>
+    </w:p>
+    <w:p>
+      <w:r>
+        <w:t>blok yang sudah ada, tanpa mengubah cara blok disimpan atau dinilai.</w:t>
+      </w:r>
+    </w:p>
+    <w:p>
+      <w:r/>
+    </w:p>
+    <w:p>
+      <w:pPr>
+        <w:pStyle w:val="Heading3"/>
+      </w:pPr>
+      <w:r>
+        <w:t>A.34.1 Yang dikerjakan</w:t>
+      </w:r>
+    </w:p>
+    <w:p>
+      <w:r/>
+    </w:p>
+    <w:p>
+      <w:pPr>
+        <w:pStyle w:val="ListBullet"/>
+      </w:pPr>
+      <w:r>
+        <w:t>**`Material/Registry/TemaPerjalanan.php` (baru, murni tanpa DB/config/container)** — katalog template</w:t>
+      </w:r>
+    </w:p>
+    <w:p>
+      <w:r>
+        <w:t xml:space="preserve">  tema. Satu template "Mendaki Gunung" (`kode: mendaki-gunung`) berisi identitas adegan (`adegan: gunung`),</w:t>
+      </w:r>
+    </w:p>
+    <w:p>
+      <w:r>
+        <w:t xml:space="preserve">  `satuan` ("pos"), **6 fase** (Basecamp → Jalur Pinus → Sungai Deras → Lereng Berbatu → Kabut Puncak →</w:t>
+      </w:r>
+    </w:p>
+    <w:p>
+      <w:r>
+        <w:t xml:space="preserve">  Puncak; masing-masing dengan ikon + warna), dan **4 tingkat** (Pendaki Pemula 0% → Pendaki Terlatih 25% →</w:t>
+      </w:r>
+    </w:p>
+    <w:p>
+      <w:r>
+        <w:t xml:space="preserve">  Penjelajah Lereng 60% → Penakluk Puncak 100%). Fungsi `normalkan()`/`konfigurasi()`/`langkah()`/</w:t>
+      </w:r>
+    </w:p>
+    <w:p>
+      <w:r>
+        <w:t xml:space="preserve">  `tingkat()` dipakai bersama oleh resource, progres, laporan, dan tes.</w:t>
+      </w:r>
+    </w:p>
+    <w:p>
+      <w:pPr>
+        <w:pStyle w:val="ListBullet"/>
+      </w:pPr>
+      <w:r>
+        <w:t>**Kolom `materials.tema` (JSON, nullable) + migrasi `2026_10_10_000002_tambah_tema_materi.php`** —</w:t>
+      </w:r>
+    </w:p>
+    <w:p>
+      <w:r>
+        <w:t xml:space="preserve">  menyimpan **pilihan guru saja**: `{kode, nama, video_kode}`. Nama bawaan fase dan tingkat hidup di</w:t>
+      </w:r>
+    </w:p>
+    <w:p>
+      <w:r>
+        <w:t xml:space="preserve">  registry, bukan di DB, supaya tidak ada data tema yang bisa rusak. Baris lama (`NULL`) otomatis berarti</w:t>
+      </w:r>
+    </w:p>
+    <w:p>
+      <w:r>
+        <w:t xml:space="preserve">  tema bawaan — materi yang sudah ada sebelum fitur ini ikut punya perjalanan tanpa diisi apa pun.</w:t>
+      </w:r>
+    </w:p>
+    <w:p>
+      <w:pPr>
+        <w:pStyle w:val="ListBullet"/>
+      </w:pPr>
+      <w:r>
+        <w:t>**`GET /api/v1/materi/tema`** (didaftarkan **sebelum** `/materi/{materi}` supaya "tema" tidak dibaca</w:t>
+      </w:r>
+    </w:p>
+    <w:p>
+      <w:r>
+        <w:t xml:space="preserve">  sebagai id) mengirim katalog ke klien. Penolakan kode tema tak dikenal ada di `TemaMateriService`</w:t>
+      </w:r>
+    </w:p>
+    <w:p>
+      <w:r>
+        <w:t xml:space="preserve">  (video latar juga hanya boleh milik materi itu sendiri).</w:t>
+      </w:r>
+    </w:p>
+    <w:p>
+      <w:pPr>
+        <w:pStyle w:val="ListBullet"/>
+      </w:pPr>
+      <w:r>
+        <w:t>**Nama pos bisa diganti guru**: `SinkronBlokRequest` menerima `isi.fase` per blok; `TemaPerjalanan::langkah()`</w:t>
+      </w:r>
+    </w:p>
+    <w:p>
+      <w:r>
+        <w:t xml:space="preserve">  memakai nama bawaan tema bila kosong, memotong (`MAKS_LANGKAH` 40) bila kepanjangan, dan menlanjutkan</w:t>
+      </w:r>
+    </w:p>
+    <w:p>
+      <w:r>
+        <w:t xml:space="preserve">  "Pos n" bila blok lebih banyak daripada fase template — jadi **tidak pernah ada langkah tanpa nama**.</w:t>
+      </w:r>
+    </w:p>
+    <w:p>
+      <w:pPr>
+        <w:pStyle w:val="ListBullet"/>
+      </w:pPr>
+      <w:r>
+        <w:t>**Peta perjalanan di muatan murid** (`ProgresMateriService` → `perjalanan`): daftar langkah (nama, ikon,</w:t>
+      </w:r>
+    </w:p>
+    <w:p>
+      <w:r>
+        <w:t xml:space="preserve">  warna, wajib/opsional, selesai), posisi kini, jumlah langkah, `persen`, `tingkat` (nomor/nama/berikut/sisa),</w:t>
+      </w:r>
+    </w:p>
+    <w:p>
+      <w:r>
+        <w:t xml:space="preserve">  satuan, `tuntas`, dan `video_url` bertanda tangan. **Laporan guru** (`LaporanMateriService`) memakai peta</w:t>
+      </w:r>
+    </w:p>
+    <w:p>
+      <w:r>
+        <w:t xml:space="preserve">  yang **sama persis** — nama pos yang dilihat guru dan murid tidak bisa berbeda.</w:t>
+      </w:r>
+    </w:p>
+    <w:p>
+      <w:pPr>
+        <w:pStyle w:val="ListBullet"/>
+      </w:pPr>
+      <w:r>
+        <w:t>**`frontend/src/sections/material/perjalanan.js` (baru)** — skema Zod (langkah, tingkat, perjalanan,</w:t>
+      </w:r>
+    </w:p>
+    <w:p>
+      <w:r>
+        <w:t xml:space="preserve">  katalog tema), **katalog cadangan** `TEMA_CADANGAN` yang identik dengan registry server (dipakai editor</w:t>
+      </w:r>
+    </w:p>
+    <w:p>
+      <w:r>
+        <w:t xml:space="preserve">  sebelum katalog termuat, jadi panel template tidak pernah kosong), dan pembantu murni: `faseKe`,</w:t>
+      </w:r>
+    </w:p>
+    <w:p>
+      <w:r>
+        <w:t xml:space="preserve">  `terapkanTema`, `langkahLokal`, `tingkatKe`, `petaLokal`, `titikJalur`, `posisiAktif`, `kenaikanUntuk`,</w:t>
+      </w:r>
+    </w:p>
+    <w:p>
+      <w:r>
+        <w:t xml:space="preserve">  `labelPerjalanan`.</w:t>
+      </w:r>
+    </w:p>
+    <w:p>
+      <w:pPr>
+        <w:pStyle w:val="ListBullet"/>
+      </w:pPr>
+      <w:r>
+        <w:t>**`PetaPerjalanan.jsx` (baru, dipakai guru &amp; murid)** — adegan **digambar dan dianimasikan CSS/SVG**,</w:t>
+      </w:r>
+    </w:p>
+    <w:p>
+      <w:r>
+        <w:t xml:space="preserve">  bukan gambar tempelan: langit, matahari, **awan berjalan** (`@keyframes jelajah-awan`), tiga lapis gunung,</w:t>
+      </w:r>
+    </w:p>
+    <w:p>
+      <w:r>
+        <w:t xml:space="preserve">  jalur putus-putus/penuh per ruas, pos berikon, dan **pendaki yang melangkah** (`@keyframes jelajah-langkah`)</w:t>
+      </w:r>
+    </w:p>
+    <w:p>
+      <w:r>
+        <w:t xml:space="preserve">  di posisi kini. Bila guru menempelkan **video latar** untuk tema, video itu yang tampil (diputar senyap,</w:t>
+      </w:r>
+    </w:p>
+    <w:p>
+      <w:r>
+        <w:t xml:space="preserve">  `autoplay loop muted`) dan adegan SVG disembunyikan — jadi tidak pernah ada dua latar saling menimpa.</w:t>
+      </w:r>
+    </w:p>
+    <w:p>
+      <w:r>
+        <w:t xml:space="preserve">  Peta selalu disertai **daftar pos dalam teks** (selesai / sedang ditempuh / belum dibuka) plus ringkasan</w:t>
+      </w:r>
+    </w:p>
+    <w:p>
+      <w:r>
+        <w:t xml:space="preserve">  persen dan tingkat, sehingga pembaca layar dan layar sempit mendapat isi yang sama, bukan versi ringkas</w:t>
+      </w:r>
+    </w:p>
+    <w:p>
+      <w:r>
+        <w:t xml:space="preserve">  yang bisa berbeda.</w:t>
+      </w:r>
+    </w:p>
+    <w:p>
+      <w:pPr>
+        <w:pStyle w:val="ListBullet"/>
+      </w:pPr>
+      <w:r>
+        <w:t>**Editor guru**: panel **Template** (pilih tema, ganti nama tema, ganti nama tiap pos) dengan pratinjau</w:t>
+      </w:r>
+    </w:p>
+    <w:p>
+      <w:r>
+        <w:t xml:space="preserve">  peta hidup, dan catatan tingkat yang akan diraih. `sinkronBlok()` ikut mengirim `tema`.</w:t>
+      </w:r>
+    </w:p>
+    <w:p>
+      <w:pPr>
+        <w:pStyle w:val="ListBullet"/>
+      </w:pPr>
+      <w:r>
+        <w:t>**Layar murid**: `kenaikanUntuk()` membandingkan peta **sebelum** dan **sesudah** satu bagian ditutup,</w:t>
+      </w:r>
+    </w:p>
+    <w:p>
+      <w:r>
+        <w:t xml:space="preserve">  lalu menampilkan Banner jujur — `Naik ke pos 3: Sungai Deras`, `Naik tingkat: Pendaki Terlatih`, atau</w:t>
+      </w:r>
+    </w:p>
+    <w:p>
+      <w:r>
+        <w:t xml:space="preserve">  `… tuntas!`. Kenaikan diumumkan **hanya setelah server mengirim peta terbaru**, jadi pesannya tidak pernah</w:t>
+      </w:r>
+    </w:p>
+    <w:p>
+      <w:r>
+        <w:t xml:space="preserve">  mendahului keadaan yang benar-benar tersimpan.</w:t>
+      </w:r>
+    </w:p>
+    <w:p>
+      <w:pPr>
+        <w:pStyle w:val="ListBullet"/>
+      </w:pPr>
+      <w:r>
+        <w:t>**Aturan yang tetap di server**: hanya langkah **wajib** yang menghitung persen dan kenaikan (langkah</w:t>
+      </w:r>
+    </w:p>
+    <w:p>
+      <w:r>
+        <w:t xml:space="preserve">  opsional tidak pernah menahan kenaikan), dan boleh-tidaknya membuka langkah tetap diputus</w:t>
+      </w:r>
+    </w:p>
+    <w:p>
+      <w:r>
+        <w:t xml:space="preserve">  `ProgresMateriService` — peta hanyalah tampilan.</w:t>
+      </w:r>
+    </w:p>
+    <w:p>
+      <w:r/>
+    </w:p>
+    <w:p>
+      <w:pPr>
+        <w:pStyle w:val="Heading3"/>
+      </w:pPr>
+      <w:r>
+        <w:t>A.34.2 Verifikasi (dijalankan, bukan klaim)</w:t>
+      </w:r>
+    </w:p>
+    <w:p>
+      <w:r/>
+    </w:p>
+    <w:p>
+      <w:r>
+        <w:t>| Perintah | Hasil |</w:t>
+      </w:r>
+    </w:p>
+    <w:p>
+      <w:r>
+        <w:t>| --- | --- |</w:t>
+      </w:r>
+    </w:p>
+    <w:p>
+      <w:r>
+        <w:t>| `php artisan test tests/Feature/Slice12TemaMateriTest.php` | **9 passed (123 assertions)** — katalog ditolak untuk tamu, tema + nama pos tersimpan, kode tak dikenal ditolak, video latar harus milik materi itu, posisi &amp; tingkat naik satu per satu, langkah opsional diabaikan, laporan memakai nama pos yang sama, murid tak bisa mengganti tema, nama pos kepanjangan dipotong |</w:t>
+      </w:r>
+    </w:p>
+    <w:p>
+      <w:r>
+        <w:t>| `npx vitest run src/__tests__/sections/material src/__tests__/theme` | **90 passed (7 berkas)** — termasuk 24 tes `perjalanan` dan 9 tes komponen `PetaPerjalanan` |</w:t>
+      </w:r>
+    </w:p>
+    <w:p>
+      <w:r>
+        <w:t>| `./verify.sh` (root) | **SEMUA HIJAU (exit 0)** — Pest **267 passed (2443 assertions)** · Pint **340 berkas** · checkJs OK · ESLint **0 error** (2 warning lama) · Vitest **62 berkas / 601 test** · realtime 15 test |</w:t>
+      </w:r>
+    </w:p>
+    <w:p>
+      <w:r>
+        <w:t>| `docs/jalankan-smoke-perjalanan.sh` (CDP, backend :8000 + vite :5173 + Chrome :9333) | **34/34 lulus, exit 0** |</w:t>
+      </w:r>
+    </w:p>
+    <w:p>
+      <w:r/>
+    </w:p>
+    <w:p>
+      <w:r>
+        <w:t>Isi smoke `docs/smoke-ui-perjalanan.mjs` (harness mandiri: membuat materi + video uji 2 detik sendiri, lalu</w:t>
+      </w:r>
+    </w:p>
+    <w:p>
+      <w:r>
+        <w:t>menghapusnya di akhir):</w:t>
+      </w:r>
+    </w:p>
+    <w:p>
+      <w:r>
+        <w:t>1. katalog tema datang dari server (`mendaki-gunung`, 6 fase, 4 tingkat); guru membuat materi uji;</w:t>
+      </w:r>
+    </w:p>
+    <w:p>
+      <w:r>
+        <w:t>2. guru mengunggah **video latar** lewat jalur berpotongan (hash SHA-256 per potongan) — video 2 detik dibuat</w:t>
+      </w:r>
+    </w:p>
+    <w:p>
+      <w:r>
+        <w:t xml:space="preserve">   ffmpeg oleh runner, **bukan** berkas dev;</w:t>
+      </w:r>
+    </w:p>
+    <w:p>
+      <w:r>
+        <w:t>3. guru menyusun 4 pos, mengganti nama tema ("Ekspedisi Smoke") dan dua nama pos; pos 3–4 tetap memakai nama</w:t>
+      </w:r>
+    </w:p>
+    <w:p>
+      <w:r>
+        <w:t xml:space="preserve">   bawaan tema; materi diterbitkan;</w:t>
+      </w:r>
+    </w:p>
+    <w:p>
+      <w:r>
+        <w:t>4. editor menampilkan peta 4 pos, nama tema ganti, daftar pos memakai nama ganti + bawaan, latar beranimasi</w:t>
+      </w:r>
+    </w:p>
+    <w:p>
+      <w:r>
+        <w:t xml:space="preserve">   (video `autoplay` + pendaki `jelajah-langkah`), dan video latar terpasang;</w:t>
+      </w:r>
+    </w:p>
+    <w:p>
+      <w:r>
+        <w:t>5. murid membuka materi: API mengirim peta lengkap (posisi 1, 4 langkah, tingkat "Pendaki Pemula"), nama pos</w:t>
+      </w:r>
+    </w:p>
+    <w:p>
+      <w:r>
+        <w:t xml:space="preserve">   sama dengan yang dilihat guru, video latar berupa URL bertanda tangan; peta + penanda posisi tampil;</w:t>
+      </w:r>
+    </w:p>
+    <w:p>
+      <w:r>
+        <w:t>6. murid menuntaskan pos 1 → **naik tingkat** diumumkan dan peta maju (pos 1 selesai, pos 2 jadi posisi kini);</w:t>
+      </w:r>
+    </w:p>
+    <w:p>
+      <w:r>
+        <w:t>7. murid menuntaskan pos 2 → **naik pos** diumumkan ("Naik ke pos 3") dan posisi peta jadi 3 dari 4;</w:t>
+      </w:r>
+    </w:p>
+    <w:p>
+      <w:r>
+        <w:t>8. laporan guru memuat peta kelas yang sama dan menunjukkan posisi 3 / selesai 2 / tingkat "Pendaki Terlatih"</w:t>
+      </w:r>
+    </w:p>
+    <w:p>
+      <w:r>
+        <w:t xml:space="preserve">   untuk murid uji;</w:t>
+      </w:r>
+    </w:p>
+    <w:p>
+      <w:r>
+        <w:t>9. data uji dihapus kembali (materi + unggahan), jadi harness bisa dijalankan berulang.</w:t>
+      </w:r>
+    </w:p>
+    <w:p>
+      <w:r/>
+    </w:p>
+    <w:p>
+      <w:pPr>
+        <w:pStyle w:val="Heading3"/>
+      </w:pPr>
+      <w:r>
+        <w:t>A.34.3 Temuan nyata yang ditangkap smoke (dan diperbaiki di harness)</w:t>
+      </w:r>
+    </w:p>
+    <w:p>
+      <w:r/>
+    </w:p>
+    <w:p>
+      <w:pPr>
+        <w:pStyle w:val="ListBullet"/>
+      </w:pPr>
+      <w:r>
+        <w:t>**Harness membuka bagian yang salah.** Langkah ke-7 mula-mula memakai `klik('Buka')` yang mengklik tombol</w:t>
+      </w:r>
+    </w:p>
+    <w:p>
+      <w:r>
+        <w:t xml:space="preserve">  "Buka" **pertama** di halaman. Karena bagian yang sudah selesai **tetap bisa dibuka ulang**, tombol itu</w:t>
+      </w:r>
+    </w:p>
+    <w:p>
+      <w:r>
+        <w:t xml:space="preserve">  mengenai **bagian 1 lagi**, sehingga penutupan "bagian kedua" sebenarnya menutup bagian 1 — peta tidak</w:t>
+      </w:r>
+    </w:p>
+    <w:p>
+      <w:r>
+        <w:t xml:space="preserve">  maju (`selesai 1 · aktif 2`), dan tiga pemeriksaan gagal. Perbaikan: `klikBagian(n)` yang mencari baris</w:t>
+      </w:r>
+    </w:p>
+    <w:p>
+      <w:r>
+        <w:t xml:space="preserve">  `Bagian n` lalu mengklik tombolnya, plus penantian eksplisit sampai peta benar-benar maju sebelum langkah</w:t>
+      </w:r>
+    </w:p>
+    <w:p>
+      <w:r>
+        <w:t xml:space="preserve">  berikutnya. Sesudah perbaikan: **34/34**. Ujian ini menemukan bug **di harness**, bukan di produk.</w:t>
+      </w:r>
+    </w:p>
+    <w:p>
+      <w:pPr>
+        <w:pStyle w:val="ListBullet"/>
+      </w:pPr>
+      <w:r>
+        <w:t>**Pemeriksaan animasi bertentangan dengan rancangan.** Assertion "adegan benar-benar beranimasi" mula-mula</w:t>
+      </w:r>
+    </w:p>
+    <w:p>
+      <w:r>
+        <w:t xml:space="preserve">  menuntut awan SVG bergerak (`animationName === 'jelajah-awan'`). Pada skenario yang diuji guru **menempelkan</w:t>
+      </w:r>
+    </w:p>
+    <w:p>
+      <w:r>
+        <w:t xml:space="preserve">  video latar**, dan video itu memang **menggantikan** adegan SVG — jadi awan tidak ada di DOM, wajar. Sudah</w:t>
+      </w:r>
+    </w:p>
+    <w:p>
+      <w:r>
+        <w:t xml:space="preserve">  sesuai maksud permintaan ("pakai animasi/video"): assertion diubah memeriksa latar **sesuai bentuk yang</w:t>
+      </w:r>
+    </w:p>
+    <w:p>
+      <w:r>
+        <w:t xml:space="preserve">  benar-benar dirender** — video `autoplay` bila ada video, atau awan SVG beranimasi bila tidak ada — sambil</w:t>
+      </w:r>
+    </w:p>
+    <w:p>
+      <w:r>
+        <w:t xml:space="preserve">  tetap menuntut pendaki (`jelajah-langkah`) beranimasi. Animasi SVG tanpa video tetap diuji unit</w:t>
+      </w:r>
+    </w:p>
+    <w:p>
+      <w:r>
+        <w:t xml:space="preserve">  (`petaPerjalanan.test.jsx` memastikan kelas `jelajah-awan` dirender).</w:t>
+      </w:r>
+    </w:p>
+    <w:p>
+      <w:r/>
+    </w:p>
+    <w:p>
+      <w:pPr>
+        <w:pStyle w:val="Heading3"/>
+      </w:pPr>
+      <w:r>
+        <w:t>A.34.4 Keputusan teknis (satu kalimat per keputusan)</w:t>
+      </w:r>
+    </w:p>
+    <w:p>
+      <w:r/>
+    </w:p>
+    <w:p>
+      <w:pPr>
+        <w:pStyle w:val="ListBullet"/>
+      </w:pPr>
+      <w:r>
+        <w:t>**Yang disimpan hanya pilihan guru; bawaan hidup di registry** — materi lama gratis mendapat perjalanan,</w:t>
+      </w:r>
+    </w:p>
+    <w:p>
+      <w:r>
+        <w:t xml:space="preserve">  dan tidak ada baris DB yang bisa membuat nama fase/tingkat rusak.</w:t>
+      </w:r>
+    </w:p>
+    <w:p>
+      <w:pPr>
+        <w:pStyle w:val="ListBullet"/>
+      </w:pPr>
+      <w:r>
+        <w:t>**Video latar menggantikan adegan SVG, bukan ditumpuk** — dua latar yang saling menimpa lebih buruk daripada</w:t>
+      </w:r>
+    </w:p>
+    <w:p>
+      <w:r>
+        <w:t xml:space="preserve">  latar tunggal yang jelas; karenanya pengujian pun membaca bentuk latar yang sebenarnya.</w:t>
+      </w:r>
+    </w:p>
+    <w:p>
+      <w:pPr>
+        <w:pStyle w:val="ListBullet"/>
+      </w:pPr>
+      <w:r>
+        <w:t>**Kenaikan dibandingkan dari respons server, bukan dihitung di klien** — pesan "naik" tidak boleh mendahului</w:t>
+      </w:r>
+    </w:p>
+    <w:p>
+      <w:r>
+        <w:t xml:space="preserve">  keadaan tersimpan, dan murid tidak bisa "merayakan" kenaikan yang server tidak setujui.</w:t>
+      </w:r>
+    </w:p>
+    <w:p>
+      <w:pPr>
+        <w:pStyle w:val="ListBullet"/>
+      </w:pPr>
+      <w:r>
+        <w:t>**Hanya langkah wajib yang menghitung kenaikan** — langkah opsional adalah jalan pintas, bukan syarat naik.</w:t>
+      </w:r>
+    </w:p>
+    <w:p>
+      <w:pPr>
+        <w:pStyle w:val="ListBullet"/>
+      </w:pPr>
+      <w:r>
+        <w:t>**Peta selalu punya padanan teks** — informasi yang sama dibaca lewat daftar pos + ringkasan persen, bukan</w:t>
+      </w:r>
+    </w:p>
+    <w:p>
+      <w:r>
+        <w:t xml:space="preserve">  versi berbeda untuk pembaca layar.</w:t>
+      </w:r>
+    </w:p>
+    <w:p>
+      <w:r/>
+    </w:p>
+    <w:p>
+      <w:pPr>
+        <w:pStyle w:val="Heading3"/>
+      </w:pPr>
+      <w:r>
+        <w:t>A.34.5 Batasan jujur (yang belum selesai)</w:t>
+      </w:r>
+    </w:p>
+    <w:p>
+      <w:r/>
+    </w:p>
+    <w:p>
+      <w:pPr>
+        <w:pStyle w:val="ListBullet"/>
+      </w:pPr>
+      <w:r>
+        <w:t>**Katalog baru satu tema** ("Mendaki Gunung"). Bentuk katalognya sudah siap menampung banyak tema, tetapi</w:t>
+      </w:r>
+    </w:p>
+    <w:p>
+      <w:r>
+        <w:t xml:space="preserve">  tema lain (mis. "Menjelajah Laut", "Ruang Angkasa") belum dibuat; smoke hanya menguji tema bawaan.</w:t>
+      </w:r>
+    </w:p>
+    <w:p>
+      <w:pPr>
+        <w:pStyle w:val="ListBullet"/>
+      </w:pPr>
+      <w:r>
+        <w:t>**Bukti animasi dari DOM/CDP, bukan rekaman/rekaman layar**: yang dipastikan adalah `animationName`</w:t>
+      </w:r>
+    </w:p>
+    <w:p>
+      <w:r>
+        <w:t xml:space="preserve">  (`jelajah-awan`, `jelajah-langkah`), kelas yang dirender, dan latar `autoplay` — belum ada uji regresi</w:t>
+      </w:r>
+    </w:p>
+    <w:p>
+      <w:r>
+        <w:t xml:space="preserve">  visual/screenshot.</w:t>
+      </w:r>
+    </w:p>
+    <w:p>
+      <w:pPr>
+        <w:pStyle w:val="ListBullet"/>
+      </w:pPr>
+      <w:r>
+        <w:t>**Video latar hanya diuji dengan satu MP4 kecil** (2 detik, dibuat ffmpeg) di jalur berpotongan; belum</w:t>
+      </w:r>
+    </w:p>
+    <w:p>
+      <w:r>
+        <w:t xml:space="preserve">  diuji semua kodek/rasio, dan belum ada jalur "tema punya video bawaan sendiri" (video bergantung pada yang</w:t>
+      </w:r>
+    </w:p>
+    <w:p>
+      <w:r>
+        <w:t xml:space="preserve">  guru unggah).</w:t>
+      </w:r>
+    </w:p>
+    <w:p>
+      <w:pPr>
+        <w:pStyle w:val="ListBullet"/>
+      </w:pPr>
+      <w:r>
+        <w:t>**Nama pos hanya bisa diganti lewat editor guru** (per blok); belum ada pengaturan ulang nama pos massal,</w:t>
+      </w:r>
+    </w:p>
+    <w:p>
+      <w:r>
+        <w:t xml:space="preserve">  dan pos di luar 6 fase template memakai nama generik "Pos n".</w:t>
+      </w:r>
+    </w:p>
+    <w:p>
+      <w:pPr>
+        <w:pStyle w:val="ListBullet"/>
+      </w:pPr>
+      <w:r>
+        <w:t>**Smoke perjalanan tidak ikut `verify.sh`** (butuh backend + vite + Chrome hidup).</w:t>
+      </w:r>
+    </w:p>
+    <w:p>
+      <w:r/>
+    </w:p>
+    <w:p>
+      <w:pPr>
+        <w:pStyle w:val="Heading3"/>
+      </w:pPr>
+      <w:r>
+        <w:t>A.34.6 Berkas yang dibuat/diubah</w:t>
+      </w:r>
+    </w:p>
+    <w:p>
+      <w:r/>
+    </w:p>
+    <w:p>
+      <w:r>
+        <w:t>Dibuat — backend:</w:t>
+      </w:r>
+    </w:p>
+    <w:p>
+      <w:pPr>
+        <w:pStyle w:val="ListBullet"/>
+      </w:pPr>
+      <w:r>
+        <w:t>`backend/app/Sections/Material/Registry/TemaPerjalanan.php`</w:t>
+      </w:r>
+    </w:p>
+    <w:p>
+      <w:pPr>
+        <w:pStyle w:val="ListBullet"/>
+      </w:pPr>
+      <w:r>
+        <w:t>`backend/app/Sections/Material/Services/TemaMateriService.php`</w:t>
+      </w:r>
+    </w:p>
+    <w:p>
+      <w:pPr>
+        <w:pStyle w:val="ListBullet"/>
+      </w:pPr>
+      <w:r>
+        <w:t>`backend/database/migrations/2026_10_10_000002_tambah_tema_materi.php`</w:t>
+      </w:r>
+    </w:p>
+    <w:p>
+      <w:pPr>
+        <w:pStyle w:val="ListBullet"/>
+      </w:pPr>
+      <w:r>
+        <w:t>`backend/tests/Feature/Slice12TemaMateriTest.php`</w:t>
+      </w:r>
+    </w:p>
+    <w:p>
+      <w:r/>
+    </w:p>
+    <w:p>
+      <w:r>
+        <w:t>Dibuat — frontend:</w:t>
+      </w:r>
+    </w:p>
+    <w:p>
+      <w:pPr>
+        <w:pStyle w:val="ListBullet"/>
+      </w:pPr>
+      <w:r>
+        <w:t>`frontend/src/sections/material/perjalanan.js`</w:t>
+      </w:r>
+    </w:p>
+    <w:p>
+      <w:pPr>
+        <w:pStyle w:val="ListBullet"/>
+      </w:pPr>
+      <w:r>
+        <w:t>`frontend/src/sections/material/PetaPerjalanan.jsx`</w:t>
+      </w:r>
+    </w:p>
+    <w:p>
+      <w:pPr>
+        <w:pStyle w:val="ListBullet"/>
+      </w:pPr>
+      <w:r>
+        <w:t>`frontend/src/__tests__/sections/material/perjalanan.test.js`</w:t>
+      </w:r>
+    </w:p>
+    <w:p>
+      <w:pPr>
+        <w:pStyle w:val="ListBullet"/>
+      </w:pPr>
+      <w:r>
+        <w:t>`frontend/src/__tests__/sections/material/petaPerjalanan.test.jsx`</w:t>
+      </w:r>
+    </w:p>
+    <w:p>
+      <w:r/>
+    </w:p>
+    <w:p>
+      <w:r>
+        <w:t>Dibuat — dokumentasi/harness:</w:t>
+      </w:r>
+    </w:p>
+    <w:p>
+      <w:pPr>
+        <w:pStyle w:val="ListBullet"/>
+      </w:pPr>
+      <w:r>
+        <w:t>`docs/smoke-ui-perjalanan.mjs`</w:t>
+      </w:r>
+    </w:p>
+    <w:p>
+      <w:pPr>
+        <w:pStyle w:val="ListBullet"/>
+      </w:pPr>
+      <w:r>
+        <w:t>`docs/jalankan-smoke-perjalanan.sh`</w:t>
+      </w:r>
+    </w:p>
+    <w:p>
+      <w:r/>
+    </w:p>
+    <w:p>
+      <w:r>
+        <w:t>Diubah:</w:t>
+      </w:r>
+    </w:p>
+    <w:p>
+      <w:pPr>
+        <w:pStyle w:val="ListBullet"/>
+      </w:pPr>
+      <w:r>
+        <w:t>`backend/app/Sections/Material/Http/Controllers/MateriController.php` (endpoint `tema`)</w:t>
+      </w:r>
+    </w:p>
+    <w:p>
+      <w:pPr>
+        <w:pStyle w:val="ListBullet"/>
+      </w:pPr>
+      <w:r>
+        <w:t>`backend/app/Sections/Material/Http/Requests/SinkronBlokRequest.php` (`tema`, `isi.fase`)</w:t>
+      </w:r>
+    </w:p>
+    <w:p>
+      <w:pPr>
+        <w:pStyle w:val="ListBullet"/>
+      </w:pPr>
+      <w:r>
+        <w:t>`backend/app/Sections/Material/Http/Resources/BlokResource.php`, `MateriResource.php`</w:t>
+      </w:r>
+    </w:p>
+    <w:p>
+      <w:pPr>
+        <w:pStyle w:val="ListBullet"/>
+      </w:pPr>
+      <w:r>
+        <w:t>`backend/app/Sections/Material/Models/Materi.php` (kolom `tema`)</w:t>
+      </w:r>
+    </w:p>
+    <w:p>
+      <w:pPr>
+        <w:pStyle w:val="ListBullet"/>
+      </w:pPr>
+      <w:r>
+        <w:t>`backend/app/Sections/Material/Services/MateriService.php`, `ProgresMateriService.php`,</w:t>
+      </w:r>
+    </w:p>
+    <w:p>
+      <w:r>
+        <w:t xml:space="preserve">  `LaporanMateriService.php`</w:t>
+      </w:r>
+    </w:p>
+    <w:p>
+      <w:pPr>
+        <w:pStyle w:val="ListBullet"/>
+      </w:pPr>
+      <w:r>
+        <w:t>`backend/routes/api.php` (`GET /materi/tema`)</w:t>
+      </w:r>
+    </w:p>
+    <w:p>
+      <w:pPr>
+        <w:pStyle w:val="ListBullet"/>
+      </w:pPr>
+      <w:r>
+        <w:t>`frontend/src/sections/material/EditorMateri.jsx` (panel Template + pratinjau peta)</w:t>
+      </w:r>
+    </w:p>
+    <w:p>
+      <w:pPr>
+        <w:pStyle w:val="ListBullet"/>
+      </w:pPr>
+      <w:r>
+        <w:t>`frontend/src/sections/material/HalamanMateriMurid.jsx` (peta + banner kenaikan)</w:t>
+      </w:r>
+    </w:p>
+    <w:p>
+      <w:pPr>
+        <w:pStyle w:val="ListBullet"/>
+      </w:pPr>
+      <w:r>
+        <w:t>`frontend/src/sections/material/api.js` (skema + `katalogTema()` + `tema` pada `sinkronBlok()`)</w:t>
+      </w:r>
+    </w:p>
+    <w:p>
+      <w:pPr>
+        <w:pStyle w:val="ListBullet"/>
+      </w:pPr>
+      <w:r>
+        <w:t>`frontend/src/sections/material/editorMateri.js`</w:t>
+      </w:r>
+    </w:p>
+    <w:p>
+      <w:pPr>
+        <w:pStyle w:val="ListBullet"/>
+      </w:pPr>
+      <w:r>
+        <w:t>`frontend/src/theme/theme.css` (adegan perjalanan, animasi awan &amp; pendaki)</w:t>
+      </w:r>
+    </w:p>
+    <w:p>
+      <w:pPr>
+        <w:pStyle w:val="ListBullet"/>
+      </w:pPr>
+      <w:r>
+        <w:t>`frontend/src/__tests__/sections/material/api.test.js`, `editorMateri.test.js`, `pemutarMateri.test.js`</w:t>
+      </w:r>
+    </w:p>
+    <w:p>
+      <w:pPr>
+        <w:pStyle w:val="ListBullet"/>
+      </w:pPr>
+      <w:r>
+        <w:t>`docs/penjelasan-fitur.md` (bagian 6), `docs/laporan-pengujian.md` (A.34 ini), `docs/handoff-sesi.md`</w:t>
+      </w:r>
+    </w:p>
+    <w:p>
+      <w:r/>
+    </w:p>
+    <w:p>
+      <w:pPr>
+        <w:pStyle w:val="Heading2"/>
+      </w:pPr>
+      <w:r>
+        <w:t>A.35 Editor Soal: Pemilih Jenis Ringkas Berikon di Paling Bawah (11 Oktober 2026)</w:t>
+      </w:r>
+    </w:p>
+    <w:p>
+      <w:r/>
+    </w:p>
+    <w:p>
+      <w:r>
+        <w:t>Permintaan putaran ini: *"pertama buat soalnya, pilihan jenis soalnya bisa langsung tampil semua</w:t>
+      </w:r>
+    </w:p>
+    <w:p>
+      <w:r>
+        <w:t>(bulk) jadi lebih ringkas, dan pemilih jenis soal ditaruh di paling bawah sebagai kotak-kotak dengan</w:t>
+      </w:r>
+    </w:p>
+    <w:p>
+      <w:r>
+        <w:t>ikon yang mencocokkan; buat ikonnya, tetap form biasa, dan tetap bisa disimpan ke bank soal."*</w:t>
+      </w:r>
+    </w:p>
+    <w:p>
+      <w:r/>
+    </w:p>
+    <w:p>
+      <w:r>
+        <w:t>Sebelum putaran ini pemilih jenis soal adalah **kartu pertama** berisi **22 pil teks** yang membungkus</w:t>
+      </w:r>
+    </w:p>
+    <w:p>
+      <w:r>
+        <w:t>beberapa baris — memakan ruang paling atas dan tidak memberi petunjuk bentuk soal selain teks. Putaran</w:t>
+      </w:r>
+    </w:p>
+    <w:p>
+      <w:r>
+        <w:t>ini memindahkannya ke **paling bawah** sebagai **petak berikon** yang bisa dilipat, tanpa mengubah alur</w:t>
+      </w:r>
+    </w:p>
+    <w:p>
+      <w:r>
+        <w:t>form (tetap satu soal per form, tetap tersimpan ke bank soal lewat `POST/PUT /api/v1/soal`).</w:t>
+      </w:r>
+    </w:p>
+    <w:p>
+      <w:r/>
+    </w:p>
+    <w:p>
+      <w:pPr>
+        <w:pStyle w:val="Heading3"/>
+      </w:pPr>
+      <w:r>
+        <w:t>A.35.1 Yang dikerjakan</w:t>
+      </w:r>
+    </w:p>
+    <w:p>
+      <w:r/>
+    </w:p>
+    <w:p>
+      <w:pPr>
+        <w:pStyle w:val="ListBullet"/>
+      </w:pPr>
+      <w:r>
+        <w:t>**21 ikon jenis soal baru di `frontend/src/icons.jsx`** (satu per tipe; `baca_jam` sengaja memakai</w:t>
+      </w:r>
+    </w:p>
+    <w:p>
+      <w:r>
+        <w:t xml:space="preserve">  `IkonJam` yang sudah ada karena ikon jam memang cocok). Gaya tetap sama dengan ikon lain: `viewBox`</w:t>
+      </w:r>
+    </w:p>
+    <w:p>
+      <w:r>
+        <w:t xml:space="preserve">  24x24, garis 2px, warna `currentColor`. Contoh pemetaan bentuk: pilihan ganda → radio terpilih,</w:t>
+      </w:r>
+    </w:p>
+    <w:p>
+      <w:r>
+        <w:t xml:space="preserve">  benar/salah → centang + silang, isian singkat → kalimat + kotak jawaban, uraian → lembar berbaris,</w:t>
+      </w:r>
+    </w:p>
+    <w:p>
+      <w:r>
+        <w:t xml:space="preserve">  menjodohkan → dua kolom tersambung, mengurutkan → daftar + panah, letak kata → kata di celah kalimat,</w:t>
+      </w:r>
+    </w:p>
+    <w:p>
+      <w:r>
+        <w:t xml:space="preserve">  hubung kata → dua label berhubung, pilihan ganda kompleks → kotak centang, isian angka → papan angka,</w:t>
+      </w:r>
+    </w:p>
+    <w:p>
+      <w:r>
+        <w:t xml:space="preserve">  pilihan gambar → gambar + radio, urut gambar → dua gambar + panah, susun huruf → keping huruf,</w:t>
+      </w:r>
+    </w:p>
+    <w:p>
+      <w:r>
+        <w:t xml:space="preserve">  isian rumpang → kalimat berbagian kosong, klasifikasi → kotak kategori, tabel isian → tabel berpetak,</w:t>
+      </w:r>
+    </w:p>
+    <w:p>
+      <w:r>
+        <w:t xml:space="preserve">  garis bilangan → garis berpenanda, hotspot gambar → gambar + bidik sasaran, tugas unggah → berkas naik,</w:t>
+      </w:r>
+    </w:p>
+    <w:p>
+      <w:r>
+        <w:t xml:space="preserve">  teka silang mini → petak silang dengan kotak hitam.</w:t>
+      </w:r>
+    </w:p>
+    <w:p>
+      <w:pPr>
+        <w:pStyle w:val="ListBullet"/>
+      </w:pPr>
+      <w:r>
+        <w:t>**`tipeSoal.js`: `IKON_TIPE` + pembantu `ikonTipe()`**, dan `DAFTAR_TIPE` (registry yang sudah ada)</w:t>
+      </w:r>
+    </w:p>
+    <w:p>
+      <w:r>
+        <w:t xml:space="preserve">  kini ikut membawa medan `ikon`. Peta ikon hidup di registry, bukan di komponen, supaya bisa diuji</w:t>
+      </w:r>
+    </w:p>
+    <w:p>
+      <w:r>
+        <w:t xml:space="preserve">  tanpa merender seluruh editor dan supaya pemakaian berikutnya (mis. daftar bank soal) tidak</w:t>
+      </w:r>
+    </w:p>
+    <w:p>
+      <w:r>
+        <w:t xml:space="preserve">  menggandakan pemetaan.</w:t>
+      </w:r>
+    </w:p>
+    <w:p>
+      <w:pPr>
+        <w:pStyle w:val="ListBullet"/>
+      </w:pPr>
+      <w:r>
+        <w:t>**`EditorSoal.jsx` disusun ulang** menjadi tiga kartu bernomor dengan urutan baru:</w:t>
+      </w:r>
+    </w:p>
+    <w:p>
+      <w:r>
+        <w:t xml:space="preserve">  **1. Tulis soalnya → 2. Pengaturan soal → 3. Pilih jenis soal**. Kartu jenis soal di paling bawah</w:t>
+      </w:r>
+    </w:p>
+    <w:p>
+      <w:r>
+        <w:t xml:space="preserve">  memakai `&lt;details&gt;` (bisa dibuka-tutup) yang **terbuka secara bawaan**; ringkasannya selalu</w:t>
+      </w:r>
+    </w:p>
+    <w:p>
+      <w:r>
+        <w:t xml:space="preserve">  memperlihatkan **ikon + nama tipe yang sedang aktif**, jadi tipe tetap terbaca walau lipatan ditutup.</w:t>
+      </w:r>
+    </w:p>
+    <w:p>
+      <w:r>
+        <w:t xml:space="preserve">  Grid petaknya `role="radiogroup"` + tiap petak `role="radio"`/`aria-checked` — bukan `&lt;select&gt;`,</w:t>
+      </w:r>
+    </w:p>
+    <w:p>
+      <w:r>
+        <w:t xml:space="preserve">  karena semua 22 tipe tampil sekaligus (permintaan "bulk") dan tetap satu pilihan.</w:t>
+      </w:r>
+    </w:p>
+    <w:p>
+      <w:pPr>
+        <w:pStyle w:val="ListBullet"/>
+      </w:pPr>
+      <w:r>
+        <w:t>**CSS `.pemilih-jenis` + `.petak-tipe`** di `theme.css`: petak **2 kolom di HP, 4 kolom di layar</w:t>
+      </w:r>
+    </w:p>
+    <w:p>
+      <w:r>
+        <w:t xml:space="preserve">  ≥768px**, tiap petak tinggi **≥84px** (jauh di atas target sentuh 44px anak SD), tipe yang aktif</w:t>
+      </w:r>
+    </w:p>
+    <w:p>
+      <w:r>
+        <w:t xml:space="preserve">  dibalik warnanya (bukan hanya warna — ada `aria-checked`), dan tipe bertingkat diberi label kecil</w:t>
+      </w:r>
+    </w:p>
+    <w:p>
+      <w:r>
+        <w:t xml:space="preserve">  "perlu tinjau".</w:t>
+      </w:r>
+    </w:p>
+    <w:p>
+      <w:pPr>
+        <w:pStyle w:val="ListBullet"/>
+      </w:pPr>
+      <w:r>
+        <w:t>**Harness smoke disesuaikan**: `smoke-ui-susun.mjs` kini memeriksa judul kartu baru, bahwa kartu</w:t>
+      </w:r>
+    </w:p>
+    <w:p>
+      <w:r>
+        <w:t xml:space="preserve">  ke-3 adalah pemilih jenis, bahwa elemen lipatnya `DETAILS`, dan bahwa **22 petak** berperan `radio`</w:t>
+      </w:r>
+    </w:p>
+    <w:p>
+      <w:r>
+        <w:t xml:space="preserve">  **serta semuanya mengandung `&lt;svg&gt;`**; `smoke-ui-kuis-manual.mjs` memakai judul baru</w:t>
+      </w:r>
+    </w:p>
+    <w:p>
+      <w:r>
+        <w:t xml:space="preserve">  ("1. Tulis soalnya"). `smoke-ui-susun.mjs` sebelumnya masih menuntut `pil == 8` (sisa dari era 8 tipe,</w:t>
+      </w:r>
+    </w:p>
+    <w:p>
+      <w:r>
+        <w:t xml:space="preserve">  belum pernah dijalankan sesudah A.30) — pemeriksaan itu diperbarui ke jumlah 22.</w:t>
+      </w:r>
+    </w:p>
+    <w:p>
+      <w:pPr>
+        <w:pStyle w:val="ListBullet"/>
+      </w:pPr>
+      <w:r>
+        <w:t>**Tes baru `frontend/src/__tests__/sections/question/ikonTipe.test.jsx`** — memastikan setiap nilai</w:t>
+      </w:r>
+    </w:p>
+    <w:p>
+      <w:r>
+        <w:t xml:space="preserve">  `TIPE` punya ikon, tipe tak dikenal mengembalikan `undefined` (tidak melempar), dan **setiap** ikon</w:t>
+      </w:r>
+    </w:p>
+    <w:p>
+      <w:r>
+        <w:t xml:space="preserve">  benar-benar ter-render sebagai `&lt;svg&gt;` `viewBox="0 0 24 24"` berwarna `currentColor`.</w:t>
+      </w:r>
+    </w:p>
+    <w:p>
+      <w:r/>
+    </w:p>
+    <w:p>
+      <w:pPr>
+        <w:pStyle w:val="Heading3"/>
+      </w:pPr>
+      <w:r>
+        <w:t>A.35.2 Verifikasi (dijalankan, bukan klaim)</w:t>
+      </w:r>
+    </w:p>
+    <w:p>
+      <w:r/>
+    </w:p>
+    <w:p>
+      <w:r>
+        <w:t>| Perintah | Hasil |</w:t>
+      </w:r>
+    </w:p>
+    <w:p>
+      <w:r>
+        <w:t>| --- | --- |</w:t>
+      </w:r>
+    </w:p>
+    <w:p>
+      <w:r>
+        <w:t>| `npm run check` (checkJs strict) | OK (tanpa galat) |</w:t>
+      </w:r>
+    </w:p>
+    <w:p>
+      <w:r>
+        <w:t>| `npm run lint` (ESLint) | **0 error** (2 warning lama React Hook Form yang sudah ada sebelumnya) |</w:t>
+      </w:r>
+    </w:p>
+    <w:p>
+      <w:r>
+        <w:t>| `npx vitest run src/__tests__/sections/question src/__tests__/icons.test.jsx` | **141 passed (6 berkas)** — termasuk 3 tes `ikonTipe` baru |</w:t>
+      </w:r>
+    </w:p>
+    <w:p>
+      <w:r>
+        <w:t>| `./verify.sh` (root) | **SEMUA HIJAU (exit 0)** — Pest **267 passed (2443 assertions)** · Pint **340 berkas** · checkJs OK · ESLint **0 error** · Vitest **63 berkas / 604 test** · realtime 15 test |</w:t>
+      </w:r>
+    </w:p>
+    <w:p>
+      <w:r>
+        <w:t>| `docs/jalankan-smoke-ui.sh susun` (CDP; backend :8000 + vite :5173 + realtime :4000 + Chrome :9333) | **42/42 lulus, exit 0** — memuat pemeriksaan baru: kartu bernomor baru, pemilih jenis di kartu ke-3, lipatan `DETAILS`, dan petak 22 radio berikon |</w:t>
+      </w:r>
+    </w:p>
+    <w:p>
+      <w:r>
+        <w:t>| `docs/jalankan-smoke-ui.sh kuis-manual` | **10/10 lulus, exit 0** — editor soal tetap terbuka dan tersimpan dari dalam alur kuis |</w:t>
+      </w:r>
+    </w:p>
+    <w:p>
+      <w:r/>
+    </w:p>
+    <w:p>
+      <w:r>
+        <w:t>Verifikasi lewat antarmuka (bukan hanya unit): guru membuka **Bank soal → Tambah soal**, mengisi soal</w:t>
+      </w:r>
+    </w:p>
+    <w:p>
+      <w:r>
+        <w:t>isian singkat, menekan petak **Isian singkat** di kartu paling bawah, menyimpan, dan soal muncul di</w:t>
+      </w:r>
+    </w:p>
+    <w:p>
+      <w:r>
+        <w:t>daftar bank soal — persis alur yang diminta.</w:t>
+      </w:r>
+    </w:p>
+    <w:p>
+      <w:r/>
+    </w:p>
+    <w:p>
+      <w:pPr>
+        <w:pStyle w:val="Heading3"/>
+      </w:pPr>
+      <w:r>
+        <w:t>A.35.3 Temuan nyata yang ditangkap gerbang mutu (dan diperbaiki)</w:t>
+      </w:r>
+    </w:p>
+    <w:p>
+      <w:r/>
+    </w:p>
+    <w:p>
+      <w:pPr>
+        <w:pStyle w:val="ListBullet"/>
+      </w:pPr>
+      <w:r>
+        <w:t>**ESLint (React Compiler) menolak ikon dinamis di dalam render.** Cara pertama membuat ikon tipe yang</w:t>
+      </w:r>
+    </w:p>
+    <w:p>
+      <w:r>
+        <w:t xml:space="preserve">  sedang aktif adalah `const IkonJenisAktif = ikonTipe(state.tipe) ?? …` lalu `&lt;IkonJenisAktif /&gt;`.</w:t>
+      </w:r>
+    </w:p>
+    <w:p>
+      <w:r>
+        <w:t xml:space="preserve">  `eslint .` menandainya **1 error** `react-hooks/static-components`: *"Cannot create components during</w:t>
+      </w:r>
+    </w:p>
+    <w:p>
+      <w:r>
+        <w:t xml:space="preserve">  render"* — React Compiler menganggap komponen yang dipilih di dalam render sebagai komponen baru yang</w:t>
+      </w:r>
+    </w:p>
+    <w:p>
+      <w:r>
+        <w:t xml:space="preserve">  akan kehilangan state tiap render. Ketahuan lewat `./verify.sh` (bukan lewat pemeriksaan saya sendiri),</w:t>
+      </w:r>
+    </w:p>
+    <w:p>
+      <w:r>
+        <w:t xml:space="preserve">  dan memang `./verify.sh` sempat **GAGAL** sebelum diperbaiki. Perbaikan: pemilihan ikon dipindah ke</w:t>
+      </w:r>
+    </w:p>
+    <w:p>
+      <w:r>
+        <w:t xml:space="preserve">  pembantu tingkat modul `ikonJenis()` yang mengembalikan **elemen** (`createElement`), bukan komponen</w:t>
+      </w:r>
+    </w:p>
+    <w:p>
+      <w:r>
+        <w:t xml:space="preserve">  bernama besar; pemeriksaan yang sama lalu hijau. Ini temuan **di kode produk**, bukan di harness.</w:t>
+      </w:r>
+    </w:p>
+    <w:p>
+      <w:r/>
+    </w:p>
+    <w:p>
+      <w:pPr>
+        <w:pStyle w:val="Heading3"/>
+      </w:pPr>
+      <w:r>
+        <w:t>A.35.4 Keputusan teknis (satu kalimat per keputusan)</w:t>
+      </w:r>
+    </w:p>
+    <w:p>
+      <w:r/>
+    </w:p>
+    <w:p>
+      <w:pPr>
+        <w:pStyle w:val="ListBullet"/>
+      </w:pPr>
+      <w:r>
+        <w:t>Petak memakai `&lt;button role="radio"&gt;` di dalam `role="radiogroup"`, bukan `&lt;select&gt;` atau `&lt;input&gt;`,</w:t>
+      </w:r>
+    </w:p>
+    <w:p>
+      <w:r>
+        <w:t xml:space="preserve">  karena semua tipe harus terlihat sekaligus sambil tetap satu pilihan dan bisa dibaca pembaca layar.</w:t>
+      </w:r>
+    </w:p>
+    <w:p>
+      <w:pPr>
+        <w:pStyle w:val="ListBullet"/>
+      </w:pPr>
+      <w:r>
+        <w:t>Peta ikon ditaruh di registry (`tipeSoal.js`), bukan di komponen, supaya bisa diuji murni dan</w:t>
+      </w:r>
+    </w:p>
+    <w:p>
+      <w:r>
+        <w:t xml:space="preserve">  dipakai ulang tanpa impor komponen dari komponen.</w:t>
+      </w:r>
+    </w:p>
+    <w:p>
+      <w:pPr>
+        <w:pStyle w:val="ListBullet"/>
+      </w:pPr>
+      <w:r>
+        <w:t>Pemilih tetap **satu soal per form** (tidak ada bulk-create): yang "bulk" pada permintaan ini adalah</w:t>
+      </w:r>
+    </w:p>
+    <w:p>
+      <w:r>
+        <w:t xml:space="preserve">  **tampilan semua jenis sekaligus**, dan alur simpan ke bank soal tidak diubah sama sekali.</w:t>
+      </w:r>
+    </w:p>
+    <w:p>
+      <w:pPr>
+        <w:pStyle w:val="ListBullet"/>
+      </w:pPr>
+      <w:r>
+        <w:t>Lipatan diberi `open` bawaan supaya guru baru langsung melihat pilihannya; ringkasan berikon</w:t>
+      </w:r>
+    </w:p>
+    <w:p>
+      <w:r>
+        <w:t xml:space="preserve">  menjaga tipe tetap terbaca saat guru melipatnya agar formulir lebih ringkas.</w:t>
+      </w:r>
+    </w:p>
+    <w:p>
+      <w:r/>
+    </w:p>
+    <w:p>
+      <w:pPr>
+        <w:pStyle w:val="Heading3"/>
+      </w:pPr>
+      <w:r>
+        <w:t>A.35.5 Batasan jujur (yang belum selesai)</w:t>
+      </w:r>
+    </w:p>
+    <w:p>
+      <w:r/>
+    </w:p>
+    <w:p>
+      <w:pPr>
+        <w:pStyle w:val="ListBullet"/>
+      </w:pPr>
+      <w:r>
+        <w:t>Belum ada uji regresi visual/screenshot; bukti tampilan petak berasal dari DOM (`&lt;svg&gt;` + jumlah</w:t>
+      </w:r>
+    </w:p>
+    <w:p>
+      <w:r>
+        <w:t xml:space="preserve">  petak + `aria-checked`) dan pemeriksaan manual, bukan perbandingan gambar.</w:t>
+      </w:r>
+    </w:p>
+    <w:p>
+      <w:pPr>
+        <w:pStyle w:val="ListBullet"/>
+      </w:pPr>
+      <w:r>
+        <w:t>Ikon dipetakan ke **bentuk** tiap tipe secara wajar, tetapi belum diuji dengan pengguna anak SD</w:t>
+      </w:r>
+    </w:p>
+    <w:p>
+      <w:r>
+        <w:t xml:space="preserve">  (belum ada uji keterbacaan ikon).</w:t>
+      </w:r>
+    </w:p>
+    <w:p>
+      <w:pPr>
+        <w:pStyle w:val="ListBullet"/>
+      </w:pPr>
+      <w:r>
+        <w:t>`docs/desain/EditorSoal.dc.html` (papan desain lama) **tidak** diperbarui; ia tetap menggambarkan</w:t>
+      </w:r>
+    </w:p>
+    <w:p>
+      <w:r>
+        <w:t xml:space="preserve">  tata letak lama dan kini hanya menjadi arsip desain.</w:t>
+      </w:r>
+    </w:p>
+    <w:p>
+      <w:r/>
+    </w:p>
+    <w:p>
+      <w:pPr>
+        <w:pStyle w:val="Heading3"/>
+      </w:pPr>
+      <w:r>
+        <w:t>A.35.6 Berkas yang dibuat/diubah</w:t>
+      </w:r>
+    </w:p>
+    <w:p>
+      <w:r/>
+    </w:p>
+    <w:p>
+      <w:r>
+        <w:t>Dibuat:</w:t>
+      </w:r>
+    </w:p>
+    <w:p>
+      <w:pPr>
+        <w:pStyle w:val="ListBullet"/>
+      </w:pPr>
+      <w:r>
+        <w:t>`frontend/src/__tests__/sections/question/ikonTipe.test.jsx`</w:t>
+      </w:r>
+    </w:p>
+    <w:p>
+      <w:r/>
+    </w:p>
+    <w:p>
+      <w:r>
+        <w:t>Diubah:</w:t>
+      </w:r>
+    </w:p>
+    <w:p>
+      <w:pPr>
+        <w:pStyle w:val="ListBullet"/>
+      </w:pPr>
+      <w:r>
+        <w:t>`frontend/src/icons.jsx` (21 ikon jenis soal)</w:t>
+      </w:r>
+    </w:p>
+    <w:p>
+      <w:pPr>
+        <w:pStyle w:val="ListBullet"/>
+      </w:pPr>
+      <w:r>
+        <w:t>`frontend/src/sections/question/tipeSoal.js` (`IKON_TIPE`, `ikonTipe()`, medan `ikon` di `DAFTAR_TIPE`)</w:t>
+      </w:r>
+    </w:p>
+    <w:p>
+      <w:pPr>
+        <w:pStyle w:val="ListBullet"/>
+      </w:pPr>
+      <w:r>
+        <w:t>`frontend/src/sections/question/EditorSoal.jsx` (urutan kartu + pemilih petak berikon yang bisa dilipat)</w:t>
+      </w:r>
+    </w:p>
+    <w:p>
+      <w:pPr>
+        <w:pStyle w:val="ListBullet"/>
+      </w:pPr>
+      <w:r>
+        <w:t>`frontend/src/theme/theme.css` (`.pemilih-jenis`, `.petak-tipe`, dan variannya)</w:t>
+      </w:r>
+    </w:p>
+    <w:p>
+      <w:pPr>
+        <w:pStyle w:val="ListBullet"/>
+      </w:pPr>
+      <w:r>
+        <w:t>`docs/smoke-ui-susun.mjs`, `docs/smoke-ui-kuis-manual.mjs` (judul &amp; kelas baru)</w:t>
+      </w:r>
+    </w:p>
+    <w:p>
+      <w:pPr>
+        <w:pStyle w:val="ListBullet"/>
+      </w:pPr>
+      <w:r>
+        <w:t>`docs/laporan-pengujian.md` (A.35 ini), `docs/penjelasan-fitur.md`, `docs/handoff-sesi.md`</w:t>
+      </w:r>
+    </w:p>
+    <w:p>
+      <w:r/>
+    </w:p>
+    <w:p>
+      <w:pPr>
+        <w:pStyle w:val="Heading2"/>
+      </w:pPr>
+      <w:r>
+        <w:t>A.36 Editor Materi: Gagang Pangkas `|` di Kedua Sisi Klip (11 Oktober 2026)</w:t>
+      </w:r>
+    </w:p>
+    <w:p>
+      <w:r/>
+    </w:p>
+    <w:p>
+      <w:r>
+        <w:t>Permintaan putaran ini: *"buat editor-nya, yang durasi media/kuis ada tanda `|` di kedua sisi untuk</w:t>
+      </w:r>
+    </w:p>
+    <w:p>
+      <w:r>
+        <w:t>menentukan durasinya."*</w:t>
+      </w:r>
+    </w:p>
+    <w:p>
+      <w:r/>
+    </w:p>
+    <w:p>
+      <w:r>
+        <w:t>Sebelum putaran ini durasi klip hanya bisa diubah dari **inspector** (kotak angka "Durasi (detik)",</w:t>
+      </w:r>
+    </w:p>
+    <w:p>
+      <w:r>
+        <w:t>tombol −0,1/+0,1, dan geser mulai). Di timeline, klip hanya bisa dipindah lewat seret — titik</w:t>
+      </w:r>
+    </w:p>
+    <w:p>
+      <w:r>
+        <w:t>awal/akhirnya tidak bisa dipegang langsung. Putaran ini menambahkan **gagang pangkas `|`** di kedua</w:t>
+      </w:r>
+    </w:p>
+    <w:p>
+      <w:r>
+        <w:t>sisi klip yang sedang dipilih, seperti editor video pada umumnya.</w:t>
+      </w:r>
+    </w:p>
+    <w:p>
+      <w:r/>
+    </w:p>
+    <w:p>
+      <w:pPr>
+        <w:pStyle w:val="Heading3"/>
+      </w:pPr>
+      <w:r>
+        <w:t>A.36.1 Yang dikerjakan</w:t>
+      </w:r>
+    </w:p>
+    <w:p>
+      <w:r/>
+    </w:p>
+    <w:p>
+      <w:pPr>
+        <w:pStyle w:val="ListBullet"/>
+      </w:pPr>
+      <w:r>
+        <w:t>**`editorMateri.js`: `pangkasKiri()` dan `pangkasKanan()` (helper murni, bisa diuji tanpa DOM).**</w:t>
+      </w:r>
+    </w:p>
+    <w:p>
+      <w:r>
+        <w:t xml:space="preserve">  `pangkasKiri()` menggeser titik mulai dan **menjaga ujung kanan tetap** (durasi ikut berubah);</w:t>
+      </w:r>
+    </w:p>
+    <w:p>
+      <w:r>
+        <w:t xml:space="preserve">  `pangkasKanan()` menggeser ujung kanan dan menjaga titik mulai. Keduanya membulatkan ke 0,1 detik dan</w:t>
+      </w:r>
+    </w:p>
+    <w:p>
+      <w:r>
+        <w:t xml:space="preserve">  menjepit ke `DURASI_MINIMUM` (0,1 detik) serta menolak titik mulai negatif. Dibuat terpisah dari</w:t>
+      </w:r>
+    </w:p>
+    <w:p>
+      <w:r>
+        <w:t xml:space="preserve">  `setMulai()` karena keduanya berbeda: `setMulai()` **memindahkan** klip (durasi tetap), sedangkan</w:t>
+      </w:r>
+    </w:p>
+    <w:p>
+      <w:r>
+        <w:t xml:space="preserve">  `pangkasKiri()` **memangkasnya** (ujung tetap).</w:t>
+      </w:r>
+    </w:p>
+    <w:p>
+      <w:pPr>
+        <w:pStyle w:val="ListBullet"/>
+      </w:pPr>
+      <w:r>
+        <w:t>**Gagang di timeline (`EditorMateri.jsx`)**: klip terpilih mendapat satu tanda `|` di tiap sisinya,</w:t>
+      </w:r>
+    </w:p>
+    <w:p>
+      <w:r>
+        <w:t xml:space="preserve">  dibuat sebagai elemen **di dalam lane tetapi di luar tombol klip** — supaya tidak ada kontrol</w:t>
+      </w:r>
+    </w:p>
+    <w:p>
+      <w:r>
+        <w:t xml:space="preserve">  interaktif bersarang di dalam tombol, dan supaya seretan gagang tidak bertabrakan dengan seret-klip</w:t>
+      </w:r>
+    </w:p>
+    <w:p>
+      <w:r>
+        <w:t xml:space="preserve">  native (`draggable`). Grup gagang memakai `pointer-events: none`; hanya tandanya yang menerima</w:t>
+      </w:r>
+    </w:p>
+    <w:p>
+      <w:r>
+        <w:t xml:space="preserve">  pointer, jadi menekan badan klip tetap memilih/menggeser klip.</w:t>
+      </w:r>
+    </w:p>
+    <w:p>
+      <w:pPr>
+        <w:pStyle w:val="ListBullet"/>
+      </w:pPr>
+      <w:r>
+        <w:t>**Seret tetikus**: `pointerdown` + `setPointerCapture` (pola yang sama dengan jarum merah/playhead).</w:t>
+      </w:r>
+    </w:p>
+    <w:p>
+      <w:r>
+        <w:t xml:space="preserve">  Panjang timeline **dibekukan saat seret mulai** (`pangkasTotalRef`) supaya penggaris tidak memanjang</w:t>
+      </w:r>
+    </w:p>
+    <w:p>
+      <w:r>
+        <w:t xml:space="preserve">  dan menarik gagangnya menjauh dari tangan saat ujung kanan digeser ke luar.</w:t>
+      </w:r>
+    </w:p>
+    <w:p>
+      <w:pPr>
+        <w:pStyle w:val="ListBullet"/>
+      </w:pPr>
+      <w:r>
+        <w:t>**Papan tombol**: kedua gagang `role="slider"`, `tabIndex=0`, `aria-valuemin/max/now/valuetext`, dan</w:t>
+      </w:r>
+    </w:p>
+    <w:p>
+      <w:r>
+        <w:t xml:space="preserve">  bisa dipangkas dengan **panah kiri/kanan** per 0,1 detik — jadi tidak wajib memakai tetikus.</w:t>
+      </w:r>
+    </w:p>
+    <w:p>
+      <w:pPr>
+        <w:pStyle w:val="ListBullet"/>
+      </w:pPr>
+      <w:r>
+        <w:t>**CSS `.nle-pangkas*`**: tanda `|` setinggi klip (3px, warna aksen), kursor `ew-resize`, area seret</w:t>
+      </w:r>
+    </w:p>
+    <w:p>
+      <w:r>
+        <w:t xml:space="preserve">  0,9rem, dan cincin fokus yang terlihat. Berlaku untuk **semua** tipe klip — media dan kuis sisipan</w:t>
+      </w:r>
+    </w:p>
+    <w:p>
+      <w:r>
+        <w:t xml:space="preserve">  termasuk, karena keduanya memakai `mulai_detik`/`durasi_detik` yang sama.</w:t>
+      </w:r>
+    </w:p>
+    <w:p>
+      <w:pPr>
+        <w:pStyle w:val="ListBullet"/>
+      </w:pPr>
+      <w:r>
+        <w:t>**6 tes baru** di `__tests__/sections/material/editorMateri.test.js`: ujung tetap saat pangkas kiri,</w:t>
+      </w:r>
+    </w:p>
+    <w:p>
+      <w:r>
+        <w:t xml:space="preserve">  penjepitan minimum, penolakan titik mulai negatif, ujung tetap saat pangkas kanan, dan indeks tak</w:t>
+      </w:r>
+    </w:p>
+    <w:p>
+      <w:r>
+        <w:t xml:space="preserve">  dikenal yang tidak mengubah apa pun.</w:t>
+      </w:r>
+    </w:p>
+    <w:p>
+      <w:pPr>
+        <w:pStyle w:val="ListBullet"/>
+      </w:pPr>
+      <w:r>
+        <w:t>**Harness `docs/smoke-ui-durasi-klip.mjs` diperluas** (11 pemeriksaan, dari 4) — lihat A.36.3.</w:t>
+      </w:r>
+    </w:p>
+    <w:p>
+      <w:r>
+        <w:t xml:space="preserve">  Putaran lanjutan menambah 4 pemeriksaan lagi (total **15**) supaya klip **kuis** dan klip **media**</w:t>
+      </w:r>
+    </w:p>
+    <w:p>
+      <w:r>
+        <w:t xml:space="preserve">  diuji sendiri-sendiri — lihat A.36.7.</w:t>
+      </w:r>
+    </w:p>
+    <w:p>
+      <w:r/>
+    </w:p>
+    <w:p>
+      <w:pPr>
+        <w:pStyle w:val="Heading3"/>
+      </w:pPr>
+      <w:r>
+        <w:t>A.36.2 Verifikasi (dijalankan, bukan klaim)</w:t>
+      </w:r>
+    </w:p>
+    <w:p>
+      <w:r/>
+    </w:p>
+    <w:p>
+      <w:r>
+        <w:t>| Perintah | Hasil |</w:t>
+      </w:r>
+    </w:p>
+    <w:p>
+      <w:r>
+        <w:t>| --- | --- |</w:t>
+      </w:r>
+    </w:p>
+    <w:p>
+      <w:r>
+        <w:t>| `npx vitest run src/__tests__/sections/material` | **95 passed (6 berkas)** — termasuk 6 tes pangkas baru |</w:t>
+      </w:r>
+    </w:p>
+    <w:p>
+      <w:r>
+        <w:t>| `./verify.sh` (root) | **SEMUA HIJAU (exit 0)** — Pest **267 passed (2443 assertions)** · Pint **340 berkas** · checkJs OK · ESLint **0 error** · Vitest **63 berkas / 610 test** · realtime 15 test |</w:t>
+      </w:r>
+    </w:p>
+    <w:p>
+      <w:r>
+        <w:t>| `docs/jalankan-smoke-ui.sh durasi-klip` (CDP; backend :8000 + vite :5173 + realtime :4000 + Chrome :9333) | **11/11 lulus, exit 0** (putaran A.36) |</w:t>
+      </w:r>
+    </w:p>
+    <w:p>
+      <w:r>
+        <w:t>| `node docs/smoke-ui-durasi-klip.mjs` (ulang 11 Okt 2026, putaran lanjutan — harness diperluas) | **15/15 lulus, exit 0** — termasuk klip **kuis** (materi #20) dan klip **media** (materi #1) |</w:t>
+      </w:r>
+    </w:p>
+    <w:p>
+      <w:r/>
+    </w:p>
+    <w:p>
+      <w:r>
+        <w:t>Isi pemeriksaan baru di harness (dijalankan lewat **tetikus CDP sungguhan** dan papan tombol, bukan</w:t>
+      </w:r>
+    </w:p>
+    <w:p>
+      <w:r>
+        <w:t>memanggil fungsi internal):</w:t>
+      </w:r>
+    </w:p>
+    <w:p>
+      <w:r/>
+    </w:p>
+    <w:p>
+      <w:r>
+        <w:t>1. klip terpilih punya **dua** tanda `|`, sebaris dengan klipnya;</w:t>
+      </w:r>
+    </w:p>
+    <w:p>
+      <w:r>
+        <w:t>2. keduanya berperan `slider` dan berkursor `ew-resize`;</w:t>
+      </w:r>
+    </w:p>
+    <w:p>
+      <w:r>
+        <w:t>3. titiknya **benar-benar terjangkau tetikus** (`document.elementFromPoint` = tanda `|`) — penjaga</w:t>
+      </w:r>
+    </w:p>
+    <w:p>
+      <w:r>
+        <w:t xml:space="preserve">   supaya seretan di bawah menguji hal yang benar;</w:t>
+      </w:r>
+    </w:p>
+    <w:p>
+      <w:r>
+        <w:t>4. seret tanda kanan ke kiri: durasi 29,9 → 22,8 detik, **titik mulai tetap 0**;</w:t>
+      </w:r>
+    </w:p>
+    <w:p>
+      <w:r>
+        <w:t>5. seret tanda kiri ke kanan: titik mulai 0 → 5 detik, **ujung kanan tetap 22,8 detik**;</w:t>
+      </w:r>
+    </w:p>
+    <w:p>
+      <w:r>
+        <w:t>6. panah kiri di papan tombol memangkas 17,8 → 17,7 detik.</w:t>
+      </w:r>
+    </w:p>
+    <w:p>
+      <w:r/>
+    </w:p>
+    <w:p>
+      <w:pPr>
+        <w:pStyle w:val="Heading3"/>
+      </w:pPr>
+      <w:r>
+        <w:t>A.36.3 Temuan nyata saat verifikasi (dan apa yang salah)</w:t>
+      </w:r>
+    </w:p>
+    <w:p>
+      <w:r/>
+    </w:p>
+    <w:p>
+      <w:pPr>
+        <w:pStyle w:val="ListBullet"/>
+      </w:pPr>
+      <w:r>
+        <w:t>**Seret tetikus mula-mula "gagal" — ternyata harness-nya yang salah, bukan produk.** Tiga pemeriksaan</w:t>
+      </w:r>
+    </w:p>
+    <w:p>
+      <w:r>
+        <w:t xml:space="preserve">  pertama lulus, tetapi dua seretan tidak mengubah apa pun (`mulai 0→0 · durasi 29,9→29,9`). Saya</w:t>
+      </w:r>
+    </w:p>
+    <w:p>
+      <w:r>
+        <w:t xml:space="preserve">  diagnosis dulu alih-alih mengubah kode: (a) mengetes di halaman kosong membuktikan</w:t>
+      </w:r>
+    </w:p>
+    <w:p>
+      <w:r>
+        <w:t xml:space="preserve">  `Input.dispatchMouseEvent` **memang** menghasilkan `pointerdown/move/up`; (b) instrumentasi di halaman</w:t>
+      </w:r>
+    </w:p>
+    <w:p>
+      <w:r>
+        <w:t xml:space="preserve">  editor menunjukkan peristiwanya mendarat di `html/body` dengan `elementFromPoint` = `null`. Penyebabnya</w:t>
+      </w:r>
+    </w:p>
+    <w:p>
+      <w:r>
+        <w:t xml:space="preserve">  **timeline berada di y≈1852 px**, jauh di luar viewport headless 800x600 — event CDP memakai koordinat</w:t>
+      </w:r>
+    </w:p>
+    <w:p>
+      <w:r>
+        <w:t xml:space="preserve">  viewport, jadi tetikus "menekan" ruang kosong. Perbaikan: viewport ditinggikan</w:t>
+      </w:r>
+    </w:p>
+    <w:p>
+      <w:r>
+        <w:t xml:space="preserve">  (`Emulation.setDeviceMetricsOverride`, 1280x2200) sebelum menyeret, plus pemeriksaan penjaga</w:t>
+      </w:r>
+    </w:p>
+    <w:p>
+      <w:r>
+        <w:t xml:space="preserve">  keterjangkauan di atas. Sesudah itu seretan mengubah durasi seperti seharusnya (30 → 22,9 detik) dan</w:t>
+      </w:r>
+    </w:p>
+    <w:p>
+      <w:r>
+        <w:t xml:space="preserve">  harness menjadi 11/11. **Kode produk tidak diubah untuk ini.**</w:t>
+      </w:r>
+    </w:p>
+    <w:p>
+      <w:pPr>
+        <w:pStyle w:val="ListBullet"/>
+      </w:pPr>
+      <w:r>
+        <w:t>**Pelajaran yang dicatat**: harness baru yang memakai input sungguhan harus memastikan elemennya</w:t>
+      </w:r>
+    </w:p>
+    <w:p>
+      <w:r>
+        <w:t xml:space="preserve">  berada di dalam viewport; kegagalan seperti ini tidak boleh diperbaiki dengan melonggarkan assertion.</w:t>
+      </w:r>
+    </w:p>
+    <w:p>
+      <w:r/>
+    </w:p>
+    <w:p>
+      <w:pPr>
+        <w:pStyle w:val="Heading3"/>
+      </w:pPr>
+      <w:r>
+        <w:t>A.36.4 Keputusan teknis (satu kalimat per keputusan)</w:t>
+      </w:r>
+    </w:p>
+    <w:p>
+      <w:r/>
+    </w:p>
+    <w:p>
+      <w:pPr>
+        <w:pStyle w:val="ListBullet"/>
+      </w:pPr>
+      <w:r>
+        <w:t>Gagang ditaruh di lane (sibling tombol klip), bukan di dalam tombol, karena kontrol interaktif</w:t>
+      </w:r>
+    </w:p>
+    <w:p>
+      <w:r>
+        <w:t xml:space="preserve">  bersarang di dalam `&lt;button&gt;` menyulitkan pembaca layar dan bertabrakan dengan `draggable`.</w:t>
+      </w:r>
+    </w:p>
+    <w:p>
+      <w:pPr>
+        <w:pStyle w:val="ListBullet"/>
+      </w:pPr>
+      <w:r>
+        <w:t>Panjang timeline dibekukan selama seret supaya memangkas tidak "mengejar" penggaris yang ikut memanjang.</w:t>
+      </w:r>
+    </w:p>
+    <w:p>
+      <w:pPr>
+        <w:pStyle w:val="ListBullet"/>
+      </w:pPr>
+      <w:r>
+        <w:t xml:space="preserve"> `pangkasKiri/pangkasKanan` masuk `editorMateri.js` (helper murni) supaya aturannya diuji tanpa DOM</w:t>
+      </w:r>
+    </w:p>
+    <w:p>
+      <w:r>
+        <w:t xml:space="preserve">  dan bisa dipakai lagi oleh pemutar/alat lain.</w:t>
+      </w:r>
+    </w:p>
+    <w:p>
+      <w:pPr>
+        <w:pStyle w:val="ListBullet"/>
+      </w:pPr>
+      <w:r>
+        <w:t>Gagang hanya tampil pada klip yang sedang dipilih — timeline tetap ringkas saat materi punya banyak klip.</w:t>
+      </w:r>
+    </w:p>
+    <w:p>
+      <w:r/>
+    </w:p>
+    <w:p>
+      <w:pPr>
+        <w:pStyle w:val="Heading3"/>
+      </w:pPr>
+      <w:r>
+        <w:t>A.36.5 Batasan jujur (yang belum selesai)</w:t>
+      </w:r>
+    </w:p>
+    <w:p>
+      <w:r/>
+    </w:p>
+    <w:p>
+      <w:pPr>
+        <w:pStyle w:val="ListBullet"/>
+      </w:pPr>
+      <w:r>
+        <w:t>Area seret gagang 0,9rem (≈14 px) — **lebih kecil dari 44 px**; ini melekat pada kepadatan timeline</w:t>
+      </w:r>
+    </w:p>
+    <w:p>
+      <w:r>
+        <w:t xml:space="preserve">  (klip bisa sangat pendek), jadi jalur ini tidak ikut aturan sasaran-sentuh-44px. Karena itu papan</w:t>
+      </w:r>
+    </w:p>
+    <w:p>
+      <w:r>
+        <w:t xml:space="preserve">  tombol disediakan sebagai jalur alternatif, dan inspector (kotak angka + tombol ±0,1) tetap ada.</w:t>
+      </w:r>
+    </w:p>
+    <w:p>
+      <w:pPr>
+        <w:pStyle w:val="ListBullet"/>
+      </w:pPr>
+      <w:r>
+        <w:t>Belum ada uji regresi visual/screenshot untuk posisi tanda `|`.</w:t>
+      </w:r>
+    </w:p>
+    <w:p>
+      <w:pPr>
+        <w:pStyle w:val="ListBullet"/>
+      </w:pPr>
+      <w:r>
+        <w:t>Gagang tidak "magnet" ke tepi klip lain (tidak ada snapping).</w:t>
+      </w:r>
+    </w:p>
+    <w:p>
+      <w:r/>
+    </w:p>
+    <w:p>
+      <w:pPr>
+        <w:pStyle w:val="Heading3"/>
+      </w:pPr>
+      <w:r>
+        <w:t>A.36.6 Berkas yang dibuat/diubah</w:t>
+      </w:r>
+    </w:p>
+    <w:p>
+      <w:r/>
+    </w:p>
+    <w:p>
+      <w:r>
+        <w:t>Diubah:</w:t>
+      </w:r>
+    </w:p>
+    <w:p>
+      <w:pPr>
+        <w:pStyle w:val="ListBullet"/>
+      </w:pPr>
+      <w:r>
+        <w:t>`frontend/src/sections/material/editorMateri.js` (`pangkasKiri`, `pangkasKanan`)</w:t>
+      </w:r>
+    </w:p>
+    <w:p>
+      <w:pPr>
+        <w:pStyle w:val="ListBullet"/>
+      </w:pPr>
+      <w:r>
+        <w:t>`frontend/src/sections/material/EditorMateri.jsx` (gagang pangkas, seret, papan tombol)</w:t>
+      </w:r>
+    </w:p>
+    <w:p>
+      <w:pPr>
+        <w:pStyle w:val="ListBullet"/>
+      </w:pPr>
+      <w:r>
+        <w:t>`frontend/src/theme/theme.css` (`.nle-pangkas-grup`, `.nle-pangkas`, `.nle-pangkas-kiri/kanan`)</w:t>
+      </w:r>
+    </w:p>
+    <w:p>
+      <w:pPr>
+        <w:pStyle w:val="ListBullet"/>
+      </w:pPr>
+      <w:r>
+        <w:t>`frontend/src/__tests__/sections/material/editorMateri.test.js` (6 tes pangkas)</w:t>
+      </w:r>
+    </w:p>
+    <w:p>
+      <w:pPr>
+        <w:pStyle w:val="ListBullet"/>
+      </w:pPr>
+      <w:r>
+        <w:t>`docs/smoke-ui-durasi-klip.mjs` (7 pemeriksaan gagang baru; putaran lanjutan menambah 4 lagi)</w:t>
+      </w:r>
+    </w:p>
+    <w:p>
+      <w:pPr>
+        <w:pStyle w:val="ListBullet"/>
+      </w:pPr>
+      <w:r>
+        <w:t>`docs/laporan-pengujian.md` (A.36 ini), `docs/handoff-sesi.md`</w:t>
+      </w:r>
+    </w:p>
+    <w:p>
+      <w:r/>
+    </w:p>
+    <w:p>
+      <w:pPr>
+        <w:pStyle w:val="Heading3"/>
+      </w:pPr>
+      <w:r>
+        <w:t>A.36.7 Putaran lanjutan (11 Oktober 2026): tanda `|` dipastikan berlaku untuk klip kuis &amp; media</w:t>
+      </w:r>
+    </w:p>
+    <w:p>
+      <w:r/>
+    </w:p>
+    <w:p>
+      <w:r>
+        <w:t>Permintaan itu datang lagi dengan kata yang hampir sama — *"buat bagian sebuah quiz/media ada `|` di kedua</w:t>
+      </w:r>
+    </w:p>
+    <w:p>
+      <w:r>
+        <w:t>sisinya untuk mengatur durasi daripada ketik manual"* — jadi yang pertama dikerjakan bukan menambah kode,</w:t>
+      </w:r>
+    </w:p>
+    <w:p>
+      <w:r>
+        <w:t>melainkan **memeriksa apakah permintaannya sudah terpenuhi** oleh A.36.</w:t>
+      </w:r>
+    </w:p>
+    <w:p>
+      <w:r/>
+    </w:p>
+    <w:p>
+      <w:r>
+        <w:t>**Hasil pemeriksaan: sudah terpenuhi, tidak ada kode produk yang diubah.** Gagang `|` di render timeline</w:t>
+      </w:r>
+    </w:p>
+    <w:p>
+      <w:r>
+        <w:t>memang generik (`klipAktif &amp;&amp; satu.track === klipAktif.track`), jadi berlaku untuk ketiga tipe klip — teks,</w:t>
+      </w:r>
+    </w:p>
+    <w:p>
+      <w:r>
+        <w:t>media, maupun kuis sisipan — dan `durasi_detik` kuis juga tersimpan server (`isi.durasi_detik`, dijaga</w:t>
+      </w:r>
+    </w:p>
+    <w:p>
+      <w:r>
+        <w:t>`SinkronBlokRequest` dan dibaca `BlokResource`/`ProgresMateriService`). Yang belum ada hanyalah **bukti di</w:t>
+      </w:r>
+    </w:p>
+    <w:p>
+      <w:r>
+        <w:t>harness**: bagian 3 harness lama hanya memangkas klip yang kebetulan terpilih (materi pertama yang punya</w:t>
+      </w:r>
+    </w:p>
+    <w:p>
+      <w:r>
+        <w:t>blok, kebetulan klip teks), sehingga tipe `kuis` dan `media` belum pernah benar-benar diuji lewat tetikus.</w:t>
+      </w:r>
+    </w:p>
+    <w:p>
+      <w:r/>
+    </w:p>
+    <w:p>
+      <w:r>
+        <w:t>Yang ditambahkan: **bagian 4 di `docs/smoke-ui-durasi-klip.mjs`**. Materi dicari dari API berdasarkan tipe</w:t>
+      </w:r>
+    </w:p>
+    <w:p>
+      <w:r>
+        <w:t>bloknya (`/v1/materi` + detail tiap materi), lalu untuk tiap tipe (`kuis`, `media`) klip itu diklik,</w:t>
+      </w:r>
+    </w:p>
+    <w:p>
+      <w:r>
+        <w:t>dipastikan punya **dua** tanda `|` sebaris dengan klipnya, dicek pula keterjangkauan tetikusnya, lalu tanda</w:t>
+      </w:r>
+    </w:p>
+    <w:p>
+      <w:r>
+        <w:t>kanan diseret 40 px dan durasinya harus memendek tanpa memindahkan titik mulai. Bukti keluaran run</w:t>
+      </w:r>
+    </w:p>
+    <w:p>
+      <w:r>
+        <w:t>(`node docs/smoke-ui-durasi-klip.mjs`, exit 0):</w:t>
+      </w:r>
+    </w:p>
+    <w:p>
+      <w:r/>
+    </w:p>
+    <w:p>
+      <w:r>
+        <w:t>LULUS · klip kuis terpilih punya tanda | di kedua sisinya · materi #20 · aktif=true tanda=2 sebaris=true</w:t>
+      </w:r>
+    </w:p>
+    <w:p>
+      <w:r>
+        <w:t>LULUS · seret tanda | kanan klip kuis memendekkan durasi tanpa memindahkan titik mulai · materi #20 · mulai 30→30 · durasi 60→53.6</w:t>
+      </w:r>
+    </w:p>
+    <w:p>
+      <w:r>
+        <w:t>LULUS · klip media terpilih punya tanda | di kedua sisinya · materi #1 · aktif=true tanda=2 sebaris=true</w:t>
+      </w:r>
+    </w:p>
+    <w:p>
+      <w:r>
+        <w:t>LULUS · seret tanda | kanan klip media memendekkan durasi tanpa memindahkan titik mulai · materi #1 · mulai 0→0 · durasi 10→9.3</w:t>
+      </w:r>
+    </w:p>
+    <w:p>
+      <w:r/>
+    </w:p>
+    <w:p>
+      <w:r>
+        <w:t>15/15 pemeriksaan lulus.</w:t>
+      </w:r>
+    </w:p>
+    <w:p>
+      <w:r/>
+    </w:p>
+    <w:p>
+      <w:r>
+        <w:t>Batasan putaran lanjutan: pemeriksaan ini bergantung pada **data dev** yang kebetulan punya materi berisi</w:t>
+      </w:r>
+    </w:p>
+    <w:p>
+      <w:r>
+        <w:t>klip `kuis` (#20) dan `media` (#1); pada basis data kosong, dua pemeriksaan itu akan gagal dengan pesan</w:t>
+      </w:r>
+    </w:p>
+    <w:p>
+      <w:r>
+        <w:t>"tidak ada materi yang punya klip tipe itu" — harness-nya belum membuat sendiri materi + berkas media uji</w:t>
+      </w:r>
+    </w:p>
+    <w:p>
+      <w:r>
+        <w:t>(seperti yang dilakukan `smoke-ui-perjalanan.mjs`). Tidak ada penyimpanan yang dilakukan, jadi susunan</w:t>
+      </w:r>
+    </w:p>
+    <w:p>
+      <w:r>
+        <w:t>materi tidak berubah.</w:t>
+      </w:r>
+    </w:p>
+    <w:p>
+      <w:r/>
+    </w:p>
+    <w:p>
+      <w:pPr>
+        <w:pStyle w:val="Heading2"/>
+      </w:pPr>
+      <w:r>
+        <w:t>A.37 Peta Perjalanan Pakai Media Sungguhan, Template Jadi Opsional (11 Oktober 2026)</w:t>
+      </w:r>
+    </w:p>
+    <w:p>
+      <w:r/>
+    </w:p>
+    <w:p>
+      <w:r>
+        <w:t>Permintaan putaran ini: *"dan tidak wajib memakai template, dan juga perbaiki template-nya, dan kau pakai</w:t>
+      </w:r>
+    </w:p>
+    <w:p>
+      <w:r>
+        <w:t>video/foto saja karena kurang menarik."*</w:t>
+      </w:r>
+    </w:p>
+    <w:p>
+      <w:r/>
+    </w:p>
+    <w:p>
+      <w:r>
+        <w:t>Peta perjalanan A.34 sebelumnya menggambar adegannya sendiri lewat SVG: langit, matahari berdenyut, dua</w:t>
+      </w:r>
+    </w:p>
+    <w:p>
+      <w:r>
+        <w:t>awan berjalan, tiga lapis gunung (`AdeganGunung`), dan hanya **menumpuk** foto tema di bawahnya. Hasilnya</w:t>
+      </w:r>
+    </w:p>
+    <w:p>
+      <w:r>
+        <w:t>terasa seperti ilustrasi alih-alih panggung yang hidup. Putaran ini membuang gambar buatan itu: panggung</w:t>
+      </w:r>
+    </w:p>
+    <w:p>
+      <w:r>
+        <w:t>selalu memakai **media sungguhan** — video latar guru bila ada, kalau tidak **foto tema** — dan template</w:t>
+      </w:r>
+    </w:p>
+    <w:p>
+      <w:r>
+        <w:t>tema ditegaskan **opsional** di editor.</w:t>
+      </w:r>
+    </w:p>
+    <w:p>
+      <w:r/>
+    </w:p>
+    <w:p>
+      <w:pPr>
+        <w:pStyle w:val="Heading3"/>
+      </w:pPr>
+      <w:r>
+        <w:t>A.37.1 Yang dikerjakan</w:t>
+      </w:r>
+    </w:p>
+    <w:p>
+      <w:r/>
+    </w:p>
+    <w:p>
+      <w:pPr>
+        <w:pStyle w:val="ListBullet"/>
+      </w:pPr>
+      <w:r>
+        <w:t>**`PetaPerjalanan.jsx`: `AdeganGunung` dihapus.** Tidak ada lagi adegan SVG, `data-lapisan`, matahari,</w:t>
+      </w:r>
+    </w:p>
+    <w:p>
+      <w:r>
+        <w:t xml:space="preserve">  awan, maupun poligon bukit. Urutan latar jadi **video → foto tema → gradien**: `data-latar="video"` bila</w:t>
+      </w:r>
+    </w:p>
+    <w:p>
+      <w:r>
+        <w:t xml:space="preserve">  guru menempelkan video, `data-latar="foto"` bila tema punya foto (`fotoAdegan()`), dan</w:t>
+      </w:r>
+    </w:p>
+    <w:p>
+      <w:r>
+        <w:t xml:space="preserve">  `data-latar="gradien"` bila keduanya tidak ada atau fotonya gagal dimuat (`onError`). Panggung tidak</w:t>
+      </w:r>
+    </w:p>
+    <w:p>
+      <w:r>
+        <w:t xml:space="preserve">  pernah kosong, tetapi juga tidak pernah memakai gambar buatan.</w:t>
+      </w:r>
+    </w:p>
+    <w:p>
+      <w:pPr>
+        <w:pStyle w:val="ListBullet"/>
+      </w:pPr>
+      <w:r>
+        <w:t>**`theme.css`: gaya adegan SVG dibuang.** `.jelajah-adegan`, `.jelajah-matahari`, `.jelajah-awan*`,</w:t>
+      </w:r>
+    </w:p>
+    <w:p>
+      <w:r>
+        <w:t xml:space="preserve">  `.jelajah-bukit*`, `.jelajah-salju`, serta `@keyframes jelajah-awan`/`jelajah-denyut` hilang. Gradien</w:t>
+      </w:r>
+    </w:p>
+    <w:p>
+      <w:r>
+        <w:t xml:space="preserve">  cadangan diperbaiki jadi bujur-sangkar tenang (matahari `radial-gradient` + `linear-gradient` biru-hijau)</w:t>
+      </w:r>
+    </w:p>
+    <w:p>
+      <w:r>
+        <w:t xml:space="preserve">  yang tetap kontras dengan jalur putih dan titik pos. Lapisan gelap di atas media kini berlaku untuk</w:t>
+      </w:r>
+    </w:p>
+    <w:p>
+      <w:r>
+        <w:t xml:space="preserve">  **foto dan video** (`[data-latar='foto']`, `[data-latar='video']`), ditambah vignette radial, supaya</w:t>
+      </w:r>
+    </w:p>
+    <w:p>
+      <w:r>
+        <w:t xml:space="preserve">  titik pos dan penanda tetap terbaca di bagian media yang terang. Gerak zoom foto (`jelajah-zoom`) dan</w:t>
+      </w:r>
+    </w:p>
+    <w:p>
+      <w:r>
+        <w:t xml:space="preserve">  gerak penanda pos (`jelajah-langkah`) dipertahankan.</w:t>
+      </w:r>
+    </w:p>
+    <w:p>
+      <w:pPr>
+        <w:pStyle w:val="ListBullet"/>
+      </w:pPr>
+      <w:r>
+        <w:t>**Editor menegaskan template opsional**: di bawah judul "Template tema" ada keterangan bahwa tema</w:t>
+      </w:r>
+    </w:p>
+    <w:p>
+      <w:r>
+        <w:t xml:space="preserve">  bersifat opsional dan "Tanpa tema" menghasilkan daftar bagian biasa (tanpa perubahan alur simpan).</w:t>
+      </w:r>
+    </w:p>
+    <w:p>
+      <w:pPr>
+        <w:pStyle w:val="ListBullet"/>
+      </w:pPr>
+      <w:r>
+        <w:t>**Tes &amp; harness dibaca ulang** mengikuti bentuk latar yang benar-benar dirender: tes peta sekarang</w:t>
+      </w:r>
+    </w:p>
+    <w:p>
+      <w:r>
+        <w:t xml:space="preserve">  memastikan **tidak ada** kelas `jelajah-adegan`/`jelajah-matahari`/`jelajah-awan`/`jelajah-bukit`, dan</w:t>
+      </w:r>
+    </w:p>
+    <w:p>
+      <w:r>
+        <w:t xml:space="preserve">  latar tanpa foto memakai `data-latar="gradien"`.</w:t>
+      </w:r>
+    </w:p>
+    <w:p>
+      <w:r/>
+    </w:p>
+    <w:p>
+      <w:pPr>
+        <w:pStyle w:val="Heading3"/>
+      </w:pPr>
+      <w:r>
+        <w:t>A.37.2 Temuan nyata (dan apa yang diperbaiki)</w:t>
+      </w:r>
+    </w:p>
+    <w:p>
+      <w:r/>
+    </w:p>
+    <w:p>
+      <w:pPr>
+        <w:pStyle w:val="ListBullet"/>
+      </w:pPr>
+      <w:r>
+        <w:t>**Harness `smoke-ui-perjalanan.mjs` belum pernah menuntaskan paruh keduanya.** Materi kedua ("tanpa</w:t>
+      </w:r>
+    </w:p>
+    <w:p>
+      <w:r>
+        <w:t xml:space="preserve">  peta") dibuat **setelah** alur murid tanpa masuk ulang sebagai guru, jadi `POST /v1/materi` dijalankan</w:t>
+      </w:r>
+    </w:p>
+    <w:p>
+      <w:r>
+        <w:t xml:space="preserve">  dengan sesi **murid** dan ditolak — `idRingkas` = 0 dan 12 pemeriksaan sesudahnya runtuh. Diperbaiki dengan</w:t>
+      </w:r>
+    </w:p>
+    <w:p>
+      <w:r>
+        <w:t xml:space="preserve">  `keluar()` + `masuk(AKUN_GURU)` sebelum bagian 8, mengikuti pola yang sudah dipakai bagian 9/10 (bug</w:t>
+      </w:r>
+    </w:p>
+    <w:p>
+      <w:r>
+        <w:t xml:space="preserve">  **harness**, bukan produk).</w:t>
+      </w:r>
+    </w:p>
+    <w:p>
+      <w:pPr>
+        <w:pStyle w:val="ListBullet"/>
+      </w:pPr>
+      <w:r>
+        <w:t>**Proses Node harness tidak pernah keluar.** WebSocket CDP dibiarkan terbuka, jadi `node` hidup terus,</w:t>
+      </w:r>
+    </w:p>
+    <w:p>
+      <w:r>
+        <w:t xml:space="preserve">  runner menggantung, dan `hasil smoke` tidak pernah tercetak — artinya kode keluar harness tidak pernah</w:t>
+      </w:r>
+    </w:p>
+    <w:p>
+      <w:r>
+        <w:t xml:space="preserve">  terbaca. Diperbaiki dengan `ws.close()` di akhir `main()` plus `.finally()` yang keluar paksa sesudah</w:t>
+      </w:r>
+    </w:p>
+    <w:p>
+      <w:r>
+        <w:t xml:space="preserve">  jeda singkat bila `main()` berhenti karena galat.</w:t>
+      </w:r>
+    </w:p>
+    <w:p>
+      <w:r/>
+    </w:p>
+    <w:p>
+      <w:pPr>
+        <w:pStyle w:val="Heading3"/>
+      </w:pPr>
+      <w:r>
+        <w:t>A.37.3 Verifikasi (dijalankan, bukan klaim)</w:t>
+      </w:r>
+    </w:p>
+    <w:p>
+      <w:r/>
+    </w:p>
+    <w:p>
+      <w:r>
+        <w:t>| Perintah | Hasil |</w:t>
+      </w:r>
+    </w:p>
+    <w:p>
+      <w:r>
+        <w:t>| --- | --- |</w:t>
+      </w:r>
+    </w:p>
+    <w:p>
+      <w:r>
+        <w:t>| `npx vitest run src/__tests__/sections/material` | **104 passed (6 berkas)** |</w:t>
+      </w:r>
+    </w:p>
+    <w:p>
+      <w:r>
+        <w:t>| `npx eslint` (PetaPerjalanan, EditorMateri, petaPerjalanan.test) | **0 error** |</w:t>
+      </w:r>
+    </w:p>
+    <w:p>
+      <w:r>
+        <w:t>| `./verify.sh` (root) | **SEMUA HIJAU (exit 0)** — Pest · Pint · checkJs · ESLint · Vitest · realtime |</w:t>
+      </w:r>
+    </w:p>
+    <w:p>
+      <w:r>
+        <w:t>| `docs/jalankan-smoke-perjalanan.sh` (backend :8000 + vite :5173 + Chrome :9333) | **51/51 lulus, exit 0** |</w:t>
+      </w:r>
+    </w:p>
+    <w:p>
+      <w:r/>
+    </w:p>
+    <w:p>
+      <w:r>
+        <w:t>Pemeriksaan baru yang relevan di harness:</w:t>
+      </w:r>
+    </w:p>
+    <w:p>
+      <w:r/>
+    </w:p>
+    <w:p>
+      <w:r>
+        <w:t>1. materi pertama: `peta memakai media bergerak, bukan gambar diam · latar video autoplay=true · pendaki jelajah-langkah`;</w:t>
+      </w:r>
+    </w:p>
+    <w:p>
+      <w:r>
+        <w:t>2. materi kedua: `peta memakai foto tema sebagai latar (berkasnya benar-benar termuat) · jenis foto · berkas /tema/gunung.jpg · termuat true`;</w:t>
+      </w:r>
+    </w:p>
+    <w:p>
+      <w:r>
+        <w:t>3. `peta memakai foto tema, tanpa adegan gambar buatan · adegan SVG 0 · zoom jelajah-zoom`.</w:t>
+      </w:r>
+    </w:p>
+    <w:p>
+      <w:r/>
+    </w:p>
+    <w:p>
+      <w:pPr>
+        <w:pStyle w:val="Heading3"/>
+      </w:pPr>
+      <w:r>
+        <w:t>A.37.4 Keputusan teknis (satu kalimat per keputusan)</w:t>
+      </w:r>
+    </w:p>
+    <w:p>
+      <w:r/>
+    </w:p>
+    <w:p>
+      <w:pPr>
+        <w:pStyle w:val="ListBullet"/>
+      </w:pPr>
+      <w:r>
+        <w:t>Gambar buatan dibuang sepenuhnya, bukan dipercantik: panggung hanya memakai media yang diunggah guru</w:t>
+      </w:r>
+    </w:p>
+    <w:p>
+      <w:r>
+        <w:t xml:space="preserve">  atau foto berlisensi bebas — lebih mudah dipertanggungjawabkan daripada ilustrasi SVG yang menua.</w:t>
+      </w:r>
+    </w:p>
+    <w:p>
+      <w:pPr>
+        <w:pStyle w:val="ListBullet"/>
+      </w:pPr>
+      <w:r>
+        <w:t>Gradien dipakai sebagai cadangan, bukan gambar statis: tidak ada berkas tambahan untuk dimuat dan tidak</w:t>
+      </w:r>
+    </w:p>
+    <w:p>
+      <w:r>
+        <w:t xml:space="preserve">  ada hak pakai yang perlu dilacak.</w:t>
+      </w:r>
+    </w:p>
+    <w:p>
+      <w:pPr>
+        <w:pStyle w:val="ListBullet"/>
+      </w:pPr>
+      <w:r>
+        <w:t>Jalur `data-latar` dipertahankan (`video`/`foto`/`gradien`) supaya tes dan CSS tetap memilih bentuk latar</w:t>
+      </w:r>
+    </w:p>
+    <w:p>
+      <w:r>
+        <w:t xml:space="preserve">  dari satu sumber kebenaran.</w:t>
+      </w:r>
+    </w:p>
+    <w:p>
+      <w:pPr>
+        <w:pStyle w:val="ListBullet"/>
+      </w:pPr>
+      <w:r>
+        <w:t>WebSocket CDP ditutup di akhir agar kode keluar harness bermakna; tanpa itu hijau/merah tidak bisa</w:t>
+      </w:r>
+    </w:p>
+    <w:p>
+      <w:r>
+        <w:t xml:space="preserve">  dipercaya.</w:t>
+      </w:r>
+    </w:p>
+    <w:p>
+      <w:r/>
+    </w:p>
+    <w:p>
+      <w:pPr>
+        <w:pStyle w:val="Heading3"/>
+      </w:pPr>
+      <w:r>
+        <w:t>A.37.5 Batasan jujur (yang belum selesai)</w:t>
+      </w:r>
+    </w:p>
+    <w:p>
+      <w:r/>
+    </w:p>
+    <w:p>
+      <w:pPr>
+        <w:pStyle w:val="ListBullet"/>
+      </w:pPr>
+      <w:r>
+        <w:t>**Tema hanya punya satu foto** (`frontend/public/tema/gunung.jpg`). Adegan lain — termasuk tema kedua</w:t>
+      </w:r>
+    </w:p>
+    <w:p>
+      <w:r>
+        <w:t xml:space="preserve">  yang belum dibuat — akan tampil sebagai gradien sampai fotonya ditambahkan; katalog tema tetap baru satu.</w:t>
+      </w:r>
+    </w:p>
+    <w:p>
+      <w:pPr>
+        <w:pStyle w:val="ListBullet"/>
+      </w:pPr>
+      <w:r>
+        <w:t>Video latar masih hanya diuji dengan satu MP4 2 detik di jalur berpotongan; belum semua kodek/rasio.</w:t>
+      </w:r>
+    </w:p>
+    <w:p>
+      <w:pPr>
+        <w:pStyle w:val="ListBullet"/>
+      </w:pPr>
+      <w:r>
+        <w:t>Bukti "bergerak" dari DOM/CDP (`animationName` foto, `autoplay` video) — **belum ada** uji regresi</w:t>
+      </w:r>
+    </w:p>
+    <w:p>
+      <w:r>
+        <w:t xml:space="preserve">  visual/screenshot.</w:t>
+      </w:r>
+    </w:p>
+    <w:p>
+      <w:pPr>
+        <w:pStyle w:val="ListBullet"/>
+      </w:pPr>
+      <w:r>
+        <w:t>Smoke perjalanan tidak ikut `verify.sh` (butuh backend + vite + Chrome hidup).</w:t>
+      </w:r>
+    </w:p>
+    <w:p>
+      <w:r/>
+    </w:p>
+    <w:p>
+      <w:pPr>
+        <w:pStyle w:val="Heading3"/>
+      </w:pPr>
+      <w:r>
+        <w:t>A.37.6 Berkas yang dibuat/diubah</w:t>
+      </w:r>
+    </w:p>
+    <w:p>
+      <w:r/>
+    </w:p>
+    <w:p>
+      <w:r>
+        <w:t>Diubah:</w:t>
+      </w:r>
+    </w:p>
+    <w:p>
+      <w:pPr>
+        <w:pStyle w:val="ListBullet"/>
+      </w:pPr>
+      <w:r>
+        <w:t>`frontend/src/sections/material/PetaPerjalanan.jsx` (buang adegan SVG → video/foto/gradien)</w:t>
+      </w:r>
+    </w:p>
+    <w:p>
+      <w:pPr>
+        <w:pStyle w:val="ListBullet"/>
+      </w:pPr>
+      <w:r>
+        <w:t>`frontend/src/sections/material/EditorMateri.jsx` (keterangan template opsional)</w:t>
+      </w:r>
+    </w:p>
+    <w:p>
+      <w:pPr>
+        <w:pStyle w:val="ListBullet"/>
+      </w:pPr>
+      <w:r>
+        <w:t>`frontend/src/theme/theme.css` (buang gaya adegan, panggung foto/video + gradien cadangan)</w:t>
+      </w:r>
+    </w:p>
+    <w:p>
+      <w:pPr>
+        <w:pStyle w:val="ListBullet"/>
+      </w:pPr>
+      <w:r>
+        <w:t>`frontend/src/__tests__/sections/material/petaPerjalanan.test.jsx`</w:t>
+      </w:r>
+    </w:p>
+    <w:p>
+      <w:pPr>
+        <w:pStyle w:val="ListBullet"/>
+      </w:pPr>
+      <w:r>
+        <w:t>`frontend/public/tema/LISENSI.md`</w:t>
+      </w:r>
+    </w:p>
+    <w:p>
+      <w:pPr>
+        <w:pStyle w:val="ListBullet"/>
+      </w:pPr>
+      <w:r>
+        <w:t>`docs/smoke-ui-perjalanan.mjs` (latar tanpa SVG, masuk ulang sebagai guru, tutup WebSocket)</w:t>
+      </w:r>
+    </w:p>
+    <w:p>
+      <w:pPr>
+        <w:pStyle w:val="ListBullet"/>
+      </w:pPr>
+      <w:r>
+        <w:t>`docs/laporan-pengujian.md` (A.37 ini), `docs/penjelasan-fitur.md`, `docs/handoff-sesi.md`</w:t>
+      </w:r>
+    </w:p>
+    <w:p>
+      <w:r/>
+    </w:p>
+    <w:p>
+      <w:pPr>
+        <w:pStyle w:val="Heading2"/>
+      </w:pPr>
+      <w:r>
+        <w:t>A.38 Editor Materi: Pemilih Kuis yang Lebih Baik + Penjelasan Opsional Setelah Kuis (11 Oktober 2026)</w:t>
+      </w:r>
+    </w:p>
+    <w:p>
+      <w:r/>
+    </w:p>
+    <w:p>
+      <w:r>
+        <w:t>Permintaan putaran ini: *"quiz-nya buat UI-nya lebih baik … dan setelah quiz guru bisa berikan bagian</w:t>
+      </w:r>
+    </w:p>
+    <w:p>
+      <w:r>
+        <w:t>feedback (opsional)"*, lalu diperjelas: yang dimaksud **UI saat menyisipkan kuis** di editor materi, dan</w:t>
+      </w:r>
+    </w:p>
+    <w:p>
+      <w:r>
+        <w:t>umpan baliknya menempel **per kuis (seluruh kelas)**, tampil **hanya di `/materi` setelah kuis**, berupa</w:t>
+      </w:r>
+    </w:p>
+    <w:p>
+      <w:r>
+        <w:t>**penjelasan lengkap — teks atau media**.</w:t>
+      </w:r>
+    </w:p>
+    <w:p>
+      <w:r/>
+    </w:p>
+    <w:p>
+      <w:r>
+        <w:t>Sebelum putaran ini penyisipan kuis memakai satu `&lt;select&gt;` telanjang berisi judul kuis saja: guru tidak</w:t>
+      </w:r>
+    </w:p>
+    <w:p>
+      <w:r>
+        <w:t>melihat jumlah soal, mapel, kelas, maupun status, dan tidak ada cara mengenali kuis tanpa soal. Setelah</w:t>
+      </w:r>
+    </w:p>
+    <w:p>
+      <w:r>
+        <w:t>kuis selesai, murid hanya melihat skor dan tombol lanjut — tidak ada tempat bagi guru untuk menjelaskan</w:t>
+      </w:r>
+    </w:p>
+    <w:p>
+      <w:r>
+        <w:t>kenapa jawabannya begitu.</w:t>
+      </w:r>
+    </w:p>
+    <w:p>
+      <w:r/>
+    </w:p>
+    <w:p>
+      <w:pPr>
+        <w:pStyle w:val="Heading3"/>
+      </w:pPr>
+      <w:r>
+        <w:t>A.38.1 Yang dikerjakan</w:t>
+      </w:r>
+    </w:p>
+    <w:p>
+      <w:r/>
+    </w:p>
+    <w:p>
+      <w:pPr>
+        <w:pStyle w:val="ListBullet"/>
+      </w:pPr>
+      <w:r>
+        <w:t>**Editor: `PemilihKuis` menggantikan `&lt;select&gt;`.** Berisi kotak pencarian (judul, mapel, kelas, status)</w:t>
+      </w:r>
+    </w:p>
+    <w:p>
+      <w:r>
+        <w:t xml:space="preserve">  dan baris kuis yang bisa dipindai: `N soal · mapel · kelas · status`, kuis **tanpa soal** ditandai</w:t>
+      </w:r>
+    </w:p>
+    <w:p>
+      <w:r>
+        <w:t xml:space="preserve">  peringatan, dan baris terpilih diberi `aria-pressed`. Bila katalog kosong, editor menjelaskan bahwa kuis</w:t>
+      </w:r>
+    </w:p>
+    <w:p>
+      <w:r>
+        <w:t xml:space="preserve">  dibuat lebih dulu di menu Kuis.</w:t>
+      </w:r>
+    </w:p>
+    <w:p>
+      <w:pPr>
+        <w:pStyle w:val="ListBullet"/>
+      </w:pPr>
+      <w:r>
+        <w:t>**Editor: editor penjelasan di panel klip kuis** (opsional) — `&lt;textarea&gt;` (batas 5.000 karakter) +</w:t>
+      </w:r>
+    </w:p>
+    <w:p>
+      <w:r>
+        <w:t xml:space="preserve">  pilihan **media** dari pustaka unggahan materi + tombol "Kosongkan penjelasan" yang mati saat memang</w:t>
+      </w:r>
+    </w:p>
+    <w:p>
+      <w:r>
+        <w:t xml:space="preserve">  kosong. Keterangannya menyebut bahwa penjelasan tampil untuk **seluruh kelas** tepat setelah kuis selesai.</w:t>
+      </w:r>
+    </w:p>
+    <w:p>
+      <w:pPr>
+        <w:pStyle w:val="ListBullet"/>
+      </w:pPr>
+      <w:r>
+        <w:t>**Backend: penjelasan disimpan di dalam blok kuis** (`isi.penjelasan = {teks, unggahan_kode}`) dan</w:t>
+      </w:r>
+    </w:p>
+    <w:p>
+      <w:r>
+        <w:t xml:space="preserve">  divalidasi `MateriService::validasiPenjelasan()`: teks dipangkas &amp; dibatasi 5.000 karakter, media wajib</w:t>
+      </w:r>
+    </w:p>
+    <w:p>
+      <w:r>
+        <w:t xml:space="preserve">  unggahan materi yang sama/sekolah yang sama/berstatus selesai (aturan yang sama dengan blok media).</w:t>
+      </w:r>
+    </w:p>
+    <w:p>
+      <w:r>
+        <w:t xml:space="preserve">  Blok tanpa penjelasan **tidak** menulis kunci `penjelasan` sama sekali, jadi materi lama tidak berubah</w:t>
+      </w:r>
+    </w:p>
+    <w:p>
+      <w:r>
+        <w:t xml:space="preserve">  saat disimpan ulang.</w:t>
+      </w:r>
+    </w:p>
+    <w:p>
+      <w:pPr>
+        <w:pStyle w:val="ListBullet"/>
+      </w:pPr>
+      <w:r>
+        <w:t>**Backend: satu bentuk untuk guru &amp; murid.** `BlokResource` mengirim `{teks, unggahan_kode}`;</w:t>
+      </w:r>
+    </w:p>
+    <w:p>
+      <w:r>
+        <w:t xml:space="preserve">  `ProgresMateriService::penjelasanBlok()` (dipakai daftar progres **dan** pembukaan satu blok) mengirim</w:t>
+      </w:r>
+    </w:p>
+    <w:p>
+      <w:r>
+        <w:t xml:space="preserve">  `{teks, media}` dengan URL **bertanda tangan** seperti blok media. Isinya bukan kunci jawaban — kunci</w:t>
+      </w:r>
+    </w:p>
+    <w:p>
+      <w:r>
+        <w:t xml:space="preserve">  tetap hanya ada di server — jadi aman dikirim ke klien.</w:t>
+      </w:r>
+    </w:p>
+    <w:p>
+      <w:pPr>
+        <w:pStyle w:val="ListBullet"/>
+      </w:pPr>
+      <w:r>
+        <w:t>**Pemutar murid: `PenjelasanKuis`.** Tampil **hanya sesudah** latihan dikumpulkan (setelah banner skor,</w:t>
+      </w:r>
+    </w:p>
+    <w:p>
+      <w:r>
+        <w:t xml:space="preserve">  sebelum tombol "Lanjutkan video"), mempertahankan baris baru pada teks, dan merender media sesuai mime</w:t>
+      </w:r>
+    </w:p>
+    <w:p>
+      <w:r>
+        <w:t xml:space="preserve">  (gambar/video/audio/pdf), atau tautan unduh untuk kategori yang tidak boleh tampil langsung. Kuis tanpa</w:t>
+      </w:r>
+    </w:p>
+    <w:p>
+      <w:r>
+        <w:t xml:space="preserve">  penjelasan tidak berubah sama sekali.</w:t>
+      </w:r>
+    </w:p>
+    <w:p>
+      <w:pPr>
+        <w:pStyle w:val="ListBullet"/>
+      </w:pPr>
+      <w:r>
+        <w:t>**9 tes baru**: 3 Vitest di `editorMateri.test.js` (penjelasan hanya dikirim bila diisi, dibaca kembali</w:t>
+      </w:r>
+    </w:p>
+    <w:p>
+      <w:r>
+        <w:t xml:space="preserve">  dari server, pemotongan teks) + 2 Vitest di `api.test.js` (skema `penjelasan` + media, dan opsional) + 1 Pest</w:t>
+      </w:r>
+    </w:p>
+    <w:p>
+      <w:r>
+        <w:t xml:space="preserve">  di `Slice08Test.php` (simpan/ditolak/dikirim ke murid).</w:t>
+      </w:r>
+    </w:p>
+    <w:p>
+      <w:r/>
+    </w:p>
+    <w:p>
+      <w:pPr>
+        <w:pStyle w:val="Heading3"/>
+      </w:pPr>
+      <w:r>
+        <w:t>A.38.2 Temuan nyata saat verifikasi (dan apa yang diperbaiki)</w:t>
+      </w:r>
+    </w:p>
+    <w:p>
+      <w:r/>
+    </w:p>
+    <w:p>
+      <w:pPr>
+        <w:pStyle w:val="ListBullet"/>
+      </w:pPr>
+      <w:r>
+        <w:t>**Harness pemutar materi membaca halaman yang salah.** `docs/smoke-ui-materi.mjs` memakai pemilih</w:t>
+      </w:r>
+    </w:p>
+    <w:p>
+      <w:r>
+        <w:t xml:space="preserve">  `document.querySelectorAll('ol li')`, dan sejak tema perjalanan (A.34) halaman murid memuat **dua** `&lt;ol&gt;`:</w:t>
+      </w:r>
+    </w:p>
+    <w:p>
+      <w:r>
+        <w:t xml:space="preserve">  daftar pos peta (`.jelajah-daftar`) dan daftar bagian materi. Akibatnya harness menghitung pos peta sebagai</w:t>
+      </w:r>
+    </w:p>
+    <w:p>
+      <w:r>
+        <w:t xml:space="preserve">  "bagian", mengklik baris yang salah, lalu jatuh pada `Cannot set properties of null (setting 'currentTime')`</w:t>
+      </w:r>
+    </w:p>
+    <w:p>
+      <w:r>
+        <w:t xml:space="preserve">  — 6 pemeriksaan gagal tanpa ada yang salah di produk. Diperbaiki dengan pemilih yang mengecualikan daftar</w:t>
+      </w:r>
+    </w:p>
+    <w:p>
+      <w:r>
+        <w:t xml:space="preserve">  pos (`ol.list-unstyled:not(.jelajah-daftar) &gt; li`); sesudah itu **22/22 lulus**.</w:t>
+      </w:r>
+    </w:p>
+    <w:p>
+      <w:pPr>
+        <w:pStyle w:val="ListBullet"/>
+      </w:pPr>
+      <w:r>
+        <w:t>**Urutan verifikasi penting**: kegagalan itu muncul saat menjalankan harness lama pada kode baru, jadi</w:t>
+      </w:r>
+    </w:p>
+    <w:p>
+      <w:r>
+        <w:t xml:space="preserve">  diagnosis dimulai dengan menanyakan "apakah kode produk atau harness yang salah" — dan buktinya mengarah ke</w:t>
+      </w:r>
+    </w:p>
+    <w:p>
+      <w:r>
+        <w:t xml:space="preserve">  harness (halaman yang dibaca memang bukan halaman yang dimaksud).</w:t>
+      </w:r>
+    </w:p>
+    <w:p>
+      <w:r/>
+    </w:p>
+    <w:p>
+      <w:pPr>
+        <w:pStyle w:val="Heading3"/>
+      </w:pPr>
+      <w:r>
+        <w:t>A.38.3 Verifikasi (dijalankan, bukan klaim)</w:t>
+      </w:r>
+    </w:p>
+    <w:p>
+      <w:r/>
+    </w:p>
+    <w:p>
+      <w:r>
+        <w:t>| Perintah | Hasil |</w:t>
+      </w:r>
+    </w:p>
+    <w:p>
+      <w:r>
+        <w:t>| --- | --- |</w:t>
+      </w:r>
+    </w:p>
+    <w:p>
+      <w:r>
+        <w:t>| `php artisan test tests/Feature/Slice08Test.php` | **13 passed (193 assertions)** — termasuk tes penjelasan |</w:t>
+      </w:r>
+    </w:p>
+    <w:p>
+      <w:r>
+        <w:t>| `npx vitest run src/__tests__/sections/material` | **109 passed (6 berkas)** |</w:t>
+      </w:r>
+    </w:p>
+    <w:p>
+      <w:r>
+        <w:t>| `npm run check` + `npx eslint src` | **0 error** (2 peringatan lama dari `react-hooks`) |</w:t>
+      </w:r>
+    </w:p>
+    <w:p>
+      <w:r>
+        <w:t>| `./verify.sh` (root) | **SEMUA HIJAU (exit 0)** — Pest · Pint · checkJs · ESLint · Vitest · realtime |</w:t>
+      </w:r>
+    </w:p>
+    <w:p>
+      <w:r>
+        <w:t>| `docs/jalankan-smoke-materi.sh` (backend :8000 + vite :5173 + Chrome :9333) | **27/27 lulus, exit 0** |</w:t>
+      </w:r>
+    </w:p>
+    <w:p>
+      <w:r/>
+    </w:p>
+    <w:p>
+      <w:r>
+        <w:t>Pemeriksaan BARU di harness itu (lewat browser sungguhan, bukan panggilan fungsi internal):</w:t>
+      </w:r>
+    </w:p>
+    <w:p>
+      <w:r/>
+    </w:p>
+    <w:p>
+      <w:r>
+        <w:t>1. `penjelasan setelah kuis tersimpan di blok kuis` — teks yang disimpan guru kembali utuh dari server;</w:t>
+      </w:r>
+    </w:p>
+    <w:p>
+      <w:r>
+        <w:t>2. `penjelasan belum tampil sebelum kuis dikumpulkan` — DOM saat panel kuis terbuka **tidak** memuat</w:t>
+      </w:r>
+    </w:p>
+    <w:p>
+      <w:r>
+        <w:t xml:space="preserve">   `.pm-penjelasan`;</w:t>
+      </w:r>
+    </w:p>
+    <w:p>
+      <w:r>
+        <w:t>3. `penjelasan guru tampil setelah kuis selesai` — sesudah murid menjawab + mengumpulkan, kartu</w:t>
+      </w:r>
+    </w:p>
+    <w:p>
+      <w:r>
+        <w:t xml:space="preserve">   `Penjelasan` muncul dan isinya teks guru (`SMOKE-MATERI: 5 + 5 = 10 …`).</w:t>
+      </w:r>
+    </w:p>
+    <w:p>
+      <w:r/>
+    </w:p>
+    <w:p>
+      <w:pPr>
+        <w:pStyle w:val="Heading3"/>
+      </w:pPr>
+      <w:r>
+        <w:t>A.38.4 Keputusan teknis (satu kalimat per keputusan)</w:t>
+      </w:r>
+    </w:p>
+    <w:p>
+      <w:r/>
+    </w:p>
+    <w:p>
+      <w:pPr>
+        <w:pStyle w:val="ListBullet"/>
+      </w:pPr>
+      <w:r>
+        <w:t>Penjelasan disimpan di **blok kuis**, bukan tabel kuis: guru menulisnya justru saat menyisipkan kuis, dan</w:t>
+      </w:r>
+    </w:p>
+    <w:p>
+      <w:r>
+        <w:t xml:space="preserve">  media bisa langsung memakai pustaka unggahan materi yang sedang diedit — jadi murid tetap melihat satu</w:t>
+      </w:r>
+    </w:p>
+    <w:p>
+      <w:r>
+        <w:t xml:space="preserve">  penjelasan yang sama untuk seluruh kelas.</w:t>
+      </w:r>
+    </w:p>
+    <w:p>
+      <w:pPr>
+        <w:pStyle w:val="ListBullet"/>
+      </w:pPr>
+      <w:r>
+        <w:t>Media memakai jalur unggahan materi (berkas privat + tautan bertanda tangan), bukan URL luar: hak pakai dan</w:t>
+      </w:r>
+    </w:p>
+    <w:p>
+      <w:r>
+        <w:t xml:space="preserve">  pembersihan berkas tetap satu pintu.</w:t>
+      </w:r>
+    </w:p>
+    <w:p>
+      <w:pPr>
+        <w:pStyle w:val="ListBullet"/>
+      </w:pPr>
+      <w:r>
+        <w:t>Satu helper `penjelasanBlok()` dipakai daftar progres dan pembukaan blok supaya bentuknya tidak pernah</w:t>
+      </w:r>
+    </w:p>
+    <w:p>
+      <w:r>
+        <w:t xml:space="preserve">  berbeda antara peta bagian dan pemutar.</w:t>
+      </w:r>
+    </w:p>
+    <w:p>
+      <w:pPr>
+        <w:pStyle w:val="ListBullet"/>
+      </w:pPr>
+      <w:r>
+        <w:t>Kunci `penjelasan` tidak ditulis bila kosong, supaya menyimpan ulang materi lama tidak mengubah isinya.</w:t>
+      </w:r>
+    </w:p>
+    <w:p>
+      <w:r/>
+    </w:p>
+    <w:p>
+      <w:pPr>
+        <w:pStyle w:val="Heading3"/>
+      </w:pPr>
+      <w:r>
+        <w:t>A.38.5 Batasan jujur (yang belum selesai)</w:t>
+      </w:r>
+    </w:p>
+    <w:p>
+      <w:r/>
+    </w:p>
+    <w:p>
+      <w:pPr>
+        <w:pStyle w:val="ListBullet"/>
+      </w:pPr>
+      <w:r>
+        <w:t>**Penjelasan menempel pada klip kuis, bukan pada kuis itu sendiri.** Bila satu kuis disisipkan di dua</w:t>
+      </w:r>
+    </w:p>
+    <w:p>
+      <w:r>
+        <w:t xml:space="preserve">  materi (atau dua klip), tiap klip punya penjelasannya sendiri; belum ada cara menulis sekali lalu dipakai</w:t>
+      </w:r>
+    </w:p>
+    <w:p>
+      <w:r>
+        <w:t xml:space="preserve">  ulang. Bila itu yang diinginkan, penjelasan perlu pindah ke tabel `quizzes` + jalur unggah khusus kuis.</w:t>
+      </w:r>
+    </w:p>
+    <w:p>
+      <w:pPr>
+        <w:pStyle w:val="ListBullet"/>
+      </w:pPr>
+      <w:r>
+        <w:t>**Penjelasan bukan umpan balik per murid**: tidak bisa dibedakan per anak, dan tidak ada notifikasi</w:t>
+      </w:r>
+    </w:p>
+    <w:p>
+      <w:r>
+        <w:t xml:space="preserve">  "guru memberi penjelasan baru" — murid melihatnya saat melewati kuis itu lagi.</w:t>
+      </w:r>
+    </w:p>
+    <w:p>
+      <w:pPr>
+        <w:pStyle w:val="ListBullet"/>
+      </w:pPr>
+      <w:r>
+        <w:t>Media penjelasan hanya dari **pustaka materi itu**; belum ada unggahan langsung dari panel penjelasan</w:t>
+      </w:r>
+    </w:p>
+    <w:p>
+      <w:r>
+        <w:t xml:space="preserve">  (guru mengunggah lewat klip media lalu memilihnya).</w:t>
+      </w:r>
+    </w:p>
+    <w:p>
+      <w:pPr>
+        <w:pStyle w:val="ListBullet"/>
+      </w:pPr>
+      <w:r>
+        <w:t>Belum ada uji regresi visual/screenshot untuk tata pemilih kuis dan kartu penjelasan.</w:t>
+      </w:r>
+    </w:p>
+    <w:p>
+      <w:pPr>
+        <w:pStyle w:val="ListBullet"/>
+      </w:pPr>
+      <w:r>
+        <w:t>Smoke membuktikan penjelasan **teks** di pemutar; jalur **media** penjelasan belum diuji lewat browser</w:t>
+      </w:r>
+    </w:p>
+    <w:p>
+      <w:r>
+        <w:t xml:space="preserve">  (hanya lewat Pest: media tersimpan, URL bertanda tangan dikirim, dan satu gambar berhasil diparse</w:t>
+      </w:r>
+    </w:p>
+    <w:p>
+      <w:r>
+        <w:t xml:space="preserve">  skemanya di Vitest).</w:t>
+      </w:r>
+    </w:p>
+    <w:p>
+      <w:r/>
+    </w:p>
+    <w:p>
+      <w:pPr>
+        <w:pStyle w:val="Heading3"/>
+      </w:pPr>
+      <w:r>
+        <w:t>A.38.6 Berkas yang dibuat/diubah</w:t>
+      </w:r>
+    </w:p>
+    <w:p>
+      <w:r/>
+    </w:p>
+    <w:p>
+      <w:r>
+        <w:t>Diubah — backend:</w:t>
+      </w:r>
+    </w:p>
+    <w:p>
+      <w:pPr>
+        <w:pStyle w:val="ListBullet"/>
+      </w:pPr>
+      <w:r>
+        <w:t>`backend/app/Sections/Material/Services/MateriService.php` (`MAKS_PENJELASAN`, `validasiPenjelasan()`, gabung ke `isi` blok kuis)</w:t>
+      </w:r>
+    </w:p>
+    <w:p>
+      <w:pPr>
+        <w:pStyle w:val="ListBullet"/>
+      </w:pPr>
+      <w:r>
+        <w:t>`backend/app/Sections/Material/Services/ProgresMateriService.php` (`penjelasanBlok()`, dipakai ringkasan &amp; buka blok)</w:t>
+      </w:r>
+    </w:p>
+    <w:p>
+      <w:pPr>
+        <w:pStyle w:val="ListBullet"/>
+      </w:pPr>
+      <w:r>
+        <w:t>`backend/app/Sections/Material/Http/Resources/BlokResource.php` (`penjelasan` untuk guru)</w:t>
+      </w:r>
+    </w:p>
+    <w:p>
+      <w:pPr>
+        <w:pStyle w:val="ListBullet"/>
+      </w:pPr>
+      <w:r>
+        <w:t>`backend/tests/Feature/Slice08Test.php` (1 tes baru)</w:t>
+      </w:r>
+    </w:p>
+    <w:p>
+      <w:r/>
+    </w:p>
+    <w:p>
+      <w:r>
+        <w:t>Diubah — frontend:</w:t>
+      </w:r>
+    </w:p>
+    <w:p>
+      <w:pPr>
+        <w:pStyle w:val="ListBullet"/>
+      </w:pPr>
+      <w:r>
+        <w:t>`frontend/src/sections/material/EditorMateri.jsx` (`PemilihKuis`, panel penjelasan)</w:t>
+      </w:r>
+    </w:p>
+    <w:p>
+      <w:pPr>
+        <w:pStyle w:val="ListBullet"/>
+      </w:pPr>
+      <w:r>
+        <w:t>`frontend/src/sections/material/editorMateri.js` (`MAKS_PENJELASAN`, `penjelasanTerisi()`, baca/kirim penjelasan)</w:t>
+      </w:r>
+    </w:p>
+    <w:p>
+      <w:pPr>
+        <w:pStyle w:val="ListBullet"/>
+      </w:pPr>
+      <w:r>
+        <w:t>`frontend/src/sections/material/PemutarMateri.jsx` (`PenjelasanKuis`)</w:t>
+      </w:r>
+    </w:p>
+    <w:p>
+      <w:pPr>
+        <w:pStyle w:val="ListBullet"/>
+      </w:pPr>
+      <w:r>
+        <w:t>`frontend/src/sections/material/api.js` (skema `penjelasan` untuk guru &amp; murid)</w:t>
+      </w:r>
+    </w:p>
+    <w:p>
+      <w:pPr>
+        <w:pStyle w:val="ListBullet"/>
+      </w:pPr>
+      <w:r>
+        <w:t>`frontend/src/theme/theme.css` (`.nle-pemilih-*`, `.nle-penjelasan`, `.pm-penjelasan*`)</w:t>
+      </w:r>
+    </w:p>
+    <w:p>
+      <w:pPr>
+        <w:pStyle w:val="ListBullet"/>
+      </w:pPr>
+      <w:r>
+        <w:t>`frontend/src/__tests__/sections/material/editorMateri.test.js`, `api.test.js`</w:t>
+      </w:r>
+    </w:p>
+    <w:p>
+      <w:r/>
+    </w:p>
+    <w:p>
+      <w:r>
+        <w:t>Diubah — dokumentasi/harness:</w:t>
+      </w:r>
+    </w:p>
+    <w:p>
+      <w:pPr>
+        <w:pStyle w:val="ListBullet"/>
+      </w:pPr>
+      <w:r>
+        <w:t>`docs/smoke-ui-materi.mjs` (pemilih daftar bagian yang mengecualikan daftar pos)</w:t>
+      </w:r>
+    </w:p>
+    <w:p>
+      <w:pPr>
+        <w:pStyle w:val="ListBullet"/>
+      </w:pPr>
+      <w:r>
+        <w:t>`docs/laporan-pengujian.md` (A.38 ini), `docs/penjelasan-fitur.md`, `docs/handoff-sesi.md`</w:t>
+      </w:r>
+    </w:p>
+    <w:p>
+      <w:r/>
+    </w:p>
+    <w:p>
+      <w:pPr>
+        <w:pStyle w:val="Heading2"/>
+      </w:pPr>
+      <w:r>
+        <w:t>A.39 Sapuan Dasar: Setiap Tipe Soal, Reset Sandi Lewat Email, dan Penyebaran Materi (11 Oktober 2026)</w:t>
+      </w:r>
+    </w:p>
+    <w:p>
+      <w:r/>
+    </w:p>
+    <w:p>
+      <w:r>
+        <w:t>Permintaan putaran ini: *"test dasar ... test setiap tipe soal apakah berjalan normal, penyebaran materi?</w:t>
+      </w:r>
+    </w:p>
+    <w:p>
+      <w:r>
+        <w:t>password reset email dll 1x token? dll cari"*. Jadi bukan menambah fitur, melainkan **sapuan dasar**: untuk</w:t>
+      </w:r>
+    </w:p>
+    <w:p>
+      <w:r>
+        <w:t>flow yang disebut, apa yang sudah ada tesnya, apa yang belum, dan apa yang ternyata **rusak**.</w:t>
+      </w:r>
+    </w:p>
+    <w:p>
+      <w:r/>
+    </w:p>
+    <w:p>
+      <w:pPr>
+        <w:pStyle w:val="Heading3"/>
+      </w:pPr>
+      <w:r>
+        <w:t>A.39.1 Yang dikerjakan</w:t>
+      </w:r>
+    </w:p>
+    <w:p>
+      <w:r/>
+    </w:p>
+    <w:p>
+      <w:pPr>
+        <w:pStyle w:val="ListBullet"/>
+      </w:pPr>
+      <w:r>
+        <w:t>**Berkas uji baru `backend/tests/Feature/AlurTipeSoalTest.php`** — dataset **22 baris, satu per tipe soal**,</w:t>
+      </w:r>
+    </w:p>
+    <w:p>
+      <w:r>
+        <w:t xml:space="preserve">  menempuh jalur HTTP yang sama seperti guru dan murid sungguhan: `POST /soal` → pasang ke kuis →</w:t>
+      </w:r>
+    </w:p>
+    <w:p>
+      <w:r>
+        <w:t xml:space="preserve">  `POST /kuis/{id}/mulai` → periksa payload murid (tipe benar &amp; **tanpa** kunci) → `POST /attempt/{id}/jawab`</w:t>
+      </w:r>
+    </w:p>
+    <w:p>
+      <w:r>
+        <w:t xml:space="preserve">  dengan jawaban BENAR berbentuk kiriman renderer frontend → `POST /attempt/{id}/kumpulkan` → periksa</w:t>
+      </w:r>
+    </w:p>
+    <w:p>
+      <w:r>
+        <w:t xml:space="preserve">  status &amp; skor **baris jawaban** sekaligus skor attempt. Tipe non-objektif punya harapannya sendiri</w:t>
+      </w:r>
+    </w:p>
+    <w:p>
+      <w:r>
+        <w:t xml:space="preserve">  (`uraian` = dinilai lewat kata kunci, `tugas_unggah` = `perlu_tinjau`).</w:t>
+      </w:r>
+    </w:p>
+    <w:p>
+      <w:pPr>
+        <w:pStyle w:val="ListBullet"/>
+      </w:pPr>
+      <w:r>
+        <w:t>**2 tes baru di `AuthTest.php`**: (1) token reset **kedaluwarsa** (&gt;60 menit) ditolak, kata sandi tidak</w:t>
+      </w:r>
+    </w:p>
+    <w:p>
+      <w:r>
+        <w:t xml:space="preserve">  berubah, dan tautan yang diminta ulang tetap bisa dipakai; (2) `lupa-sandi` kena **429** setelah lima</w:t>
+      </w:r>
+    </w:p>
+    <w:p>
+      <w:r>
+        <w:t xml:space="preserve">  permintaan untuk email yang sama (IP sama) sementara email lain belum terkena batas per akun.</w:t>
+      </w:r>
+    </w:p>
+    <w:p>
+      <w:pPr>
+        <w:pStyle w:val="ListBullet"/>
+      </w:pPr>
+      <w:r>
+        <w:t>**1 tes baru di `Slice08Test.php`**: **penyebaran materi** — materi belum terbit tidak muncul di</w:t>
+      </w:r>
+    </w:p>
+    <w:p>
+      <w:r>
+        <w:t xml:space="preserve">  `/materi-saya` dan `403` saat dibuka; setelah terbit hanya murid kelas yang dituju yang menerima;</w:t>
+      </w:r>
+    </w:p>
+    <w:p>
+      <w:r>
+        <w:t xml:space="preserve">  murid kelas lain `403`; guru lain `403` untuk progres, isi materi, dan laporan.</w:t>
+      </w:r>
+    </w:p>
+    <w:p>
+      <w:r/>
+    </w:p>
+    <w:p>
+      <w:pPr>
+        <w:pStyle w:val="Heading3"/>
+      </w:pPr>
+      <w:r>
+        <w:t>A.39.2 Temuan nyata (3, semuanya sudah diperbaiki)</w:t>
+      </w:r>
+    </w:p>
+    <w:p>
+      <w:r/>
+    </w:p>
+    <w:p>
+      <w:r>
+        <w:t>1. **`mengurutkan`: murid yang menjawab BENAR selalu mendapat skor 0.** Renderer `SoalMengurutkan`</w:t>
+      </w:r>
+    </w:p>
+    <w:p>
+      <w:r>
+        <w:t xml:space="preserve">   mengirim peta `{idItem: posisi}` (murid mengetik nomor urut tiap item), sedangkan</w:t>
+      </w:r>
+    </w:p>
+    <w:p>
+      <w:r>
+        <w:t xml:space="preserve">   `PenanganMengurutkan::nilai()` membaca jawaban sebagai **daftar id berurutan**</w:t>
+      </w:r>
+    </w:p>
+    <w:p>
+      <w:r>
+        <w:t xml:space="preserve">   (`array_values($jawaban)` dibandingkan `kunci.urutan`). Nilai peta adalah nomor posisi (mis. `3,1,2`)</w:t>
+      </w:r>
+    </w:p>
+    <w:p>
+      <w:r>
+        <w:t xml:space="preserve">   dan kuncinya daftar id, jadi perbandingannya **tidak pernah** cocok — dan karena hasilnya tetap</w:t>
+      </w:r>
+    </w:p>
+    <w:p>
+      <w:r>
+        <w:t xml:space="preserve">   `dinilai` (bukan `gagal`), guru tidak pernah melihatnya di antrean tinjauan. Diperbaiki: `nilai()`</w:t>
+      </w:r>
+    </w:p>
+    <w:p>
+      <w:r>
+        <w:t xml:space="preserve">   sekarang mengenali dua bentuk lewat pembantu `urutanJawaban()` — peta hanya sah bila kuncinya persis</w:t>
+      </w:r>
+    </w:p>
+    <w:p>
+      <w:r>
+        <w:t xml:space="preserve">   seluruh item, nomornya bulat 1..n, dan tidak ada nomor kembar; daftar id lama tetap diterima supaya</w:t>
+      </w:r>
+    </w:p>
+    <w:p>
+      <w:r>
+        <w:t xml:space="preserve">   jawaban yang sudah tersimpan tidak berubah nilainya. Bukti: sebelum perbaikan, run</w:t>
+      </w:r>
+    </w:p>
+    <w:p>
+      <w:r>
+        <w:t xml:space="preserve">   `AlurTipeSoalTest` berbunyi `Tipe mengurutkan mendapat skor 0, seharusnya 4`; sesudah perbaikan</w:t>
+      </w:r>
+    </w:p>
+    <w:p>
+      <w:r>
+        <w:t xml:space="preserve">   **22/22 lulus**.</w:t>
+      </w:r>
+    </w:p>
+    <w:p>
+      <w:r>
+        <w:t>2. **Soal `teka_silang_mini` tidak bisa disimpan lewat API (422) — jadi tidak bisa dibuat/diubah guru.**</w:t>
+      </w:r>
+    </w:p>
+    <w:p>
+      <w:r>
+        <w:t xml:space="preserve">   Middleware bawaan Laravel `ConvertEmptyStringsToNull` mengubah kotak grid yang kosong (`''`) menjadi</w:t>
+      </w:r>
+    </w:p>
+    <w:p>
+      <w:r>
+        <w:t xml:space="preserve">   `null`, sedangkan registry mensyaratkan tiap kotak berupa string `''` atau `'#'`; guru selalu menerima</w:t>
+      </w:r>
+    </w:p>
+    <w:p>
+      <w:r>
+        <w:t xml:space="preserve">   *"Kotak teka silang hanya boleh '' (diisi murid) atau '#' (kotak hitam)."*. Seeder dan contoh bank soal</w:t>
+      </w:r>
+    </w:p>
+    <w:p>
+      <w:r>
+        <w:t xml:space="preserve">   menulis langsung ke basis data, jadi bug ini **tidak terlihat** dari data demo. Diperbaiki di</w:t>
+      </w:r>
+    </w:p>
+    <w:p>
+      <w:r>
+        <w:t xml:space="preserve">   `SimpanSoalRequest::prepareForValidation()`: `null` pada `konten.grid` dikembalikan ke `''`, sehingga</w:t>
+      </w:r>
+    </w:p>
+    <w:p>
+      <w:r>
+        <w:t xml:space="preserve">   bentuk yang disimpan tetap seperti yang didokumentasikan registry.</w:t>
+      </w:r>
+    </w:p>
+    <w:p>
+      <w:r>
+        <w:t>3. **Laporan materi bisa dibaca guru mana pun (data murid bocor lintas pemilik).** `MateriPolicy::laporan()`</w:t>
+      </w:r>
+    </w:p>
+    <w:p>
+      <w:r>
+        <w:t xml:space="preserve">   hanya memeriksa `isGuru()`, tanpa memeriksa kepemilikan — padahal isinya nama, progres, dan skor</w:t>
+      </w:r>
+    </w:p>
+    <w:p>
+      <w:r>
+        <w:t xml:space="preserve">   **seluruh murid kelas** materi itu, dan `MateriPolicy::view()` sudah menolak materi bukan miliknya.</w:t>
+      </w:r>
+    </w:p>
+    <w:p>
+      <w:r>
+        <w:t xml:space="preserve">   Diperbaiki: `laporan()` memakai aturan `update()` (pemilik materi, atau admin). Ini **perubahan perilaku</w:t>
+      </w:r>
+    </w:p>
+    <w:p>
+      <w:r>
+        <w:t xml:space="preserve">   yang perlu konfirmasi**: guru sekolega tidak lagi bisa membuka `/v1/materi/{id}/laporan` materi bukan</w:t>
+      </w:r>
+    </w:p>
+    <w:p>
+      <w:r>
+        <w:t xml:space="preserve">   miliknya (admin tetap boleh). Alasannya: data anak dan pagar kepemilikan yang sudah dipakai di seluruh</w:t>
+      </w:r>
+    </w:p>
+    <w:p>
+      <w:r>
+        <w:t xml:space="preserve">   aplikasi (lihat `OtorisasiPemilikTest`). Kalau ternyata guru sekolega memang boleh membacanya, satu</w:t>
+      </w:r>
+    </w:p>
+    <w:p>
+      <w:r>
+        <w:t xml:space="preserve">   baris policy itu tinggal dikembalikan.</w:t>
+      </w:r>
+    </w:p>
+    <w:p>
+      <w:r/>
+    </w:p>
+    <w:p>
+      <w:pPr>
+        <w:pStyle w:val="Heading3"/>
+      </w:pPr>
+      <w:r>
+        <w:t>A.39.3 Verifikasi (dijalankan, bukan klaim)</w:t>
+      </w:r>
+    </w:p>
+    <w:p>
+      <w:r/>
+    </w:p>
+    <w:p>
+      <w:r>
+        <w:t>| Perintah | Hasil |</w:t>
+      </w:r>
+    </w:p>
+    <w:p>
+      <w:r>
+        <w:t>| --- | --- |</w:t>
+      </w:r>
+    </w:p>
+    <w:p>
+      <w:r>
+        <w:t>| `php artisan test --filter=AlurTipeSoalTest` | **22 passed (242 assertions)** — satu tes per tipe soal |</w:t>
+      </w:r>
+    </w:p>
+    <w:p>
+      <w:r>
+        <w:t>| `php artisan test` (seluruh suite) | **294 passed (2774 assertions)**, 16,5 s |</w:t>
+      </w:r>
+    </w:p>
+    <w:p>
+      <w:r>
+        <w:t>| `npx vitest run` | **63 berkas / 624 tes passed** |</w:t>
+      </w:r>
+    </w:p>
+    <w:p>
+      <w:r>
+        <w:t>| `./verify.sh` (root) | **SEMUA HIJAU (exit 0)** — Pest · Pint **341 berkas** · checkJs · ESLint · Vitest · realtime 15 tes |</w:t>
+      </w:r>
+    </w:p>
+    <w:p>
+      <w:r>
+        <w:t>| `php artisan test --filter="Slice12TemaMateri|OtorisasiPemilik"` (sesudah policy laporan diubah) | **19 passed (242 assertions)** |</w:t>
+      </w:r>
+    </w:p>
+    <w:p>
+      <w:r/>
+    </w:p>
+    <w:p>
+      <w:pPr>
+        <w:pStyle w:val="Heading3"/>
+      </w:pPr>
+      <w:r>
+        <w:t>A.39.4 Yang sudah ada tesnya sebelum putaran ini (diperiksa, tidak diubah)</w:t>
+      </w:r>
+    </w:p>
+    <w:p>
+      <w:r/>
+    </w:p>
+    <w:p>
+      <w:pPr>
+        <w:pStyle w:val="ListBullet"/>
+      </w:pPr>
+      <w:r>
+        <w:t>**Reset sandi lewat email**: respons identik untuk email ada/tidak ada (anti-enumerasi), token tersimpan</w:t>
+      </w:r>
+    </w:p>
+    <w:p>
+      <w:r>
+        <w:t xml:space="preserve">  **ter-hash**, token **sekali pakai** (baris `password_reset_tokens` hilang sesudah dipakai), tautan yang</w:t>
+      </w:r>
+    </w:p>
+    <w:p>
+      <w:r>
+        <w:t xml:space="preserve">  sudah dipakai ditandai `tautan_dipakai`, mencabut sesi lama + `remember_token`, URL notifikasi menuju</w:t>
+      </w:r>
+    </w:p>
+    <w:p>
+      <w:r>
+        <w:t xml:space="preserve">  halaman frontend, callback provider terdaftar, dan fail-open saat layanan email mati.</w:t>
+      </w:r>
+    </w:p>
+    <w:p>
+      <w:pPr>
+        <w:pStyle w:val="ListBullet"/>
+      </w:pPr>
+      <w:r>
+        <w:t>**Tipe soal**: kontrak registry per tipe (validasi + nilai + bobot) di `Slice06Test`/`Slice11TipeSoalTest`,</w:t>
+      </w:r>
+    </w:p>
+    <w:p>
+      <w:r>
+        <w:t xml:space="preserve">  plus pagar arch di `ArchitectureTest` (tiap tipe punya penangan unik &amp; metode kontrak lengkap).</w:t>
+      </w:r>
+    </w:p>
+    <w:p>
+      <w:pPr>
+        <w:pStyle w:val="ListBullet"/>
+      </w:pPr>
+      <w:r>
+        <w:t>**Materi**: urutan blok wajib, timeline/track/durasi, penjelasan setelah kuis, tema &amp; kenaikan pos/tingkat,</w:t>
+      </w:r>
+    </w:p>
+    <w:p>
+      <w:r>
+        <w:t xml:space="preserve">  laporan guru vs peta murid. Yang **belum** ada sebelum A.39: sapuan HTTP per tipe soal, kedaluwarsa token</w:t>
+      </w:r>
+    </w:p>
+    <w:p>
+      <w:r>
+        <w:t xml:space="preserve">  reset, throttle `lupa-sandi`, dan sebaran materi kelas lain.</w:t>
+      </w:r>
+    </w:p>
+    <w:p>
+      <w:r/>
+    </w:p>
+    <w:p>
+      <w:pPr>
+        <w:pStyle w:val="Heading3"/>
+      </w:pPr>
+      <w:r>
+        <w:t>A.39.5 Batasan jujur (yang belum selesai)</w:t>
+      </w:r>
+    </w:p>
+    <w:p>
+      <w:r/>
+    </w:p>
+    <w:p>
+      <w:pPr>
+        <w:pStyle w:val="ListBullet"/>
+      </w:pPr>
+      <w:r>
+        <w:t>Sapuan ini lewat **HTTP + bentuk kiriman renderer**, bukan browser sungguhan: tidak ada uji screenshot,</w:t>
+      </w:r>
+    </w:p>
+    <w:p>
+      <w:r>
+        <w:t xml:space="preserve">  dan tidak ada berkas media sungguhan yang diunggah.</w:t>
+      </w:r>
+    </w:p>
+    <w:p>
+      <w:pPr>
+        <w:pStyle w:val="ListBullet"/>
+      </w:pPr>
+      <w:r>
+        <w:t>`tugas_unggah` diuji sampai status `perlu_tinjau`; jalur unggah berkas + penilaian rubrik guru tetap di</w:t>
+      </w:r>
+    </w:p>
+    <w:p>
+      <w:r>
+        <w:t xml:space="preserve">  `Slice09UploadTest`.</w:t>
+      </w:r>
+    </w:p>
+    <w:p>
+      <w:pPr>
+        <w:pStyle w:val="ListBullet"/>
+      </w:pPr>
+      <w:r>
+        <w:t>`uraian` diuji dengan seluruh kata kunci muncul (skor penuh); ambang parsial, saran AI, dan koreksi manual</w:t>
+      </w:r>
+    </w:p>
+    <w:p>
+      <w:r>
+        <w:t xml:space="preserve">  tetap di `Slice06Test`/`Slice09AiTest`.</w:t>
+      </w:r>
+    </w:p>
+    <w:p>
+      <w:pPr>
+        <w:pStyle w:val="ListBullet"/>
+      </w:pPr>
+      <w:r>
+        <w:t>Temuan #3 adalah **perubahan kebijakan**, bukan sekadar perbaikan bug: butuh keputusan pemilik produk.</w:t>
+      </w:r>
+    </w:p>
+    <w:p>
+      <w:pPr>
+        <w:pStyle w:val="ListBullet"/>
+      </w:pPr>
+      <w:r>
+        <w:t>Alasan dua bug itu tidak tertangkap lebih awal: keduanya hanya diuji di **registry** (fungsi internal),</w:t>
+      </w:r>
+    </w:p>
+    <w:p>
+      <w:r>
+        <w:t xml:space="preserve">  bukan lewat jalur HTTP guru/murid — pagar jenis yang sama sudah ada untuk perilaku, belum untuk jalur.</w:t>
+      </w:r>
+    </w:p>
+    <w:p>
+      <w:r/>
+    </w:p>
+    <w:p>
+      <w:pPr>
+        <w:pStyle w:val="Heading3"/>
+      </w:pPr>
+      <w:r>
+        <w:t>A.39.6 Berkas yang dibuat/diubah</w:t>
+      </w:r>
+    </w:p>
+    <w:p>
+      <w:r/>
+    </w:p>
+    <w:p>
+      <w:r>
+        <w:t>Dibuat:</w:t>
+      </w:r>
+    </w:p>
+    <w:p>
+      <w:pPr>
+        <w:pStyle w:val="ListBullet"/>
+      </w:pPr>
+      <w:r>
+        <w:t>`backend/tests/Feature/AlurTipeSoalTest.php`</w:t>
+      </w:r>
+    </w:p>
+    <w:p>
+      <w:r/>
+    </w:p>
+    <w:p>
+      <w:r>
+        <w:t>Diubah — kode produk:</w:t>
+      </w:r>
+    </w:p>
+    <w:p>
+      <w:pPr>
+        <w:pStyle w:val="ListBullet"/>
+      </w:pPr>
+      <w:r>
+        <w:t>`backend/app/Sections/Question/Registry/PenanganMengurutkan.php` (`urutanJawaban()`, terima peta &amp; daftar)</w:t>
+      </w:r>
+    </w:p>
+    <w:p>
+      <w:pPr>
+        <w:pStyle w:val="ListBullet"/>
+      </w:pPr>
+      <w:r>
+        <w:t>`backend/app/Sections/Question/Http/Requests/SimpanSoalRequest.php` (`null` → `''` pada `konten.grid`)</w:t>
+      </w:r>
+    </w:p>
+    <w:p>
+      <w:pPr>
+        <w:pStyle w:val="ListBullet"/>
+      </w:pPr>
+      <w:r>
+        <w:t>`backend/app/Sections/Material/Policies/MateriPolicy.php` (`laporan()` = pemilik/admin)</w:t>
+      </w:r>
+    </w:p>
+    <w:p>
+      <w:pPr>
+        <w:pStyle w:val="ListBullet"/>
+      </w:pPr>
+      <w:r>
+        <w:t>`frontend/src/sections/attempt/ringkasanJawaban.js` (komentar bentuk jawaban `mengurutkan` diperbaiki)</w:t>
+      </w:r>
+    </w:p>
+    <w:p>
+      <w:r/>
+    </w:p>
+    <w:p>
+      <w:r>
+        <w:t>Diubah — tes:</w:t>
+      </w:r>
+    </w:p>
+    <w:p>
+      <w:pPr>
+        <w:pStyle w:val="ListBullet"/>
+      </w:pPr>
+      <w:r>
+        <w:t>`backend/tests/Feature/AuthTest.php` (2 tes: kedaluwarsa token, throttle `lupa-sandi`)</w:t>
+      </w:r>
+    </w:p>
+    <w:p>
+      <w:pPr>
+        <w:pStyle w:val="ListBullet"/>
+      </w:pPr>
+      <w:r>
+        <w:t>`backend/tests/Feature/Slice08Test.php` (1 tes: penyebaran materi)</w:t>
+      </w:r>
+    </w:p>
+    <w:p>
+      <w:r/>
+    </w:p>
+    <w:p>
+      <w:r>
+        <w:t>Diubah — dokumentasi:</w:t>
+      </w:r>
+    </w:p>
+    <w:p>
+      <w:pPr>
+        <w:pStyle w:val="ListBullet"/>
+      </w:pPr>
+      <w:r>
+        <w:t>`docs/laporan-pengujian.md` (A.39 ini), `docs/handoff-sesi.md`</w:t>
       </w:r>
     </w:p>
     <w:sectPr>

</xml_diff>

<commit_message>
Catat migrasi wajib dan bukti smoke HTTP sungguhan mode tamu di laporan
Smoke di backend :8011 dengan sesi cookie + CSRF memastikan jalur tamu bekerja
pada basis data dev (guru membuka kuis → tamu masuk dengan nama → kuis lain
tetap 403 → guru melihat panel tamu), sekaligus mencatat bahwa basis data yang
belum dimigrasi menjawab 500 pada respons login.

🤖 Generated with Codebuff
Co-Authored-By: Codebuff <noreply@codebuff.com>
</commit_message>
<xml_diff>
--- a/docs/word/laporan-pengujian.docx
+++ b/docs/word/laporan-pengujian.docx
@@ -18493,6 +18493,31 @@
     </w:p>
     <w:p>
       <w:r>
+        <w:t>1b. **Catatan operasional dari smoke HTTP sungguhan:** kolom itu baru, jadi **`php artisan migrate` wajib dijalankan**</w:t>
+      </w:r>
+    </w:p>
+    <w:p>
+      <w:r>
+        <w:t xml:space="preserve">   sebelum backend lama dipakai lagi. Terbukti saat smoke: `POST /auth/masuk` pada basis data dev yang belum</w:t>
+      </w:r>
+    </w:p>
+    <w:p>
+      <w:r>
+        <w:t xml:space="preserve">   dimigrasi dijawab **500** (respons login membaca `is_tamu`), dan langsung **200** sesudah `migrate`.</w:t>
+      </w:r>
+    </w:p>
+    <w:p>
+      <w:r>
+        <w:t xml:space="preserve">   Di produksi (`preventAccessingMissingAttributes` tidak aktif) pembacaan kolom hilang hanya menghasilkan</w:t>
+      </w:r>
+    </w:p>
+    <w:p>
+      <w:r>
+        <w:t xml:space="preserve">   `false`, bukan 500 — jadi ini pagar keselamatan yang berbicara, bukan kerapuhan baru.</w:t>
+      </w:r>
+    </w:p>
+    <w:p>
+      <w:r>
         <w:t>2. **Panel hasil tamu 500 karena enum di-cast ke string.** `LaporanTamuService` memakai select mentah</w:t>
       </w:r>
     </w:p>
@@ -18567,7 +18592,12 @@
     </w:p>
     <w:p>
       <w:r>
-        <w:t>| `git push` | `d2c0dff..6e04be6 main -&gt; main` + commit fitur tamu menyusul di putaran yang sama |</w:t>
+        <w:t>| `git push` | `d2c0dff..6e04be6 main -&gt; main`, lalu `6e04be6..77dc2eb` (fitur tamu), lalu `77dc2eb..1239ebd` (catatan hash) — repo online memuat semuanya |</w:t>
+      </w:r>
+    </w:p>
+    <w:p>
+      <w:r>
+        <w:t>| Smoke HTTP **sungguhan** (`php artisan serve` :8011 + curl, sesi cookie + CSRF) | backend :8011 + basis data dev: `GET /v1/tamu` `{"diizinkan":false}` → sesudah admin menyimpan saklar lapis kuis → `true`; `POST /auth/tamu {"nama":"Tamu Smoke Rara"}` **201** (`role: murid`, `isTamu: true`); `GET /v1/kuis` **hanya 1 kuis** (yang dibuka); `GET /v1/kuis/108` **200**; `GET /v1/kuis/108/ranking` **403**; `POST /kuis/108/mulai` **422 "Waktu kuis sudah berakhir"** (pagar jadwal berlaku juga untuk tamu); `GET /kuis/108/tamu` sebagai tamu **403** dan sebagai admin **200** (`izin_tamu: true`); masuk lagi dengan nama yang sama → **id sama (153)**, nama dirapikan — sesudah itu akun tamu uji, baris pengaturannya, dan kelas penampungnya dibersihkan lagi (dev DB kembali ke keadaan semula) |</w:t>
       </w:r>
     </w:p>
     <w:p>

</xml_diff>

<commit_message>
Catat putaran A.55 dan audit tampilan 12 Oktober 2026
Laporan pengujian mendapat bagian A.55 (panel kuis di luar bingkai video, bilah
atas ponsel, Chrome dibisukan) plus hasil audit tampilan guru+murid di 390 px dan
1366 px. Audit itu menemukan editor materi melebar +151 px di ponsel — bukan
regresi A.55 (diff-nya hanya menyentuh .pm-*), melainkan halaman yang memang
belum pernah masuk daftar audit — dan mencatatkannya sebagai papan pending A.56
bersama permintaan merombak tema "Harta Karun di Pulau" jadi sudut pandang dari
atas (A.57).

Handoff sesi ditulis ulang agar sesi baru cukup membaca bagian "MULAI DI SINI"
tanpa memuat riwayat chat lama (333 MB), dan dua ekspor Word disegarkan.

🤖 Generated with Codebuff
Co-Authored-By: Codebuff <noreply@codebuff.com>
</commit_message>
<xml_diff>
--- a/docs/word/laporan-pengujian.docx
+++ b/docs/word/laporan-pengujian.docx
@@ -25823,6 +25823,460 @@
     <w:p>
       <w:r>
         <w:t xml:space="preserve">  menyadari hal itu bisa memutar ulang skrip denyutnya (deteksi browser memang menyimpan batasan ini).</w:t>
+      </w:r>
+    </w:p>
+    <w:p>
+      <w:r/>
+    </w:p>
+    <w:p>
+      <w:pPr>
+        <w:pStyle w:val="Heading2"/>
+      </w:pPr>
+      <w:r>
+        <w:t>A.55 Panel Kuis Materi Pindah ke Luar Bingkai Video, dan Bilah Atas yang Tak Lagi Menerobos Tepi (12 Oktober 2026)</w:t>
+      </w:r>
+    </w:p>
+    <w:p>
+      <w:r/>
+    </w:p>
+    <w:p>
+      <w:r>
+        <w:t>Harness GUI baru `docs/smoke-ui-kuis-materi.mjs` (dijalankan lewat `docs/jalankan-smoke-ui.sh kuis-materi`)</w:t>
+      </w:r>
+    </w:p>
+    <w:p>
+      <w:r>
+        <w:t>mengukur halaman materi **sebagai murid** di dua viewport (390×844 ponsel, 1366×900 laptop) dan menemukan dua</w:t>
+      </w:r>
+    </w:p>
+    <w:p>
+      <w:r>
+        <w:t>cacat nyata yang selama ini luput karena `smoke-ui-materi` hanya memeriksa *munculnya* panel kuis, bukan</w:t>
+      </w:r>
+    </w:p>
+    <w:p>
+      <w:r>
+        <w:t>tata letaknya:</w:t>
+      </w:r>
+    </w:p>
+    <w:p>
+      <w:r/>
+    </w:p>
+    <w:p>
+      <w:r>
+        <w:t>1. **Panel kuis sisipan adalah jendela gulir sempit di atas gambar video.** `.pm-kuis` dulu `position:</w:t>
+      </w:r>
+    </w:p>
+    <w:p>
+      <w:r>
+        <w:t xml:space="preserve">   absolute` di dalam `.pm-bingkai` dengan `max-height: 80%`, jadi tingginya terikat tinggi bingkai: di</w:t>
+      </w:r>
+    </w:p>
+    <w:p>
+      <w:r>
+        <w:t xml:space="preserve">   ponsel bingkai 16:9 selebar 274 px hanya **154 px** tinggi → panel **274×123 px** untuk isi **565 px**</w:t>
+      </w:r>
+    </w:p>
+    <w:p>
+      <w:r>
+        <w:t xml:space="preserve">   (dua soal + tombol kumpulkan). Satu soal terpotong, tombol "Simpan jawaban &amp; kumpulkan" berada 425 px di</w:t>
+      </w:r>
+    </w:p>
+    <w:p>
+      <w:r>
+        <w:t xml:space="preserve">   bawah tepi panel (harus digulir di dalam jendela sempit), dan panelnya **menutupi gambar video** yang</w:t>
+      </w:r>
+    </w:p>
+    <w:p>
+      <w:r>
+        <w:t xml:space="preserve">   sedang diputar di mode "berjalan". Di laptop pun terukur **512×230 px** untuk isi 463 px.</w:t>
+      </w:r>
+    </w:p>
+    <w:p>
+      <w:r>
+        <w:t>2. **Bilah atas menerobos tepi kanan di ponsel.** Deret merek + akun + dua tombol preferensi + hamburger</w:t>
+      </w:r>
+    </w:p>
+    <w:p>
+      <w:r>
+        <w:t xml:space="preserve">   berjumlah ±433 px di dalam `container` ±366 px, dan karena merek tidak boleh menyusut (teks `nowrap`</w:t>
+      </w:r>
+    </w:p>
+    <w:p>
+      <w:r>
+        <w:t xml:space="preserve">   tanpa `min-width: 0`) tombol hamburger keluar **55 px** dari layar sehingga **seluruh halaman materi</w:t>
+      </w:r>
+    </w:p>
+    <w:p>
+      <w:r>
+        <w:t xml:space="preserve">   bergeser mendatar** — murid harus menggulir ke samping untuk membaca soal.</w:t>
+      </w:r>
+    </w:p>
+    <w:p>
+      <w:r/>
+    </w:p>
+    <w:p>
+      <w:pPr>
+        <w:pStyle w:val="Heading3"/>
+      </w:pPr>
+      <w:r>
+        <w:t>A.55.1 Yang dikerjakan</w:t>
+      </w:r>
+    </w:p>
+    <w:p>
+      <w:r/>
+    </w:p>
+    <w:p>
+      <w:pPr>
+        <w:pStyle w:val="ListBullet"/>
+      </w:pPr>
+      <w:r>
+        <w:t>**Panel kuis keluar dari bingkai video** (`frontend/src/sections/material/PemutarMateri.jsx` +</w:t>
+      </w:r>
+    </w:p>
+    <w:p>
+      <w:r>
+        <w:t xml:space="preserve">  `frontend/src/theme/theme.css`): bingkai video dan panel kuis kini bersaudara di dalam satu panggung</w:t>
+      </w:r>
+    </w:p>
+    <w:p>
+      <w:r>
+        <w:t xml:space="preserve">  (`.pm-panggung`), sehingga panel tumbuh setinggi isinya dan tidak pernah menutupi gambar. Aturan</w:t>
+      </w:r>
+    </w:p>
+    <w:p>
+      <w:r>
+        <w:t xml:space="preserve">  `.pm-kuis-vertikal`, `.pm-kuis-horizontal`, dan `@container` yang lama dihapus; `container-type:</w:t>
+      </w:r>
+    </w:p>
+    <w:p>
+      <w:r>
+        <w:t xml:space="preserve">  inline-size` pada `.pm-bingkai` tidak lagi diperlukan.</w:t>
+      </w:r>
+    </w:p>
+    <w:p>
+      <w:pPr>
+        <w:pStyle w:val="ListBullet"/>
+      </w:pPr>
+      <w:r>
+        <w:t>**Tata "horizontal" tetap berarti**: `@media (min-width: 1200px)` menaruh panel **di samping** video</w:t>
+      </w:r>
+    </w:p>
+    <w:p>
+      <w:r>
+        <w:t xml:space="preserve">  (kolom 1fr + 280 px) saat layar cukup lebar; di bawah itu kedua tata menumpuk ke bawah. Ambang 1200 px</w:t>
+      </w:r>
+    </w:p>
+    <w:p>
+      <w:r>
+        <w:t xml:space="preserve">  dipilih karena kolom materi murid hanya ±640 px di layar 1366 px (sebelumnya `horizontal` memeras video</w:t>
+      </w:r>
+    </w:p>
+    <w:p>
+      <w:r>
+        <w:t xml:space="preserve">  jadi 220 px lebar).</w:t>
+      </w:r>
+    </w:p>
+    <w:p>
+      <w:pPr>
+        <w:pStyle w:val="ListBullet"/>
+      </w:pPr>
+      <w:r>
+        <w:t>**Fokus + pandangan**: saat panel muncul, fokus tetap dipindah ke panel (`preventScroll`) lalu panelnya</w:t>
+      </w:r>
+    </w:p>
+    <w:p>
+      <w:r>
+        <w:t xml:space="preserve">  dibawa ke layar dengan `scrollIntoView({ block: 'nearest' })` — dipanggil dengan `?.` karena jsdom tidak</w:t>
+      </w:r>
+    </w:p>
+    <w:p>
+      <w:r>
+        <w:t xml:space="preserve">  punya `scrollIntoView`. Panel juga diberi `scroll-margin-block`.</w:t>
+      </w:r>
+    </w:p>
+    <w:p>
+      <w:pPr>
+        <w:pStyle w:val="ListBullet"/>
+      </w:pPr>
+      <w:r>
+        <w:t>**Bilah atas bisa menyusut** (`theme.css`): `.kepala-app-isi &gt; .me-auto`, `.merek`, dan `.merek-teks`</w:t>
+      </w:r>
+    </w:p>
+    <w:p>
+      <w:r>
+        <w:t xml:space="preserve">  diberi `min-width: 0` + elipsis, dan jarak antar-elemen dirapatkan (`gap: 0.5rem`) di bawah 576 px.</w:t>
+      </w:r>
+    </w:p>
+    <w:p>
+      <w:r>
+        <w:t xml:space="preserve">  Elemen akun, preferensi, dan hamburger tetap utuh; hanya nama sekolah yang boleh terpotong elipsis.</w:t>
+      </w:r>
+    </w:p>
+    <w:p>
+      <w:pPr>
+        <w:pStyle w:val="ListBullet"/>
+      </w:pPr>
+      <w:r>
+        <w:t>**Garis sisi berwarna di kartu "Perlu perhatian" dihapus** (permintaan pemilik produk): `.perhatian-item` dulu</w:t>
+      </w:r>
+    </w:p>
+    <w:p>
+      <w:r>
+        <w:t xml:space="preserve">  `border-left-width: 6px` dengan warna per jenis (monitor hijau / koreksi kuning / avatar biru). Kini bingkainya</w:t>
+      </w:r>
+    </w:p>
+    <w:p>
+      <w:r>
+        <w:t xml:space="preserve">  seragam `1.5px solid var(--garis)`; jenisnya tetap terbaca dari **ikon yang berbeda per jenis** (jam/centang/</w:t>
+      </w:r>
+    </w:p>
+    <w:p>
+      <w:r>
+        <w:t xml:space="preserve">  bendera) plus judul dan teks ajakan, jadi tidak ada informasi yang hilang. Diperiksa sekali lewat skrip</w:t>
+      </w:r>
+    </w:p>
+    <w:p>
+      <w:r>
+        <w:t xml:space="preserve">  sementara di `/tmp` (bukan harness repo): 1 kartu nyata + probe kelas yang sama di halaman beranda sungguhan —</w:t>
+      </w:r>
+    </w:p>
+    <w:p>
+      <w:r>
+        <w:t xml:space="preserve">  `LULUS · sisi kiri tidak lagi berwarna (sama dengan sisi lain)`.</w:t>
+      </w:r>
+    </w:p>
+    <w:p>
+      <w:pPr>
+        <w:pStyle w:val="ListBullet"/>
+      </w:pPr>
+      <w:r>
+        <w:t>**Klip uji ber-suara tidak lagi berbunyi** (`docs/jalankan-bukti-editor.sh`, `docs/jalankan-smoke-materi.sh`,</w:t>
+      </w:r>
+    </w:p>
+    <w:p>
+      <w:r>
+        <w:t xml:space="preserve">  `docs/jalankan-smoke-perjalanan.sh`, `docs/jalankan-smoke-ui.sh`, `docs/jalankan-tangkap-halaman.sh`,</w:t>
+      </w:r>
+    </w:p>
+    <w:p>
+      <w:r>
+        <w:t xml:space="preserve">  `docs/smoke-ui-kuis-materi.mjs`): semua Chrome headless dijalankan dengan `--mute-audio`, dan harness kuis</w:t>
+      </w:r>
+    </w:p>
+    <w:p>
+      <w:r>
+        <w:t xml:space="preserve">  materi (video uji 5,4 MB berisi audio drum) juga menyetel `video.muted = true` sebelum `play()` — runner</w:t>
+      </w:r>
+    </w:p>
+    <w:p>
+      <w:r>
+        <w:t xml:space="preserve">  memakai Chrome :9333 yang **sudah hidup apa adanya**, jadi kalau Chrome itu dinyalakan tanpa flag bisu,</w:t>
+      </w:r>
+    </w:p>
+    <w:p>
+      <w:r>
+        <w:t xml:space="preserve">  klipnya bisa berbunyi keluar speaker saat smoke berjalan. Penjaganya kini juga **diukur**: setiap titik</w:t>
+      </w:r>
+    </w:p>
+    <w:p>
+      <w:r>
+        <w:t xml:space="preserve">  pengukuran (`__ukurHalaman`) melaporkan media yang sedang diputar tanpa bisu, dan harnessnya menuntut</w:t>
+      </w:r>
+    </w:p>
+    <w:p>
+      <w:r>
+        <w:t xml:space="preserve">  daftar itu **kosong** — 6 pemeriksaan baru (48 dari 42 sebelumnya).</w:t>
+      </w:r>
+    </w:p>
+    <w:p>
+      <w:r/>
+    </w:p>
+    <w:p>
+      <w:pPr>
+        <w:pStyle w:val="Heading3"/>
+      </w:pPr>
+      <w:r>
+        <w:t>A.55.2 Verifikasi (dijalankan, bukan klaim)</w:t>
+      </w:r>
+    </w:p>
+    <w:p>
+      <w:r/>
+    </w:p>
+    <w:p>
+      <w:r>
+        <w:t>| Perintah | Hasil |</w:t>
+      </w:r>
+    </w:p>
+    <w:p>
+      <w:r>
+        <w:t>| --- | --- |</w:t>
+      </w:r>
+    </w:p>
+    <w:p>
+      <w:r>
+        <w:t>| `docs/jalankan-smoke-ui.sh kuis-materi` **sebelum** perbaikan tata letak (kontrol negatif, CSS lama) | **27/42 lulus, exit 1** — terukur: panel `274×123` di bingkai `274×154` (isi 565 px, 1 soal terpotong, tombol 425 px di bawah), `posisi: tumpang` (menutupi gambar) di hp **dan** laptop (panel `512×230` di bingkai `512×288`), plus `+55 px` gulir mendatar di hp |</w:t>
+      </w:r>
+    </w:p>
+    <w:p>
+      <w:r>
+        <w:t>| `docs/jalankan-smoke-ui.sh kuis-materi` **sesudah** perbaikan | **48/48 lulus, exit 0** — hp: panel `274×567` (isi 565 px terbaca penuh, 0 soal terpotong, gulir dalam panel 0, tombol terlihat tanpa gulir), `posisi: bawah`; laptop: tata vertikal panel `512×465` (`posisi: bawah`), tata horizontal panel `280×567` **di samping** bingkai `220×124`; gulir mendatar halaman **0 px** di kedua viewport; tak ada teks keluar panel; semua target sentuh ≥ 44 px |</w:t>
+      </w:r>
+    </w:p>
+    <w:p>
+      <w:r>
+        <w:t>| `docs/jalankan-smoke-ui.sh mobile` (Chrome beremulasi ponsel, 412×915) | **16/16 lulus, exit 0** — 8 halaman guru bersih dari gulir mendatar setelah perubahan bilah atas, laci + hamburger tetap normal |</w:t>
+      </w:r>
+    </w:p>
+    <w:p>
+      <w:r>
+        <w:t>| `docs/jalankan-smoke-ui.sh materi` (regresi pemutar video, sengaja dijalankan ulang) | **27/27 lulus, exit 0** — kuis sisipan muncul sendiri, mode "jeda" menahan video, penjelasan tampil setelah dikumpulkan, server tetap menolak menutup video (422) |</w:t>
+      </w:r>
+    </w:p>
+    <w:p>
+      <w:r>
+        <w:t>| `npx vitest run` (frontend) | **75 berkas / 717 tes lulus** |</w:t>
+      </w:r>
+    </w:p>
+    <w:p>
+      <w:r>
+        <w:t>| `npx eslint src` (frontend) | 0 error (2 peringatan `react-hooks/incompatible-library` di formulir auth — sudah ada sebelum putaran ini, bukan dari berkas yang diubah) |</w:t>
+      </w:r>
+    </w:p>
+    <w:p>
+      <w:r>
+        <w:t>| `./verify.sh` (root, sesudah semua suntingan putaran ini) | **SEMUA HIJAU (exit 0)** — Pest, Pint, `npm run check`, ESLint, Vitest, dan realtime (20 tes) semuanya lulus |</w:t>
+      </w:r>
+    </w:p>
+    <w:p>
+      <w:r/>
+    </w:p>
+    <w:p>
+      <w:pPr>
+        <w:pStyle w:val="Heading3"/>
+      </w:pPr>
+      <w:r>
+        <w:t>A.55.3 Berkas</w:t>
+      </w:r>
+    </w:p>
+    <w:p>
+      <w:r/>
+    </w:p>
+    <w:p>
+      <w:pPr>
+        <w:pStyle w:val="ListBullet"/>
+      </w:pPr>
+      <w:r>
+        <w:t>Baru: `docs/smoke-ui-kuis-materi.mjs` (harness GUI kuis di halaman materi; mandiri — soal, kuis, dan</w:t>
+      </w:r>
+    </w:p>
+    <w:p>
+      <w:r>
+        <w:t xml:space="preserve">  materi ujinya dibuat di awal dan dihapus lagi di blok `finally`).</w:t>
+      </w:r>
+    </w:p>
+    <w:p>
+      <w:pPr>
+        <w:pStyle w:val="ListBullet"/>
+      </w:pPr>
+      <w:r>
+        <w:t>Diubah: `frontend/src/theme/theme.css` (`.pm-panggung`, `.pm-kuis` jadi kartu di luar bingkai, aturan</w:t>
+      </w:r>
+    </w:p>
+    <w:p>
+      <w:r>
+        <w:t xml:space="preserve">  `horizontal` ≥1200 px, bilah atas bisa menyusut), `frontend/src/sections/material/PemutarMateri.jsx`</w:t>
+      </w:r>
+    </w:p>
+    <w:p>
+      <w:r>
+        <w:t xml:space="preserve">  (panggung + panel + fokus/gulir), `docs/jalankan-bukti-editor.sh`, `docs/jalankan-smoke-materi.sh`,</w:t>
+      </w:r>
+    </w:p>
+    <w:p>
+      <w:r>
+        <w:t xml:space="preserve">  `docs/jalankan-smoke-perjalanan.sh`, `docs/jalankan-smoke-ui.sh`, `docs/jalankan-tangkap-halaman.sh`</w:t>
+      </w:r>
+    </w:p>
+    <w:p>
+      <w:r>
+        <w:t xml:space="preserve">  (`--mute-audio`), `docs/penjelasan-fitur.md` (tata letak panel kuis diperjelas).</w:t>
+      </w:r>
+    </w:p>
+    <w:p>
+      <w:r/>
+    </w:p>
+    <w:p>
+      <w:pPr>
+        <w:pStyle w:val="Heading3"/>
+      </w:pPr>
+      <w:r>
+        <w:t>A.55.4 Batasan jujur</w:t>
+      </w:r>
+    </w:p>
+    <w:p>
+      <w:r/>
+    </w:p>
+    <w:p>
+      <w:pPr>
+        <w:pStyle w:val="ListBullet"/>
+      </w:pPr>
+      <w:r>
+        <w:t>**Pratinjau editor guru masih menggambar panel kuis di ATAS bingkai** (`.nle-kuis` di `EditorMateri.jsx`).</w:t>
+      </w:r>
+    </w:p>
+    <w:p>
+      <w:r>
+        <w:t xml:space="preserve">  Kanvas editor memang kanvas bingkai video, jadi pratinjaunya adalah pratinjau **saat** kuis masuk, bukan</w:t>
+      </w:r>
+    </w:p>
+    <w:p>
+      <w:r>
+        <w:t xml:space="preserve">  tata letak akhir di sisi murid — panel murid kini di bawah/samping bingkai. Label di editor ("Vertikal</w:t>
+      </w:r>
+    </w:p>
+    <w:p>
+      <w:r>
+        <w:t xml:space="preserve">  (panel di bawah)" / "Horizontal (panel di samping)") sudah cocok dengan perilaku baru, tetapi kanvasnya</w:t>
+      </w:r>
+    </w:p>
+    <w:p>
+      <w:r>
+        <w:t xml:space="preserve">  belum menampilkan posisi itu.</w:t>
+      </w:r>
+    </w:p>
+    <w:p>
+      <w:pPr>
+        <w:pStyle w:val="ListBullet"/>
+      </w:pPr>
+      <w:r>
+        <w:t>**Tata "horizontal" baru berlaku di viewport ≥ 1200 px.** Di laptop 1366 px kolom materi murid hanya</w:t>
+      </w:r>
+    </w:p>
+    <w:p>
+      <w:r>
+        <w:t xml:space="preserve">  ±640 px lebar, sehingga kedua tata tampil menumpuk ke bawah; ini disengaja supaya video tidak diperas.</w:t>
+      </w:r>
+    </w:p>
+    <w:p>
+      <w:pPr>
+        <w:pStyle w:val="ListBullet"/>
+      </w:pPr>
+      <w:r>
+        <w:t>**Angka yang diukur berasal dari dua ukuran viewport** (390×844 ponsel, 1366×900 laptop) dengan berkas</w:t>
+      </w:r>
+    </w:p>
+    <w:p>
+      <w:r>
+        <w:t xml:space="preserve">  video uji di DB dev; lebar layar lain tidak diperiksa.</w:t>
+      </w:r>
+    </w:p>
+    <w:p>
+      <w:pPr>
+        <w:pStyle w:val="ListBullet"/>
+      </w:pPr>
+      <w:r>
+        <w:t>Emulasi ponsel tetap emulasi: bukti ini dari Chrome headless + CDP, bukan dari perangkat fisik.</w:t>
       </w:r>
     </w:p>
     <w:sectPr>

</xml_diff>